<commit_message>
Switch from using the MPU6050 and my own logic for madgwick sensor fusion, estimated gravity, linear acceleration, motion energy calculations, etc to using the BNO085 and their built in code from CEVA for doing the same. Not too surprisingly, theirs works much better than what I'd come up with.
In particular, their motion detection via their stability classifier is much better. Their estimated gravity is also much better which means the linear acceleration is much more accurate and the wand provides consistent motion data no matter the orientation of the wand.

The IDF driver I'm using for the BNP085 is located at: https://github.com/myles-parfeniuk/esp32_BNO08x. This driver only supports SPI communication (no I2C) so it required me to solder the two sets of pads on the bottom of the board and then pull P0 and P1 high. I also had to switch the default GPIO pins (via idf.py menuconfig) to ones that are available on my ESP32-S3.
</commit_message>
<xml_diff>
--- a/docs/🪄 Magic Wand Maker Project.docx
+++ b/docs/🪄 Magic Wand Maker Project.docx
@@ -25,6 +25,60 @@
       </w:pPr>
       <w:r>
         <w:t>Hardware:</w:t>
+      </w:r>
+    </w:p>
+    <w:p>
+      <w:r>
+        <w:t>Hosyond ESP32S3</w:t>
+      </w:r>
+      <w:r>
+        <w:br/>
+        <w:t>GPIO 36 → SCL (SCK)</w:t>
+      </w:r>
+    </w:p>
+    <w:p>
+      <w:r>
+        <w:t>GPIO 35 → SDA (MOSI)</w:t>
+      </w:r>
+    </w:p>
+    <w:p>
+      <w:r>
+        <w:t>GPIO 37 → INT (MISO)</w:t>
+      </w:r>
+    </w:p>
+    <w:p>
+      <w:r>
+        <w:t>GPIO 34 → PS0 (CS)</w:t>
+      </w:r>
+    </w:p>
+    <w:p>
+      <w:r>
+        <w:t>GPIO 4  → INT (host interrupt)</w:t>
+      </w:r>
+    </w:p>
+    <w:p>
+      <w:r>
+        <w:t>GPIO 5  → RST</w:t>
+      </w:r>
+    </w:p>
+    <w:p>
+      <w:r>
+        <w:t>3V3     → VIN</w:t>
+      </w:r>
+    </w:p>
+    <w:p>
+      <w:r>
+        <w:t>GND     → GND</w:t>
+      </w:r>
+    </w:p>
+    <w:p>
+      <w:r>
+        <w:t>PS1     → GND   (force SPI mode)</w:t>
+      </w:r>
+    </w:p>
+    <w:p>
+      <w:r>
+        <w:t>PS0     → CS pin (GPIO 34)</w:t>
       </w:r>
     </w:p>
     <w:p>
@@ -479,20 +533,1263 @@
         <w:pStyle w:val="Heading2"/>
       </w:pPr>
       <w:r>
+        <w:t>BNO08x IMU</w:t>
+      </w:r>
+    </w:p>
+    <w:p>
+      <w:pPr>
+        <w:pStyle w:val="Heading3"/>
+      </w:pPr>
+      <w:r>
+        <w:t>The BNO08x report types that matter for a magic wand</w:t>
+      </w:r>
+    </w:p>
+    <w:p>
+      <w:pPr>
+        <w:pStyle w:val="Heading4"/>
+      </w:pPr>
+      <w:r>
+        <w:t>Game Rotation Vector (GameRV)</w:t>
+      </w:r>
+    </w:p>
+    <w:p>
+      <w:r>
+        <w:t xml:space="preserve">Class: </w:t>
+      </w:r>
+      <w:r>
+        <w:rPr>
+          <w:b/>
+          <w:bCs/>
+        </w:rPr>
+        <w:t>BNO08xRptGameRV</w:t>
+      </w:r>
+      <w:r>
+        <w:t xml:space="preserve"> </w:t>
+      </w:r>
+      <w:hyperlink r:id="rId9" w:history="1">
+        <w:r>
+          <w:rPr>
+            <w:rStyle w:val="Hyperlink"/>
+          </w:rPr>
+          <w:t>myles-parfeniuk.git</w:t>
+        </w:r>
+        <w:r>
+          <w:rPr>
+            <w:rStyle w:val="Hyperlink"/>
+          </w:rPr>
+          <w:t>h</w:t>
+        </w:r>
+        <w:r>
+          <w:rPr>
+            <w:rStyle w:val="Hyperlink"/>
+          </w:rPr>
+          <w:t>ub.io</w:t>
+        </w:r>
+      </w:hyperlink>
+      <w:r>
+        <w:t xml:space="preserve"> </w:t>
+      </w:r>
+      <w:r>
+        <w:br/>
+        <w:t xml:space="preserve">This is the </w:t>
+      </w:r>
+      <w:r>
+        <w:rPr>
+          <w:b/>
+          <w:bCs/>
+        </w:rPr>
+        <w:t>#1 most important</w:t>
+      </w:r>
+      <w:r>
+        <w:t xml:space="preserve"> report for your wand.</w:t>
+      </w:r>
+    </w:p>
+    <w:p>
+      <w:pPr>
+        <w:rPr>
+          <w:b/>
+          <w:bCs/>
+        </w:rPr>
+      </w:pPr>
+      <w:r>
+        <w:rPr>
+          <w:b/>
+          <w:bCs/>
+        </w:rPr>
+        <w:t>What it gives you</w:t>
+      </w:r>
+    </w:p>
+    <w:p>
+      <w:pPr>
+        <w:numPr>
+          <w:ilvl w:val="0"/>
+          <w:numId w:val="38"/>
+        </w:numPr>
+      </w:pPr>
+      <w:r>
+        <w:t xml:space="preserve">A </w:t>
+      </w:r>
+      <w:r>
+        <w:rPr>
+          <w:b/>
+          <w:bCs/>
+        </w:rPr>
+        <w:t>quaternion</w:t>
+      </w:r>
+      <w:r>
+        <w:t xml:space="preserve"> representing orientation</w:t>
+      </w:r>
+    </w:p>
+    <w:p>
+      <w:pPr>
+        <w:numPr>
+          <w:ilvl w:val="0"/>
+          <w:numId w:val="38"/>
+        </w:numPr>
+      </w:pPr>
+      <w:r>
+        <w:rPr>
+          <w:b/>
+          <w:bCs/>
+        </w:rPr>
+        <w:t>No magnetometer correction</w:t>
+      </w:r>
+    </w:p>
+    <w:p>
+      <w:pPr>
+        <w:numPr>
+          <w:ilvl w:val="0"/>
+          <w:numId w:val="38"/>
+        </w:numPr>
+      </w:pPr>
+      <w:r>
+        <w:t>Drift</w:t>
+      </w:r>
+      <w:r>
+        <w:noBreakHyphen/>
+        <w:t>free for short gestures</w:t>
+      </w:r>
+    </w:p>
+    <w:p>
+      <w:pPr>
+        <w:numPr>
+          <w:ilvl w:val="0"/>
+          <w:numId w:val="38"/>
+        </w:numPr>
+      </w:pPr>
+      <w:r>
+        <w:t>No heading jumps</w:t>
+      </w:r>
+    </w:p>
+    <w:p>
+      <w:pPr>
+        <w:numPr>
+          <w:ilvl w:val="0"/>
+          <w:numId w:val="38"/>
+        </w:numPr>
+      </w:pPr>
+      <w:r>
+        <w:t>Very stable during fast motion</w:t>
+      </w:r>
+    </w:p>
+    <w:p>
+      <w:pPr>
+        <w:rPr>
+          <w:b/>
+          <w:bCs/>
+        </w:rPr>
+      </w:pPr>
+      <w:r>
+        <w:rPr>
+          <w:b/>
+          <w:bCs/>
+        </w:rPr>
+        <w:t>Why it’s ideal for a wand</w:t>
+      </w:r>
+    </w:p>
+    <w:p>
+      <w:pPr>
+        <w:numPr>
+          <w:ilvl w:val="0"/>
+          <w:numId w:val="39"/>
+        </w:numPr>
+      </w:pPr>
+      <w:r>
+        <w:t>You don’t care about absolute north</w:t>
+      </w:r>
+    </w:p>
+    <w:p>
+      <w:pPr>
+        <w:numPr>
+          <w:ilvl w:val="0"/>
+          <w:numId w:val="39"/>
+        </w:numPr>
+      </w:pPr>
+      <w:r>
+        <w:t xml:space="preserve">You </w:t>
+      </w:r>
+      <w:r>
+        <w:rPr>
+          <w:i/>
+          <w:iCs/>
+        </w:rPr>
+        <w:t>do</w:t>
+      </w:r>
+      <w:r>
+        <w:t xml:space="preserve"> care about smooth, drift</w:t>
+      </w:r>
+      <w:r>
+        <w:noBreakHyphen/>
+        <w:t>free orientation</w:t>
+      </w:r>
+    </w:p>
+    <w:p>
+      <w:pPr>
+        <w:numPr>
+          <w:ilvl w:val="0"/>
+          <w:numId w:val="39"/>
+        </w:numPr>
+      </w:pPr>
+      <w:r>
+        <w:t>You want consistent gesture shapes</w:t>
+      </w:r>
+    </w:p>
+    <w:p>
+      <w:pPr>
+        <w:numPr>
+          <w:ilvl w:val="0"/>
+          <w:numId w:val="39"/>
+        </w:numPr>
+      </w:pPr>
+      <w:r>
+        <w:t>You want no sudden yaw jumps from magnetometer recalibration</w:t>
+      </w:r>
+    </w:p>
+    <w:p>
+      <w:r>
+        <w:t>This is the orientation stream you should feed into your gesture segmentation + ML pipeline.</w:t>
+      </w:r>
+    </w:p>
+    <w:p>
+      <w:pPr>
+        <w:pStyle w:val="Heading4"/>
+      </w:pPr>
+      <w:r>
+        <w:t>Gravity Vector</w:t>
+      </w:r>
+      <w:r>
+        <w:t xml:space="preserve"> (unused)</w:t>
+      </w:r>
+    </w:p>
+    <w:p>
+      <w:r>
+        <w:t xml:space="preserve">Class: </w:t>
+      </w:r>
+      <w:r>
+        <w:rPr>
+          <w:b/>
+          <w:bCs/>
+        </w:rPr>
+        <w:t>BNO08xRptGravity</w:t>
+      </w:r>
+      <w:r>
+        <w:t xml:space="preserve"> </w:t>
+      </w:r>
+      <w:hyperlink r:id="rId10" w:history="1">
+        <w:r>
+          <w:rPr>
+            <w:rStyle w:val="Hyperlink"/>
+          </w:rPr>
+          <w:t>myles-parfeniuk.gith</w:t>
+        </w:r>
+        <w:r>
+          <w:rPr>
+            <w:rStyle w:val="Hyperlink"/>
+          </w:rPr>
+          <w:t>u</w:t>
+        </w:r>
+        <w:r>
+          <w:rPr>
+            <w:rStyle w:val="Hyperlink"/>
+          </w:rPr>
+          <w:t>b.io</w:t>
+        </w:r>
+      </w:hyperlink>
+    </w:p>
+    <w:p>
+      <w:pPr>
+        <w:rPr>
+          <w:b/>
+          <w:bCs/>
+        </w:rPr>
+      </w:pPr>
+      <w:r>
+        <w:rPr>
+          <w:b/>
+          <w:bCs/>
+        </w:rPr>
+        <w:t>What it gives you</w:t>
+      </w:r>
+    </w:p>
+    <w:p>
+      <w:pPr>
+        <w:numPr>
+          <w:ilvl w:val="0"/>
+          <w:numId w:val="40"/>
+        </w:numPr>
+      </w:pPr>
+      <w:r>
+        <w:t>A 3</w:t>
+      </w:r>
+      <w:r>
+        <w:noBreakHyphen/>
+        <w:t>axis vector representing gravity in device coordinates</w:t>
+      </w:r>
+    </w:p>
+    <w:p>
+      <w:pPr>
+        <w:numPr>
+          <w:ilvl w:val="0"/>
+          <w:numId w:val="40"/>
+        </w:numPr>
+      </w:pPr>
+      <w:r>
+        <w:t>Fully fused and stable</w:t>
+      </w:r>
+    </w:p>
+    <w:p>
+      <w:pPr>
+        <w:numPr>
+          <w:ilvl w:val="0"/>
+          <w:numId w:val="40"/>
+        </w:numPr>
+      </w:pPr>
+      <w:r>
+        <w:t>No need to compute gravity yourself</w:t>
+      </w:r>
+    </w:p>
+    <w:p>
+      <w:pPr>
+        <w:rPr>
+          <w:b/>
+          <w:bCs/>
+        </w:rPr>
+      </w:pPr>
+      <w:r>
+        <w:rPr>
+          <w:b/>
+          <w:bCs/>
+        </w:rPr>
+        <w:t>Why it matters</w:t>
+      </w:r>
+    </w:p>
+    <w:p>
+      <w:pPr>
+        <w:numPr>
+          <w:ilvl w:val="0"/>
+          <w:numId w:val="41"/>
+        </w:numPr>
+      </w:pPr>
+      <w:r>
+        <w:t>Lets you remove tilt effects</w:t>
+      </w:r>
+    </w:p>
+    <w:p>
+      <w:pPr>
+        <w:numPr>
+          <w:ilvl w:val="0"/>
+          <w:numId w:val="41"/>
+        </w:numPr>
+      </w:pPr>
+      <w:r>
+        <w:t>Lets you compute “tip direction”</w:t>
+      </w:r>
+    </w:p>
+    <w:p>
+      <w:pPr>
+        <w:numPr>
+          <w:ilvl w:val="0"/>
+          <w:numId w:val="41"/>
+        </w:numPr>
+      </w:pPr>
+      <w:r>
+        <w:t>Lets you detect stillness</w:t>
+      </w:r>
+    </w:p>
+    <w:p>
+      <w:pPr>
+        <w:numPr>
+          <w:ilvl w:val="0"/>
+          <w:numId w:val="41"/>
+        </w:numPr>
+      </w:pPr>
+      <w:r>
+        <w:t>Lets you normalize gestures independent of wand orientation</w:t>
+      </w:r>
+    </w:p>
+    <w:p>
+      <w:r>
+        <w:lastRenderedPageBreak/>
+        <w:t>This replaces your entire custom gravity estimation pipeline.</w:t>
+      </w:r>
+    </w:p>
+    <w:p>
+      <w:pPr>
+        <w:pStyle w:val="Heading4"/>
+      </w:pPr>
+      <w:r>
+        <w:t>Linear Acceleration</w:t>
+      </w:r>
+    </w:p>
+    <w:p>
+      <w:r>
+        <w:t xml:space="preserve">Class: </w:t>
+      </w:r>
+      <w:r>
+        <w:rPr>
+          <w:b/>
+          <w:bCs/>
+        </w:rPr>
+        <w:t>BNO08xRptLinearAcceleration</w:t>
+      </w:r>
+      <w:r>
+        <w:t xml:space="preserve"> </w:t>
+      </w:r>
+      <w:hyperlink r:id="rId11" w:history="1">
+        <w:r>
+          <w:rPr>
+            <w:rStyle w:val="Hyperlink"/>
+          </w:rPr>
+          <w:t>myles-parfeniuk.github.io</w:t>
+        </w:r>
+      </w:hyperlink>
+    </w:p>
+    <w:p>
+      <w:pPr>
+        <w:rPr>
+          <w:b/>
+          <w:bCs/>
+        </w:rPr>
+      </w:pPr>
+      <w:r>
+        <w:rPr>
+          <w:b/>
+          <w:bCs/>
+        </w:rPr>
+        <w:t>What it gives you</w:t>
+      </w:r>
+    </w:p>
+    <w:p>
+      <w:pPr>
+        <w:numPr>
+          <w:ilvl w:val="0"/>
+          <w:numId w:val="42"/>
+        </w:numPr>
+      </w:pPr>
+      <w:r>
+        <w:t xml:space="preserve">Acceleration </w:t>
+      </w:r>
+      <w:r>
+        <w:rPr>
+          <w:b/>
+          <w:bCs/>
+        </w:rPr>
+        <w:t>minus gravity</w:t>
+      </w:r>
+    </w:p>
+    <w:p>
+      <w:pPr>
+        <w:numPr>
+          <w:ilvl w:val="0"/>
+          <w:numId w:val="42"/>
+        </w:numPr>
+      </w:pPr>
+      <w:r>
+        <w:t>Clean, drift</w:t>
+      </w:r>
+      <w:r>
+        <w:noBreakHyphen/>
+        <w:t>free motion energy</w:t>
+      </w:r>
+    </w:p>
+    <w:p>
+      <w:pPr>
+        <w:numPr>
+          <w:ilvl w:val="0"/>
+          <w:numId w:val="42"/>
+        </w:numPr>
+      </w:pPr>
+      <w:r>
+        <w:t>Perfect for gesture segmentation</w:t>
+      </w:r>
+    </w:p>
+    <w:p>
+      <w:pPr>
+        <w:rPr>
+          <w:b/>
+          <w:bCs/>
+        </w:rPr>
+      </w:pPr>
+      <w:r>
+        <w:rPr>
+          <w:b/>
+          <w:bCs/>
+        </w:rPr>
+        <w:t>Why it matters</w:t>
+      </w:r>
+    </w:p>
+    <w:p>
+      <w:pPr>
+        <w:numPr>
+          <w:ilvl w:val="0"/>
+          <w:numId w:val="43"/>
+        </w:numPr>
+      </w:pPr>
+      <w:r>
+        <w:t>You no longer need to subtract gravity</w:t>
+      </w:r>
+    </w:p>
+    <w:p>
+      <w:pPr>
+        <w:numPr>
+          <w:ilvl w:val="0"/>
+          <w:numId w:val="43"/>
+        </w:numPr>
+      </w:pPr>
+      <w:r>
+        <w:t>You get clean “motion bursts” for spell detection</w:t>
+      </w:r>
+    </w:p>
+    <w:p>
+      <w:pPr>
+        <w:numPr>
+          <w:ilvl w:val="0"/>
+          <w:numId w:val="43"/>
+        </w:numPr>
+      </w:pPr>
+      <w:r>
+        <w:t>You can compute gesture start/stop reliably</w:t>
+      </w:r>
+    </w:p>
+    <w:p>
+      <w:r>
+        <w:t>This replaces your custom accel</w:t>
+      </w:r>
+      <w:r>
+        <w:noBreakHyphen/>
+        <w:t>integration + gravity</w:t>
+      </w:r>
+      <w:r>
+        <w:noBreakHyphen/>
+        <w:t>removal logic.</w:t>
+      </w:r>
+    </w:p>
+    <w:p>
+      <w:r>
+        <w:pict w14:anchorId="0916D0DA">
+          <v:rect id="_x0000_i1025" style="width:0;height:1.5pt" o:hralign="center" o:hrstd="t" o:hr="t" fillcolor="#a0a0a0" stroked="f"/>
+        </w:pict>
+      </w:r>
+    </w:p>
+    <w:p>
+      <w:pPr>
+        <w:rPr>
+          <w:b/>
+          <w:bCs/>
+        </w:rPr>
+      </w:pPr>
+      <w:r>
+        <w:rPr>
+          <w:rFonts w:ascii="Segoe UI Emoji" w:hAnsi="Segoe UI Emoji" w:cs="Segoe UI Emoji"/>
+          <w:b/>
+          <w:bCs/>
+        </w:rPr>
+        <w:t>🧘</w:t>
+      </w:r>
+      <w:r>
+        <w:rPr>
+          <w:b/>
+          <w:bCs/>
+        </w:rPr>
+        <w:t xml:space="preserve"> 4. Stability Classifier</w:t>
+      </w:r>
+    </w:p>
+    <w:p>
+      <w:r>
+        <w:t xml:space="preserve">Class: </w:t>
+      </w:r>
+      <w:r>
+        <w:rPr>
+          <w:b/>
+          <w:bCs/>
+        </w:rPr>
+        <w:t>BNO08xRptStabilityClassifier</w:t>
+      </w:r>
+      <w:r>
+        <w:t xml:space="preserve"> (in your tab) </w:t>
+      </w:r>
+      <w:hyperlink r:id="rId12" w:history="1">
+        <w:r>
+          <w:rPr>
+            <w:rStyle w:val="Hyperlink"/>
+          </w:rPr>
+          <w:t>myles-parfeniuk.github.io</w:t>
+        </w:r>
+      </w:hyperlink>
+    </w:p>
+    <w:p>
+      <w:pPr>
+        <w:rPr>
+          <w:b/>
+          <w:bCs/>
+        </w:rPr>
+      </w:pPr>
+      <w:r>
+        <w:rPr>
+          <w:b/>
+          <w:bCs/>
+        </w:rPr>
+        <w:t>What it gives you</w:t>
+      </w:r>
+    </w:p>
+    <w:p>
+      <w:pPr>
+        <w:numPr>
+          <w:ilvl w:val="0"/>
+          <w:numId w:val="44"/>
+        </w:numPr>
+      </w:pPr>
+      <w:r>
+        <w:t>STABLE</w:t>
+      </w:r>
+    </w:p>
+    <w:p>
+      <w:pPr>
+        <w:numPr>
+          <w:ilvl w:val="0"/>
+          <w:numId w:val="44"/>
+        </w:numPr>
+      </w:pPr>
+      <w:r>
+        <w:t>REST</w:t>
+      </w:r>
+    </w:p>
+    <w:p>
+      <w:pPr>
+        <w:numPr>
+          <w:ilvl w:val="0"/>
+          <w:numId w:val="44"/>
+        </w:numPr>
+      </w:pPr>
+      <w:r>
+        <w:t>MOTION</w:t>
+      </w:r>
+    </w:p>
+    <w:p>
+      <w:pPr>
+        <w:numPr>
+          <w:ilvl w:val="0"/>
+          <w:numId w:val="44"/>
+        </w:numPr>
+      </w:pPr>
+      <w:r>
+        <w:t>ERROR</w:t>
+      </w:r>
+    </w:p>
+    <w:p>
+      <w:pPr>
+        <w:rPr>
+          <w:b/>
+          <w:bCs/>
+        </w:rPr>
+      </w:pPr>
+      <w:r>
+        <w:rPr>
+          <w:b/>
+          <w:bCs/>
+        </w:rPr>
+        <w:t>Why it matters</w:t>
+      </w:r>
+    </w:p>
+    <w:p>
+      <w:pPr>
+        <w:numPr>
+          <w:ilvl w:val="0"/>
+          <w:numId w:val="45"/>
+        </w:numPr>
+      </w:pPr>
+      <w:r>
+        <w:t>Perfect for “gesture start” and “gesture end”</w:t>
+      </w:r>
+    </w:p>
+    <w:p>
+      <w:pPr>
+        <w:numPr>
+          <w:ilvl w:val="0"/>
+          <w:numId w:val="45"/>
+        </w:numPr>
+      </w:pPr>
+      <w:r>
+        <w:t>Lets you gate ML inference</w:t>
+      </w:r>
+    </w:p>
+    <w:p>
+      <w:pPr>
+        <w:numPr>
+          <w:ilvl w:val="0"/>
+          <w:numId w:val="45"/>
+        </w:numPr>
+      </w:pPr>
+      <w:r>
+        <w:t>Lets you detect “wand is still” without thresholds</w:t>
+      </w:r>
+    </w:p>
+    <w:p>
+      <w:r>
+        <w:t>This replaces your stillness detector.</w:t>
+      </w:r>
+    </w:p>
+    <w:p>
+      <w:r>
+        <w:pict w14:anchorId="4B56E228">
+          <v:rect id="_x0000_i1026" style="width:0;height:1.5pt" o:hralign="center" o:hrstd="t" o:hr="t" fillcolor="#a0a0a0" stroked="f"/>
+        </w:pict>
+      </w:r>
+    </w:p>
+    <w:p>
+      <w:pPr>
+        <w:rPr>
+          <w:b/>
+          <w:bCs/>
+        </w:rPr>
+      </w:pPr>
+      <w:r>
+        <w:rPr>
+          <w:rFonts w:ascii="Segoe UI Emoji" w:hAnsi="Segoe UI Emoji" w:cs="Segoe UI Emoji"/>
+          <w:b/>
+          <w:bCs/>
+        </w:rPr>
+        <w:t>👋</w:t>
+      </w:r>
+      <w:r>
+        <w:rPr>
+          <w:b/>
+          <w:bCs/>
+        </w:rPr>
+        <w:t xml:space="preserve"> 5. Shake Detector</w:t>
+      </w:r>
+    </w:p>
+    <w:p>
+      <w:r>
+        <w:t xml:space="preserve">Class: </w:t>
+      </w:r>
+      <w:r>
+        <w:rPr>
+          <w:b/>
+          <w:bCs/>
+        </w:rPr>
+        <w:t>BNO08xRptShakeDetector</w:t>
+      </w:r>
+      <w:r>
+        <w:t xml:space="preserve"> (in your tab) </w:t>
+      </w:r>
+      <w:hyperlink r:id="rId13" w:history="1">
+        <w:r>
+          <w:rPr>
+            <w:rStyle w:val="Hyperlink"/>
+          </w:rPr>
+          <w:t>myles-parfeniuk.github.io</w:t>
+        </w:r>
+      </w:hyperlink>
+    </w:p>
+    <w:p>
+      <w:pPr>
+        <w:rPr>
+          <w:b/>
+          <w:bCs/>
+        </w:rPr>
+      </w:pPr>
+      <w:r>
+        <w:rPr>
+          <w:b/>
+          <w:bCs/>
+        </w:rPr>
+        <w:t>What it gives you</w:t>
+      </w:r>
+    </w:p>
+    <w:p>
+      <w:pPr>
+        <w:numPr>
+          <w:ilvl w:val="0"/>
+          <w:numId w:val="46"/>
+        </w:numPr>
+      </w:pPr>
+      <w:r>
+        <w:t>A simple event when the wand is shaken</w:t>
+      </w:r>
+    </w:p>
+    <w:p>
+      <w:pPr>
+        <w:rPr>
+          <w:b/>
+          <w:bCs/>
+        </w:rPr>
+      </w:pPr>
+      <w:r>
+        <w:rPr>
+          <w:b/>
+          <w:bCs/>
+        </w:rPr>
+        <w:t>Why it matters</w:t>
+      </w:r>
+    </w:p>
+    <w:p>
+      <w:pPr>
+        <w:numPr>
+          <w:ilvl w:val="0"/>
+          <w:numId w:val="47"/>
+        </w:numPr>
+      </w:pPr>
+      <w:r>
+        <w:t>Could be used for “wake gesture”</w:t>
+      </w:r>
+    </w:p>
+    <w:p>
+      <w:pPr>
+        <w:numPr>
+          <w:ilvl w:val="0"/>
+          <w:numId w:val="47"/>
+        </w:numPr>
+      </w:pPr>
+      <w:r>
+        <w:t>Could be used for “special spell trigger”</w:t>
+      </w:r>
+    </w:p>
+    <w:p>
+      <w:r>
+        <w:t>Not essential, but fun.</w:t>
+      </w:r>
+    </w:p>
+    <w:p>
+      <w:r>
+        <w:pict w14:anchorId="29AFDA2F">
+          <v:rect id="_x0000_i1027" style="width:0;height:1.5pt" o:hralign="center" o:hrstd="t" o:hr="t" fillcolor="#a0a0a0" stroked="f"/>
+        </w:pict>
+      </w:r>
+    </w:p>
+    <w:p>
+      <w:pPr>
+        <w:rPr>
+          <w:b/>
+          <w:bCs/>
+        </w:rPr>
+      </w:pPr>
+      <w:r>
+        <w:rPr>
+          <w:rFonts w:ascii="Segoe UI Emoji" w:hAnsi="Segoe UI Emoji" w:cs="Segoe UI Emoji"/>
+          <w:b/>
+          <w:bCs/>
+        </w:rPr>
+        <w:t>⭐</w:t>
+      </w:r>
+      <w:r>
+        <w:rPr>
+          <w:b/>
+          <w:bCs/>
+        </w:rPr>
+        <w:t xml:space="preserve"> Recommended minimal set for your wand</w:t>
+      </w:r>
+    </w:p>
+    <w:tbl>
+      <w:tblPr>
+        <w:tblW w:w="0" w:type="auto"/>
+        <w:tblCellSpacing w:w="15" w:type="dxa"/>
+        <w:tblCellMar>
+          <w:top w:w="15" w:type="dxa"/>
+          <w:left w:w="15" w:type="dxa"/>
+          <w:bottom w:w="15" w:type="dxa"/>
+          <w:right w:w="15" w:type="dxa"/>
+        </w:tblCellMar>
+        <w:tblLook w:val="04A0" w:firstRow="1" w:lastRow="0" w:firstColumn="1" w:lastColumn="0" w:noHBand="0" w:noVBand="1"/>
+      </w:tblPr>
+      <w:tblGrid>
+        <w:gridCol w:w="3135"/>
+        <w:gridCol w:w="2468"/>
+      </w:tblGrid>
+      <w:tr>
+        <w:trPr>
+          <w:tblHeader/>
+          <w:tblCellSpacing w:w="15" w:type="dxa"/>
+        </w:trPr>
+        <w:tc>
+          <w:tcPr>
+            <w:tcW w:w="0" w:type="auto"/>
+            <w:vAlign w:val="center"/>
+            <w:hideMark/>
+          </w:tcPr>
+          <w:p>
+            <w:pPr>
+              <w:rPr>
+                <w:b/>
+                <w:bCs/>
+              </w:rPr>
+            </w:pPr>
+            <w:r>
+              <w:rPr>
+                <w:b/>
+                <w:bCs/>
+              </w:rPr>
+              <w:t>Purpose</w:t>
+            </w:r>
+          </w:p>
+        </w:tc>
+        <w:tc>
+          <w:tcPr>
+            <w:tcW w:w="0" w:type="auto"/>
+            <w:vAlign w:val="center"/>
+            <w:hideMark/>
+          </w:tcPr>
+          <w:p>
+            <w:pPr>
+              <w:rPr>
+                <w:b/>
+                <w:bCs/>
+              </w:rPr>
+            </w:pPr>
+            <w:r>
+              <w:rPr>
+                <w:b/>
+                <w:bCs/>
+              </w:rPr>
+              <w:t>Best Report</w:t>
+            </w:r>
+          </w:p>
+        </w:tc>
+      </w:tr>
+      <w:tr>
+        <w:trPr>
+          <w:tblCellSpacing w:w="15" w:type="dxa"/>
+        </w:trPr>
+        <w:tc>
+          <w:tcPr>
+            <w:tcW w:w="0" w:type="auto"/>
+            <w:vAlign w:val="center"/>
+            <w:hideMark/>
+          </w:tcPr>
+          <w:p>
+            <w:r>
+              <w:t>Orientation for gesture shape</w:t>
+            </w:r>
+          </w:p>
+        </w:tc>
+        <w:tc>
+          <w:tcPr>
+            <w:tcW w:w="0" w:type="auto"/>
+            <w:vAlign w:val="center"/>
+            <w:hideMark/>
+          </w:tcPr>
+          <w:p>
+            <w:r>
+              <w:rPr>
+                <w:b/>
+                <w:bCs/>
+              </w:rPr>
+              <w:t>Game Rotation Vector</w:t>
+            </w:r>
+          </w:p>
+        </w:tc>
+      </w:tr>
+      <w:tr>
+        <w:trPr>
+          <w:tblCellSpacing w:w="15" w:type="dxa"/>
+        </w:trPr>
+        <w:tc>
+          <w:tcPr>
+            <w:tcW w:w="0" w:type="auto"/>
+            <w:vAlign w:val="center"/>
+            <w:hideMark/>
+          </w:tcPr>
+          <w:p>
+            <w:r>
+              <w:t>Gravity removal</w:t>
+            </w:r>
+          </w:p>
+        </w:tc>
+        <w:tc>
+          <w:tcPr>
+            <w:tcW w:w="0" w:type="auto"/>
+            <w:vAlign w:val="center"/>
+            <w:hideMark/>
+          </w:tcPr>
+          <w:p>
+            <w:r>
+              <w:rPr>
+                <w:b/>
+                <w:bCs/>
+              </w:rPr>
+              <w:t>Gravity Vector</w:t>
+            </w:r>
+          </w:p>
+        </w:tc>
+      </w:tr>
+      <w:tr>
+        <w:trPr>
+          <w:tblCellSpacing w:w="15" w:type="dxa"/>
+        </w:trPr>
+        <w:tc>
+          <w:tcPr>
+            <w:tcW w:w="0" w:type="auto"/>
+            <w:vAlign w:val="center"/>
+            <w:hideMark/>
+          </w:tcPr>
+          <w:p>
+            <w:r>
+              <w:t>Motion energy / segmentation</w:t>
+            </w:r>
+          </w:p>
+        </w:tc>
+        <w:tc>
+          <w:tcPr>
+            <w:tcW w:w="0" w:type="auto"/>
+            <w:vAlign w:val="center"/>
+            <w:hideMark/>
+          </w:tcPr>
+          <w:p>
+            <w:r>
+              <w:rPr>
+                <w:b/>
+                <w:bCs/>
+              </w:rPr>
+              <w:t>Linear Acceleration</w:t>
+            </w:r>
+          </w:p>
+        </w:tc>
+      </w:tr>
+      <w:tr>
+        <w:trPr>
+          <w:tblCellSpacing w:w="15" w:type="dxa"/>
+        </w:trPr>
+        <w:tc>
+          <w:tcPr>
+            <w:tcW w:w="0" w:type="auto"/>
+            <w:vAlign w:val="center"/>
+            <w:hideMark/>
+          </w:tcPr>
+          <w:p>
+            <w:r>
+              <w:lastRenderedPageBreak/>
+              <w:t>Gesture start/stop</w:t>
+            </w:r>
+          </w:p>
+        </w:tc>
+        <w:tc>
+          <w:tcPr>
+            <w:tcW w:w="0" w:type="auto"/>
+            <w:vAlign w:val="center"/>
+            <w:hideMark/>
+          </w:tcPr>
+          <w:p>
+            <w:r>
+              <w:rPr>
+                <w:b/>
+                <w:bCs/>
+              </w:rPr>
+              <w:t>Stability Classifier</w:t>
+            </w:r>
+          </w:p>
+        </w:tc>
+      </w:tr>
+      <w:tr>
+        <w:trPr>
+          <w:tblCellSpacing w:w="15" w:type="dxa"/>
+        </w:trPr>
+        <w:tc>
+          <w:tcPr>
+            <w:tcW w:w="0" w:type="auto"/>
+            <w:vAlign w:val="center"/>
+            <w:hideMark/>
+          </w:tcPr>
+          <w:p>
+            <w:r>
+              <w:t>Optional fun triggers</w:t>
+            </w:r>
+          </w:p>
+        </w:tc>
+        <w:tc>
+          <w:tcPr>
+            <w:tcW w:w="0" w:type="auto"/>
+            <w:vAlign w:val="center"/>
+            <w:hideMark/>
+          </w:tcPr>
+          <w:p>
+            <w:r>
+              <w:rPr>
+                <w:b/>
+                <w:bCs/>
+              </w:rPr>
+              <w:t>Shake Detector</w:t>
+            </w:r>
+          </w:p>
+        </w:tc>
+      </w:tr>
+    </w:tbl>
+    <w:p>
+      <w:r>
+        <w:t xml:space="preserve">This gives you a </w:t>
+      </w:r>
+      <w:r>
+        <w:rPr>
+          <w:b/>
+          <w:bCs/>
+        </w:rPr>
+        <w:t>clean, stable, low</w:t>
+      </w:r>
+      <w:r>
+        <w:rPr>
+          <w:b/>
+          <w:bCs/>
+        </w:rPr>
+        <w:noBreakHyphen/>
+        <w:t>noise gesture pipeline</w:t>
+      </w:r>
+      <w:r>
+        <w:t xml:space="preserve"> with almost zero fusion work on your side.</w:t>
+      </w:r>
+    </w:p>
+    <w:p>
+      <w:r>
+        <w:pict w14:anchorId="5A51F319">
+          <v:rect id="_x0000_i1028" style="width:0;height:1.5pt" o:hralign="center" o:hrstd="t" o:hr="t" fillcolor="#a0a0a0" stroked="f"/>
+        </w:pict>
+      </w:r>
+    </w:p>
+    <w:p>
+      <w:pPr>
+        <w:rPr>
+          <w:b/>
+          <w:bCs/>
+        </w:rPr>
+      </w:pPr>
+      <w:r>
+        <w:rPr>
+          <w:rFonts w:ascii="Segoe UI Emoji" w:hAnsi="Segoe UI Emoji" w:cs="Segoe UI Emoji"/>
+          <w:b/>
+          <w:bCs/>
+        </w:rPr>
+        <w:t>⭐</w:t>
+      </w:r>
+      <w:r>
+        <w:rPr>
+          <w:b/>
+          <w:bCs/>
+        </w:rPr>
+        <w:t xml:space="preserve"> If you want, I can now help you:</w:t>
+      </w:r>
+    </w:p>
+    <w:p>
+      <w:pPr>
+        <w:numPr>
+          <w:ilvl w:val="0"/>
+          <w:numId w:val="48"/>
+        </w:numPr>
+      </w:pPr>
+      <w:r>
+        <w:t xml:space="preserve">Pick the </w:t>
+      </w:r>
+      <w:r>
+        <w:rPr>
+          <w:b/>
+          <w:bCs/>
+        </w:rPr>
+        <w:t>exact report rates</w:t>
+      </w:r>
+      <w:r>
+        <w:t xml:space="preserve"> (e.g., GameRV @ 200 Hz, LinAcc @ 200 Hz, Gravity @ 100 Hz)</w:t>
+      </w:r>
+    </w:p>
+    <w:p>
+      <w:pPr>
+        <w:numPr>
+          <w:ilvl w:val="0"/>
+          <w:numId w:val="48"/>
+        </w:numPr>
+      </w:pPr>
+      <w:r>
+        <w:t xml:space="preserve">Build a </w:t>
+      </w:r>
+      <w:r>
+        <w:rPr>
+          <w:b/>
+          <w:bCs/>
+        </w:rPr>
+        <w:t>clean ESP</w:t>
+      </w:r>
+      <w:r>
+        <w:rPr>
+          <w:b/>
+          <w:bCs/>
+        </w:rPr>
+        <w:noBreakHyphen/>
+        <w:t>IDF callback structure</w:t>
+      </w:r>
+      <w:r>
+        <w:t xml:space="preserve"> using the driver in your tab</w:t>
+      </w:r>
+    </w:p>
+    <w:p>
+      <w:pPr>
+        <w:numPr>
+          <w:ilvl w:val="0"/>
+          <w:numId w:val="48"/>
+        </w:numPr>
+      </w:pPr>
+      <w:r>
+        <w:t>Replace your entire fusion layer with these four reports</w:t>
+      </w:r>
+    </w:p>
+    <w:p>
+      <w:pPr>
+        <w:numPr>
+          <w:ilvl w:val="0"/>
+          <w:numId w:val="48"/>
+        </w:numPr>
+      </w:pPr>
+      <w:r>
+        <w:t>Show how to convert GameRV quaternions into tip</w:t>
+      </w:r>
+      <w:r>
+        <w:noBreakHyphen/>
+        <w:t>direction vectors</w:t>
+      </w:r>
+    </w:p>
+    <w:p>
+      <w:pPr>
+        <w:numPr>
+          <w:ilvl w:val="0"/>
+          <w:numId w:val="48"/>
+        </w:numPr>
+      </w:pPr>
+      <w:r>
+        <w:t>Build a new gesture segmentation pipeline using Stability + Linear Accel</w:t>
+      </w:r>
+    </w:p>
+    <w:p>
+      <w:r>
+        <w:t>Just tell me where you want to go next.</w:t>
+      </w:r>
+    </w:p>
+    <w:p/>
+    <w:p>
+      <w:pPr>
+        <w:pStyle w:val="Heading2"/>
+      </w:pPr>
+      <w:r>
         <w:t>Stack overflow detection</w:t>
       </w:r>
     </w:p>
     <w:p>
       <w:r>
-        <w:t xml:space="preserve">In </w:t>
-      </w:r>
-      <w:proofErr w:type="spellStart"/>
-      <w:r>
-        <w:t>sdkconfig.defaults</w:t>
-      </w:r>
-      <w:proofErr w:type="spellEnd"/>
-      <w:r>
-        <w:t>, add:</w:t>
+        <w:t>In sdkconfig.defaults, add:</w:t>
       </w:r>
       <w:r>
         <w:br/>
@@ -509,22 +1806,7 @@
         <w:rPr>
           <w:rFonts w:ascii="Courier New" w:hAnsi="Courier New" w:cs="Courier New"/>
         </w:rPr>
-        <w:lastRenderedPageBreak/>
-        <w:t xml:space="preserve"># </w:t>
-      </w:r>
-      <w:proofErr w:type="spellStart"/>
-      <w:r>
-        <w:rPr>
-          <w:rFonts w:ascii="Courier New" w:hAnsi="Courier New" w:cs="Courier New"/>
-        </w:rPr>
-        <w:t>FreeRTOS</w:t>
-      </w:r>
-      <w:proofErr w:type="spellEnd"/>
-      <w:r>
-        <w:rPr>
-          <w:rFonts w:ascii="Courier New" w:hAnsi="Courier New" w:cs="Courier New"/>
-        </w:rPr>
-        <w:t xml:space="preserve"> stack overflow detection</w:t>
+        <w:t># FreeRTOS stack overflow detection</w:t>
       </w:r>
     </w:p>
     <w:p>
@@ -649,7 +1931,7 @@
           <w:numId w:val="22"/>
         </w:numPr>
       </w:pPr>
-      <w:hyperlink r:id="rId9" w:history="1">
+      <w:hyperlink r:id="rId14" w:history="1">
         <w:r>
           <w:rPr>
             <w:rStyle w:val="Hyperlink"/>
@@ -833,6 +2115,7 @@
         <w:rPr>
           <w:rFonts w:ascii="Courier New" w:hAnsi="Courier New" w:cs="Courier New"/>
         </w:rPr>
+        <w:lastRenderedPageBreak/>
         <w:t>accel_norm = accel_g / 4.0      // ±4g range</w:t>
       </w:r>
       <w:r>
@@ -980,12 +2263,6 @@
           <w:rFonts w:ascii="Courier New" w:hAnsi="Courier New" w:cs="Courier New"/>
         </w:rPr>
         <w:br/>
-      </w:r>
-      <w:r>
-        <w:rPr>
-          <w:rFonts w:ascii="Courier New" w:hAnsi="Courier New" w:cs="Courier New"/>
-        </w:rPr>
-        <w:lastRenderedPageBreak/>
         <w:t>mpu.dmpGetLinearAccelInWorld(&amp;aaWorld, &amp;aaReal, &amp;q);</w:t>
       </w:r>
       <w:r>
@@ -1166,7 +2443,7 @@
           <w:numId w:val="22"/>
         </w:numPr>
       </w:pPr>
-      <w:hyperlink r:id="rId10" w:history="1">
+      <w:hyperlink r:id="rId15" w:history="1">
         <w:r>
           <w:rPr>
             <w:rStyle w:val="Hyperlink"/>
@@ -1279,6 +2556,7 @@
         <w:pStyle w:val="Heading1"/>
       </w:pPr>
       <w:r>
+        <w:lastRenderedPageBreak/>
         <w:t>Home Assistant Integration</w:t>
       </w:r>
     </w:p>
@@ -1445,7 +2723,6 @@
           <w:b/>
           <w:bCs/>
         </w:rPr>
-        <w:lastRenderedPageBreak/>
         <w:t>Zero YAML required</w:t>
       </w:r>
     </w:p>
@@ -1664,6 +2941,7 @@
           <w:b/>
           <w:bCs/>
         </w:rPr>
+        <w:lastRenderedPageBreak/>
         <w:t>Fully compatible with your MQTT Discovery setup</w:t>
       </w:r>
     </w:p>
@@ -1702,7 +2980,7 @@
       </w:r>
     </w:p>
     <w:p>
-      <w:hyperlink r:id="rId11" w:anchor="0" w:history="1">
+      <w:hyperlink r:id="rId16" w:anchor="0" w:history="1">
         <w:r>
           <w:rPr>
             <w:rStyle w:val="Hyperlink"/>
@@ -1712,7 +2990,7 @@
       </w:hyperlink>
     </w:p>
     <w:p>
-      <w:hyperlink r:id="rId12" w:history="1">
+      <w:hyperlink r:id="rId17" w:history="1">
         <w:r>
           <w:rPr>
             <w:rStyle w:val="Hyperlink"/>
@@ -1733,7 +3011,7 @@
       <w:pPr>
         <w:pStyle w:val="Heading3"/>
       </w:pPr>
-      <w:hyperlink r:id="rId13" w:history="1">
+      <w:hyperlink r:id="rId18" w:history="1">
         <w:r>
           <w:rPr>
             <w:rStyle w:val="Hyperlink"/>
@@ -1760,7 +3038,7 @@
         </w:rPr>
         <w:t>For Matter projects development with this SDK, it is recommended to utilize ESP-IDF </w:t>
       </w:r>
-      <w:hyperlink r:id="rId14" w:history="1">
+      <w:hyperlink r:id="rId19" w:history="1">
         <w:r>
           <w:rPr>
             <w:rStyle w:val="Hyperlink"/>
@@ -2132,7 +3410,7 @@
     <w:p>
       <w:r>
         <w:pict w14:anchorId="36C46E9B">
-          <v:rect id="_x0000_i1025" style="width:0;height:1.5pt" o:hralign="center" o:hrstd="t" o:hr="t" fillcolor="#a0a0a0" stroked="f"/>
+          <v:rect id="_x0000_i1029" style="width:0;height:1.5pt" o:hralign="center" o:hrstd="t" o:hr="t" fillcolor="#a0a0a0" stroked="f"/>
         </w:pict>
       </w:r>
     </w:p>
@@ -2239,7 +3517,7 @@
     <w:p>
       <w:r>
         <w:pict w14:anchorId="28D40CC6">
-          <v:rect id="_x0000_i1026" style="width:0;height:1.5pt" o:hralign="center" o:hrstd="t" o:hr="t" fillcolor="#a0a0a0" stroked="f"/>
+          <v:rect id="_x0000_i1030" style="width:0;height:1.5pt" o:hralign="center" o:hrstd="t" o:hr="t" fillcolor="#a0a0a0" stroked="f"/>
         </w:pict>
       </w:r>
     </w:p>
@@ -2380,7 +3658,7 @@
     <w:p>
       <w:r>
         <w:pict w14:anchorId="69FAC0F3">
-          <v:rect id="_x0000_i1027" style="width:0;height:1.5pt" o:hralign="center" o:hrstd="t" o:hr="t" fillcolor="#a0a0a0" stroked="f"/>
+          <v:rect id="_x0000_i1031" style="width:0;height:1.5pt" o:hralign="center" o:hrstd="t" o:hr="t" fillcolor="#a0a0a0" stroked="f"/>
         </w:pict>
       </w:r>
     </w:p>
@@ -2797,7 +4075,7 @@
     <w:p>
       <w:r>
         <w:pict w14:anchorId="53C90CE2">
-          <v:rect id="_x0000_i1028" style="width:0;height:1.5pt" o:hralign="center" o:hrstd="t" o:hr="t" fillcolor="#a0a0a0" stroked="f"/>
+          <v:rect id="_x0000_i1032" style="width:0;height:1.5pt" o:hralign="center" o:hrstd="t" o:hr="t" fillcolor="#a0a0a0" stroked="f"/>
         </w:pict>
       </w:r>
     </w:p>
@@ -3005,7 +4283,7 @@
     <w:p>
       <w:r>
         <w:pict w14:anchorId="63001570">
-          <v:rect id="_x0000_i1029" style="width:0;height:1.5pt" o:hralign="center" o:hrstd="t" o:hr="t" fillcolor="#a0a0a0" stroked="f"/>
+          <v:rect id="_x0000_i1033" style="width:0;height:1.5pt" o:hralign="center" o:hrstd="t" o:hr="t" fillcolor="#a0a0a0" stroked="f"/>
         </w:pict>
       </w:r>
     </w:p>
@@ -3065,7 +4343,7 @@
     <w:p>
       <w:r>
         <w:pict w14:anchorId="154353A4">
-          <v:rect id="_x0000_i1030" style="width:0;height:1.5pt" o:hralign="center" o:hrstd="t" o:hr="t" fillcolor="#a0a0a0" stroked="f"/>
+          <v:rect id="_x0000_i1034" style="width:0;height:1.5pt" o:hralign="center" o:hrstd="t" o:hr="t" fillcolor="#a0a0a0" stroked="f"/>
         </w:pict>
       </w:r>
     </w:p>
@@ -3186,7 +4464,7 @@
     <w:p>
       <w:r>
         <w:pict w14:anchorId="52EC67E9">
-          <v:rect id="_x0000_i1031" style="width:0;height:1.5pt" o:hralign="center" o:hrstd="t" o:hr="t" fillcolor="#a0a0a0" stroked="f"/>
+          <v:rect id="_x0000_i1035" style="width:0;height:1.5pt" o:hralign="center" o:hrstd="t" o:hr="t" fillcolor="#a0a0a0" stroked="f"/>
         </w:pict>
       </w:r>
     </w:p>
@@ -3302,7 +4580,7 @@
       <w:r>
         <w:t xml:space="preserve"> from </w:t>
       </w:r>
-      <w:hyperlink r:id="rId15" w:history="1">
+      <w:hyperlink r:id="rId20" w:history="1">
         <w:r>
           <w:rPr>
             <w:rStyle w:val="Hyperlink"/>
@@ -3312,7 +4590,7 @@
       </w:hyperlink>
     </w:p>
     <w:p>
-      <w:hyperlink r:id="rId16" w:history="1">
+      <w:hyperlink r:id="rId21" w:history="1">
         <w:r>
           <w:rPr>
             <w:rStyle w:val="Hyperlink"/>
@@ -5004,7 +6282,7 @@
                 <w:bCs/>
               </w:rPr>
             </w:pPr>
-            <w:hyperlink r:id="rId17" w:history="1">
+            <w:hyperlink r:id="rId22" w:history="1">
               <w:r>
                 <w:rPr>
                   <w:rStyle w:val="Hyperlink"/>
@@ -5029,7 +6307,7 @@
                 <w:bCs/>
               </w:rPr>
             </w:pPr>
-            <w:hyperlink r:id="rId18" w:history="1">
+            <w:hyperlink r:id="rId23" w:history="1">
               <w:r>
                 <w:rPr>
                   <w:rStyle w:val="Hyperlink"/>
@@ -5063,7 +6341,7 @@
                 <w:bCs/>
               </w:rPr>
             </w:pPr>
-            <w:hyperlink r:id="rId19" w:history="1">
+            <w:hyperlink r:id="rId24" w:history="1">
               <w:r>
                 <w:rPr>
                   <w:rStyle w:val="Hyperlink"/>
@@ -5127,7 +6405,7 @@
             <w:r>
               <w:t xml:space="preserve">, 4.3 mm thick </w:t>
             </w:r>
-            <w:hyperlink r:id="rId20" w:history="1">
+            <w:hyperlink r:id="rId25" w:history="1">
               <w:r>
                 <w:rPr>
                   <w:rStyle w:val="Hyperlink"/>
@@ -5158,7 +6436,7 @@
               <w:noBreakHyphen/>
               <w:t xml:space="preserve">sized) </w:t>
             </w:r>
-            <w:hyperlink r:id="rId21" w:history="1">
+            <w:hyperlink r:id="rId26" w:history="1">
               <w:r>
                 <w:rPr>
                   <w:rStyle w:val="Hyperlink"/>
@@ -5185,7 +6463,7 @@
             <w:r>
               <w:t xml:space="preserve"> </w:t>
             </w:r>
-            <w:hyperlink r:id="rId22" w:history="1">
+            <w:hyperlink r:id="rId27" w:history="1">
               <w:r>
                 <w:rPr>
                   <w:rStyle w:val="Hyperlink"/>
@@ -5238,7 +6516,7 @@
             <w:r>
               <w:t xml:space="preserve"> </w:t>
             </w:r>
-            <w:hyperlink r:id="rId23" w:history="1">
+            <w:hyperlink r:id="rId28" w:history="1">
               <w:r>
                 <w:rPr>
                   <w:rStyle w:val="Hyperlink"/>
@@ -5265,7 +6543,7 @@
             <w:r>
               <w:t xml:space="preserve"> </w:t>
             </w:r>
-            <w:hyperlink r:id="rId24" w:history="1">
+            <w:hyperlink r:id="rId29" w:history="1">
               <w:r>
                 <w:rPr>
                   <w:rStyle w:val="Hyperlink"/>
@@ -5292,7 +6570,7 @@
             <w:r>
               <w:t xml:space="preserve"> (this variant) </w:t>
             </w:r>
-            <w:hyperlink r:id="rId25" w:history="1">
+            <w:hyperlink r:id="rId30" w:history="1">
               <w:r>
                 <w:rPr>
                   <w:rStyle w:val="Hyperlink"/>
@@ -5345,7 +6623,7 @@
             <w:r>
               <w:t xml:space="preserve"> </w:t>
             </w:r>
-            <w:hyperlink r:id="rId26" w:history="1">
+            <w:hyperlink r:id="rId31" w:history="1">
               <w:r>
                 <w:rPr>
                   <w:rStyle w:val="Hyperlink"/>
@@ -5372,7 +6650,7 @@
             <w:r>
               <w:t xml:space="preserve"> </w:t>
             </w:r>
-            <w:hyperlink r:id="rId27" w:history="1">
+            <w:hyperlink r:id="rId32" w:history="1">
               <w:r>
                 <w:rPr>
                   <w:rStyle w:val="Hyperlink"/>
@@ -5399,7 +6677,7 @@
             <w:r>
               <w:t xml:space="preserve"> (this variant) </w:t>
             </w:r>
-            <w:hyperlink r:id="rId28" w:history="1">
+            <w:hyperlink r:id="rId33" w:history="1">
               <w:r>
                 <w:rPr>
                   <w:rStyle w:val="Hyperlink"/>
@@ -5445,7 +6723,7 @@
             <w:r>
               <w:t xml:space="preserve">LiPo charging pads (JST pads on back) </w:t>
             </w:r>
-            <w:hyperlink r:id="rId29" w:history="1">
+            <w:hyperlink r:id="rId34" w:history="1">
               <w:r>
                 <w:rPr>
                   <w:rStyle w:val="Hyperlink"/>
@@ -5480,7 +6758,7 @@
             <w:r>
               <w:t xml:space="preserve">, 50 mA fast charge / 3.8 mA trickle </w:t>
             </w:r>
-            <w:hyperlink r:id="rId30" w:history="1">
+            <w:hyperlink r:id="rId35" w:history="1">
               <w:r>
                 <w:rPr>
                   <w:rStyle w:val="Hyperlink"/>
@@ -5515,7 +6793,7 @@
             <w:r>
               <w:t xml:space="preserve">, MAX17048 fuel gauge </w:t>
             </w:r>
-            <w:hyperlink r:id="rId31" w:history="1">
+            <w:hyperlink r:id="rId36" w:history="1">
               <w:r>
                 <w:rPr>
                   <w:rStyle w:val="Hyperlink"/>
@@ -5600,7 +6878,7 @@
             <w:r>
               <w:t xml:space="preserve"> </w:t>
             </w:r>
-            <w:hyperlink r:id="rId32" w:history="1">
+            <w:hyperlink r:id="rId37" w:history="1">
               <w:r>
                 <w:rPr>
                   <w:rStyle w:val="Hyperlink"/>
@@ -5620,7 +6898,7 @@
             <w:r>
               <w:t xml:space="preserve">Deep sleep ~100 µA (from Adafruit description) </w:t>
             </w:r>
-            <w:hyperlink r:id="rId33" w:history="1">
+            <w:hyperlink r:id="rId38" w:history="1">
               <w:r>
                 <w:rPr>
                   <w:rStyle w:val="Hyperlink"/>
@@ -5667,7 +6945,7 @@
             <w:r>
               <w:t xml:space="preserve"> (very strong) </w:t>
             </w:r>
-            <w:hyperlink r:id="rId34" w:history="1">
+            <w:hyperlink r:id="rId39" w:history="1">
               <w:r>
                 <w:rPr>
                   <w:rStyle w:val="Hyperlink"/>
@@ -5760,7 +7038,7 @@
             <w:r>
               <w:t xml:space="preserve"> </w:t>
             </w:r>
-            <w:hyperlink r:id="rId35" w:history="1">
+            <w:hyperlink r:id="rId40" w:history="1">
               <w:r>
                 <w:rPr>
                   <w:rStyle w:val="Hyperlink"/>
@@ -5787,7 +7065,7 @@
             <w:r>
               <w:t xml:space="preserve">, U.FL included </w:t>
             </w:r>
-            <w:hyperlink r:id="rId36" w:history="1">
+            <w:hyperlink r:id="rId41" w:history="1">
               <w:r>
                 <w:rPr>
                   <w:rStyle w:val="Hyperlink"/>
@@ -5807,7 +7085,7 @@
             <w:r>
               <w:t xml:space="preserve">PCB antenna (w.FL variant available separately) </w:t>
             </w:r>
-            <w:hyperlink r:id="rId37" w:history="1">
+            <w:hyperlink r:id="rId42" w:history="1">
               <w:r>
                 <w:rPr>
                   <w:rStyle w:val="Hyperlink"/>
@@ -5851,7 +7129,7 @@
               <w:noBreakHyphen/>
               <w:t xml:space="preserve">C </w:t>
             </w:r>
-            <w:hyperlink r:id="rId38" w:history="1">
+            <w:hyperlink r:id="rId43" w:history="1">
               <w:r>
                 <w:rPr>
                   <w:rStyle w:val="Hyperlink"/>
@@ -5875,7 +7153,7 @@
               <w:noBreakHyphen/>
               <w:t xml:space="preserve">C </w:t>
             </w:r>
-            <w:hyperlink r:id="rId39" w:history="1">
+            <w:hyperlink r:id="rId44" w:history="1">
               <w:r>
                 <w:rPr>
                   <w:rStyle w:val="Hyperlink"/>
@@ -5899,7 +7177,7 @@
               <w:noBreakHyphen/>
               <w:t xml:space="preserve">C </w:t>
             </w:r>
-            <w:hyperlink r:id="rId40" w:history="1">
+            <w:hyperlink r:id="rId45" w:history="1">
               <w:r>
                 <w:rPr>
                   <w:rStyle w:val="Hyperlink"/>
@@ -5978,7 +7256,7 @@
             <w:r>
               <w:t xml:space="preserve"> </w:t>
             </w:r>
-            <w:hyperlink r:id="rId41" w:history="1">
+            <w:hyperlink r:id="rId46" w:history="1">
               <w:r>
                 <w:rPr>
                   <w:rStyle w:val="Hyperlink"/>
@@ -5998,7 +7276,7 @@
             <w:r>
               <w:t xml:space="preserve">~100 µA (Adafruit description) </w:t>
             </w:r>
-            <w:hyperlink r:id="rId42" w:history="1">
+            <w:hyperlink r:id="rId47" w:history="1">
               <w:r>
                 <w:rPr>
                   <w:rStyle w:val="Hyperlink"/>
@@ -6038,7 +7316,7 @@
             <w:r>
               <w:t xml:space="preserve">17 GPIO </w:t>
             </w:r>
-            <w:hyperlink r:id="rId43" w:history="1">
+            <w:hyperlink r:id="rId48" w:history="1">
               <w:r>
                 <w:rPr>
                   <w:rStyle w:val="Hyperlink"/>
@@ -6058,7 +7336,7 @@
             <w:r>
               <w:t xml:space="preserve">11 GPIO (PWM), 9 ADC </w:t>
             </w:r>
-            <w:hyperlink r:id="rId44" w:history="1">
+            <w:hyperlink r:id="rId49" w:history="1">
               <w:r>
                 <w:rPr>
                   <w:rStyle w:val="Hyperlink"/>
@@ -6078,7 +7356,7 @@
             <w:r>
               <w:t xml:space="preserve">Full Feather pinout (varies by variant) </w:t>
             </w:r>
-            <w:hyperlink r:id="rId45" w:history="1">
+            <w:hyperlink r:id="rId50" w:history="1">
               <w:r>
                 <w:rPr>
                   <w:rStyle w:val="Hyperlink"/>
@@ -6097,7 +7375,7 @@
       </w:r>
     </w:p>
     <w:p>
-      <w:hyperlink r:id="rId46" w:history="1">
+      <w:hyperlink r:id="rId51" w:history="1">
         <w:r>
           <w:rPr>
             <w:rStyle w:val="Hyperlink"/>
@@ -6110,7 +7388,7 @@
       </w:r>
     </w:p>
     <w:p>
-      <w:hyperlink r:id="rId47" w:history="1">
+      <w:hyperlink r:id="rId52" w:history="1">
         <w:r>
           <w:rPr>
             <w:rStyle w:val="Hyperlink"/>
@@ -6180,7 +7458,7 @@
                     </pic:cNvPicPr>
                   </pic:nvPicPr>
                   <pic:blipFill>
-                    <a:blip r:embed="rId48" cstate="print">
+                    <a:blip r:embed="rId53" cstate="print">
                       <a:extLst>
                         <a:ext uri="{28A0092B-C50C-407E-A947-70E740481C1C}">
                           <a14:useLocalDpi xmlns:a14="http://schemas.microsoft.com/office/drawing/2010/main" val="0"/>
@@ -6217,7 +7495,7 @@
           </wp:anchor>
         </w:drawing>
       </w:r>
-      <w:hyperlink r:id="rId49" w:history="1">
+      <w:hyperlink r:id="rId54" w:history="1">
         <w:r>
           <w:rPr>
             <w:rStyle w:val="Hyperlink"/>
@@ -6242,7 +7520,7 @@
       </w:r>
     </w:p>
     <w:p>
-      <w:hyperlink r:id="rId50" w:history="1">
+      <w:hyperlink r:id="rId55" w:history="1">
         <w:r>
           <w:rPr>
             <w:rStyle w:val="Hyperlink"/>
@@ -6252,7 +7530,7 @@
       </w:hyperlink>
     </w:p>
     <w:p>
-      <w:hyperlink r:id="rId51" w:history="1">
+      <w:hyperlink r:id="rId56" w:history="1">
         <w:r>
           <w:rPr>
             <w:rStyle w:val="Hyperlink"/>
@@ -6265,7 +7543,7 @@
       </w:r>
     </w:p>
     <w:p>
-      <w:hyperlink r:id="rId52" w:history="1">
+      <w:hyperlink r:id="rId57" w:history="1">
         <w:r>
           <w:rPr>
             <w:rStyle w:val="Hyperlink"/>
@@ -6330,7 +7608,7 @@
                     </pic:cNvPicPr>
                   </pic:nvPicPr>
                   <pic:blipFill>
-                    <a:blip r:embed="rId53" cstate="print">
+                    <a:blip r:embed="rId58" cstate="print">
                       <a:extLst>
                         <a:ext uri="{28A0092B-C50C-407E-A947-70E740481C1C}">
                           <a14:useLocalDpi xmlns:a14="http://schemas.microsoft.com/office/drawing/2010/main" val="0"/>
@@ -6358,7 +7636,7 @@
           </wp:anchor>
         </w:drawing>
       </w:r>
-      <w:hyperlink r:id="rId54" w:anchor="nav-specification" w:history="1">
+      <w:hyperlink r:id="rId59" w:anchor="nav-specification" w:history="1">
         <w:r>
           <w:rPr>
             <w:rStyle w:val="Hyperlink"/>
@@ -6453,7 +7731,7 @@
                     </pic:cNvPicPr>
                   </pic:nvPicPr>
                   <pic:blipFill>
-                    <a:blip r:embed="rId55" cstate="print">
+                    <a:blip r:embed="rId60" cstate="print">
                       <a:extLst>
                         <a:ext uri="{28A0092B-C50C-407E-A947-70E740481C1C}">
                           <a14:useLocalDpi xmlns:a14="http://schemas.microsoft.com/office/drawing/2010/main" val="0"/>
@@ -6484,7 +7762,7 @@
           </wp:anchor>
         </w:drawing>
       </w:r>
-      <w:hyperlink r:id="rId56" w:history="1">
+      <w:hyperlink r:id="rId61" w:history="1">
         <w:r>
           <w:rPr>
             <w:rStyle w:val="Hyperlink"/>
@@ -6503,7 +7781,7 @@
       </w:r>
     </w:p>
     <w:p>
-      <w:hyperlink r:id="rId57" w:history="1">
+      <w:hyperlink r:id="rId62" w:history="1">
         <w:r>
           <w:rPr>
             <w:rStyle w:val="Hyperlink"/>
@@ -6513,7 +7791,7 @@
       </w:hyperlink>
     </w:p>
     <w:p>
-      <w:hyperlink r:id="rId58" w:history="1">
+      <w:hyperlink r:id="rId63" w:history="1">
         <w:r>
           <w:rPr>
             <w:rStyle w:val="Hyperlink"/>
@@ -6554,7 +7832,7 @@
                     <pic:cNvPicPr/>
                   </pic:nvPicPr>
                   <pic:blipFill>
-                    <a:blip r:embed="rId59" cstate="print">
+                    <a:blip r:embed="rId64" cstate="print">
                       <a:extLst>
                         <a:ext uri="{28A0092B-C50C-407E-A947-70E740481C1C}">
                           <a14:useLocalDpi xmlns:a14="http://schemas.microsoft.com/office/drawing/2010/main" val="0"/>
@@ -6580,7 +7858,7 @@
           </wp:anchor>
         </w:drawing>
       </w:r>
-      <w:hyperlink r:id="rId60" w:history="1">
+      <w:hyperlink r:id="rId65" w:history="1">
         <w:r>
           <w:rPr>
             <w:rStyle w:val="Hyperlink"/>
@@ -6596,7 +7874,7 @@
       </w:hyperlink>
     </w:p>
     <w:p>
-      <w:hyperlink r:id="rId61" w:history="1">
+      <w:hyperlink r:id="rId66" w:history="1">
         <w:r>
           <w:rPr>
             <w:rStyle w:val="Hyperlink"/>
@@ -7329,6 +8607,304 @@
     </w:lvl>
   </w:abstractNum>
   <w:abstractNum w:abstractNumId="5" w15:restartNumberingAfterBreak="0">
+    <w:nsid w:val="0A7F61D5"/>
+    <w:multiLevelType w:val="multilevel"/>
+    <w:tmpl w:val="077EEF3E"/>
+    <w:lvl w:ilvl="0">
+      <w:start w:val="1"/>
+      <w:numFmt w:val="bullet"/>
+      <w:lvlText w:val=""/>
+      <w:lvlJc w:val="left"/>
+      <w:pPr>
+        <w:tabs>
+          <w:tab w:val="num" w:pos="720"/>
+        </w:tabs>
+        <w:ind w:left="720" w:hanging="360"/>
+      </w:pPr>
+      <w:rPr>
+        <w:rFonts w:ascii="Symbol" w:hAnsi="Symbol" w:hint="default"/>
+        <w:sz w:val="20"/>
+      </w:rPr>
+    </w:lvl>
+    <w:lvl w:ilvl="1" w:tentative="1">
+      <w:start w:val="1"/>
+      <w:numFmt w:val="bullet"/>
+      <w:lvlText w:val="o"/>
+      <w:lvlJc w:val="left"/>
+      <w:pPr>
+        <w:tabs>
+          <w:tab w:val="num" w:pos="1440"/>
+        </w:tabs>
+        <w:ind w:left="1440" w:hanging="360"/>
+      </w:pPr>
+      <w:rPr>
+        <w:rFonts w:ascii="Courier New" w:hAnsi="Courier New" w:hint="default"/>
+        <w:sz w:val="20"/>
+      </w:rPr>
+    </w:lvl>
+    <w:lvl w:ilvl="2" w:tentative="1">
+      <w:start w:val="1"/>
+      <w:numFmt w:val="bullet"/>
+      <w:lvlText w:val=""/>
+      <w:lvlJc w:val="left"/>
+      <w:pPr>
+        <w:tabs>
+          <w:tab w:val="num" w:pos="2160"/>
+        </w:tabs>
+        <w:ind w:left="2160" w:hanging="360"/>
+      </w:pPr>
+      <w:rPr>
+        <w:rFonts w:ascii="Wingdings" w:hAnsi="Wingdings" w:hint="default"/>
+        <w:sz w:val="20"/>
+      </w:rPr>
+    </w:lvl>
+    <w:lvl w:ilvl="3" w:tentative="1">
+      <w:start w:val="1"/>
+      <w:numFmt w:val="bullet"/>
+      <w:lvlText w:val=""/>
+      <w:lvlJc w:val="left"/>
+      <w:pPr>
+        <w:tabs>
+          <w:tab w:val="num" w:pos="2880"/>
+        </w:tabs>
+        <w:ind w:left="2880" w:hanging="360"/>
+      </w:pPr>
+      <w:rPr>
+        <w:rFonts w:ascii="Wingdings" w:hAnsi="Wingdings" w:hint="default"/>
+        <w:sz w:val="20"/>
+      </w:rPr>
+    </w:lvl>
+    <w:lvl w:ilvl="4" w:tentative="1">
+      <w:start w:val="1"/>
+      <w:numFmt w:val="bullet"/>
+      <w:lvlText w:val=""/>
+      <w:lvlJc w:val="left"/>
+      <w:pPr>
+        <w:tabs>
+          <w:tab w:val="num" w:pos="3600"/>
+        </w:tabs>
+        <w:ind w:left="3600" w:hanging="360"/>
+      </w:pPr>
+      <w:rPr>
+        <w:rFonts w:ascii="Wingdings" w:hAnsi="Wingdings" w:hint="default"/>
+        <w:sz w:val="20"/>
+      </w:rPr>
+    </w:lvl>
+    <w:lvl w:ilvl="5" w:tentative="1">
+      <w:start w:val="1"/>
+      <w:numFmt w:val="bullet"/>
+      <w:lvlText w:val=""/>
+      <w:lvlJc w:val="left"/>
+      <w:pPr>
+        <w:tabs>
+          <w:tab w:val="num" w:pos="4320"/>
+        </w:tabs>
+        <w:ind w:left="4320" w:hanging="360"/>
+      </w:pPr>
+      <w:rPr>
+        <w:rFonts w:ascii="Wingdings" w:hAnsi="Wingdings" w:hint="default"/>
+        <w:sz w:val="20"/>
+      </w:rPr>
+    </w:lvl>
+    <w:lvl w:ilvl="6" w:tentative="1">
+      <w:start w:val="1"/>
+      <w:numFmt w:val="bullet"/>
+      <w:lvlText w:val=""/>
+      <w:lvlJc w:val="left"/>
+      <w:pPr>
+        <w:tabs>
+          <w:tab w:val="num" w:pos="5040"/>
+        </w:tabs>
+        <w:ind w:left="5040" w:hanging="360"/>
+      </w:pPr>
+      <w:rPr>
+        <w:rFonts w:ascii="Wingdings" w:hAnsi="Wingdings" w:hint="default"/>
+        <w:sz w:val="20"/>
+      </w:rPr>
+    </w:lvl>
+    <w:lvl w:ilvl="7" w:tentative="1">
+      <w:start w:val="1"/>
+      <w:numFmt w:val="bullet"/>
+      <w:lvlText w:val=""/>
+      <w:lvlJc w:val="left"/>
+      <w:pPr>
+        <w:tabs>
+          <w:tab w:val="num" w:pos="5760"/>
+        </w:tabs>
+        <w:ind w:left="5760" w:hanging="360"/>
+      </w:pPr>
+      <w:rPr>
+        <w:rFonts w:ascii="Wingdings" w:hAnsi="Wingdings" w:hint="default"/>
+        <w:sz w:val="20"/>
+      </w:rPr>
+    </w:lvl>
+    <w:lvl w:ilvl="8" w:tentative="1">
+      <w:start w:val="1"/>
+      <w:numFmt w:val="bullet"/>
+      <w:lvlText w:val=""/>
+      <w:lvlJc w:val="left"/>
+      <w:pPr>
+        <w:tabs>
+          <w:tab w:val="num" w:pos="6480"/>
+        </w:tabs>
+        <w:ind w:left="6480" w:hanging="360"/>
+      </w:pPr>
+      <w:rPr>
+        <w:rFonts w:ascii="Wingdings" w:hAnsi="Wingdings" w:hint="default"/>
+        <w:sz w:val="20"/>
+      </w:rPr>
+    </w:lvl>
+  </w:abstractNum>
+  <w:abstractNum w:abstractNumId="6" w15:restartNumberingAfterBreak="0">
+    <w:nsid w:val="131250CF"/>
+    <w:multiLevelType w:val="multilevel"/>
+    <w:tmpl w:val="D6A286EA"/>
+    <w:lvl w:ilvl="0">
+      <w:start w:val="1"/>
+      <w:numFmt w:val="bullet"/>
+      <w:lvlText w:val=""/>
+      <w:lvlJc w:val="left"/>
+      <w:pPr>
+        <w:tabs>
+          <w:tab w:val="num" w:pos="720"/>
+        </w:tabs>
+        <w:ind w:left="720" w:hanging="360"/>
+      </w:pPr>
+      <w:rPr>
+        <w:rFonts w:ascii="Symbol" w:hAnsi="Symbol" w:hint="default"/>
+        <w:sz w:val="20"/>
+      </w:rPr>
+    </w:lvl>
+    <w:lvl w:ilvl="1" w:tentative="1">
+      <w:start w:val="1"/>
+      <w:numFmt w:val="bullet"/>
+      <w:lvlText w:val="o"/>
+      <w:lvlJc w:val="left"/>
+      <w:pPr>
+        <w:tabs>
+          <w:tab w:val="num" w:pos="1440"/>
+        </w:tabs>
+        <w:ind w:left="1440" w:hanging="360"/>
+      </w:pPr>
+      <w:rPr>
+        <w:rFonts w:ascii="Courier New" w:hAnsi="Courier New" w:hint="default"/>
+        <w:sz w:val="20"/>
+      </w:rPr>
+    </w:lvl>
+    <w:lvl w:ilvl="2" w:tentative="1">
+      <w:start w:val="1"/>
+      <w:numFmt w:val="bullet"/>
+      <w:lvlText w:val=""/>
+      <w:lvlJc w:val="left"/>
+      <w:pPr>
+        <w:tabs>
+          <w:tab w:val="num" w:pos="2160"/>
+        </w:tabs>
+        <w:ind w:left="2160" w:hanging="360"/>
+      </w:pPr>
+      <w:rPr>
+        <w:rFonts w:ascii="Wingdings" w:hAnsi="Wingdings" w:hint="default"/>
+        <w:sz w:val="20"/>
+      </w:rPr>
+    </w:lvl>
+    <w:lvl w:ilvl="3" w:tentative="1">
+      <w:start w:val="1"/>
+      <w:numFmt w:val="bullet"/>
+      <w:lvlText w:val=""/>
+      <w:lvlJc w:val="left"/>
+      <w:pPr>
+        <w:tabs>
+          <w:tab w:val="num" w:pos="2880"/>
+        </w:tabs>
+        <w:ind w:left="2880" w:hanging="360"/>
+      </w:pPr>
+      <w:rPr>
+        <w:rFonts w:ascii="Wingdings" w:hAnsi="Wingdings" w:hint="default"/>
+        <w:sz w:val="20"/>
+      </w:rPr>
+    </w:lvl>
+    <w:lvl w:ilvl="4" w:tentative="1">
+      <w:start w:val="1"/>
+      <w:numFmt w:val="bullet"/>
+      <w:lvlText w:val=""/>
+      <w:lvlJc w:val="left"/>
+      <w:pPr>
+        <w:tabs>
+          <w:tab w:val="num" w:pos="3600"/>
+        </w:tabs>
+        <w:ind w:left="3600" w:hanging="360"/>
+      </w:pPr>
+      <w:rPr>
+        <w:rFonts w:ascii="Wingdings" w:hAnsi="Wingdings" w:hint="default"/>
+        <w:sz w:val="20"/>
+      </w:rPr>
+    </w:lvl>
+    <w:lvl w:ilvl="5" w:tentative="1">
+      <w:start w:val="1"/>
+      <w:numFmt w:val="bullet"/>
+      <w:lvlText w:val=""/>
+      <w:lvlJc w:val="left"/>
+      <w:pPr>
+        <w:tabs>
+          <w:tab w:val="num" w:pos="4320"/>
+        </w:tabs>
+        <w:ind w:left="4320" w:hanging="360"/>
+      </w:pPr>
+      <w:rPr>
+        <w:rFonts w:ascii="Wingdings" w:hAnsi="Wingdings" w:hint="default"/>
+        <w:sz w:val="20"/>
+      </w:rPr>
+    </w:lvl>
+    <w:lvl w:ilvl="6" w:tentative="1">
+      <w:start w:val="1"/>
+      <w:numFmt w:val="bullet"/>
+      <w:lvlText w:val=""/>
+      <w:lvlJc w:val="left"/>
+      <w:pPr>
+        <w:tabs>
+          <w:tab w:val="num" w:pos="5040"/>
+        </w:tabs>
+        <w:ind w:left="5040" w:hanging="360"/>
+      </w:pPr>
+      <w:rPr>
+        <w:rFonts w:ascii="Wingdings" w:hAnsi="Wingdings" w:hint="default"/>
+        <w:sz w:val="20"/>
+      </w:rPr>
+    </w:lvl>
+    <w:lvl w:ilvl="7" w:tentative="1">
+      <w:start w:val="1"/>
+      <w:numFmt w:val="bullet"/>
+      <w:lvlText w:val=""/>
+      <w:lvlJc w:val="left"/>
+      <w:pPr>
+        <w:tabs>
+          <w:tab w:val="num" w:pos="5760"/>
+        </w:tabs>
+        <w:ind w:left="5760" w:hanging="360"/>
+      </w:pPr>
+      <w:rPr>
+        <w:rFonts w:ascii="Wingdings" w:hAnsi="Wingdings" w:hint="default"/>
+        <w:sz w:val="20"/>
+      </w:rPr>
+    </w:lvl>
+    <w:lvl w:ilvl="8" w:tentative="1">
+      <w:start w:val="1"/>
+      <w:numFmt w:val="bullet"/>
+      <w:lvlText w:val=""/>
+      <w:lvlJc w:val="left"/>
+      <w:pPr>
+        <w:tabs>
+          <w:tab w:val="num" w:pos="6480"/>
+        </w:tabs>
+        <w:ind w:left="6480" w:hanging="360"/>
+      </w:pPr>
+      <w:rPr>
+        <w:rFonts w:ascii="Wingdings" w:hAnsi="Wingdings" w:hint="default"/>
+        <w:sz w:val="20"/>
+      </w:rPr>
+    </w:lvl>
+  </w:abstractNum>
+  <w:abstractNum w:abstractNumId="7" w15:restartNumberingAfterBreak="0">
     <w:nsid w:val="14151D57"/>
     <w:multiLevelType w:val="multilevel"/>
     <w:tmpl w:val="AC247416"/>
@@ -7477,7 +9053,7 @@
       </w:rPr>
     </w:lvl>
   </w:abstractNum>
-  <w:abstractNum w:abstractNumId="6" w15:restartNumberingAfterBreak="0">
+  <w:abstractNum w:abstractNumId="8" w15:restartNumberingAfterBreak="0">
     <w:nsid w:val="17AE12ED"/>
     <w:multiLevelType w:val="multilevel"/>
     <w:tmpl w:val="A774A00C"/>
@@ -7626,7 +9202,7 @@
       </w:rPr>
     </w:lvl>
   </w:abstractNum>
-  <w:abstractNum w:abstractNumId="7" w15:restartNumberingAfterBreak="0">
+  <w:abstractNum w:abstractNumId="9" w15:restartNumberingAfterBreak="0">
     <w:nsid w:val="19C72512"/>
     <w:multiLevelType w:val="multilevel"/>
     <w:tmpl w:val="B3BCA5CA"/>
@@ -7775,7 +9351,7 @@
       </w:rPr>
     </w:lvl>
   </w:abstractNum>
-  <w:abstractNum w:abstractNumId="8" w15:restartNumberingAfterBreak="0">
+  <w:abstractNum w:abstractNumId="10" w15:restartNumberingAfterBreak="0">
     <w:nsid w:val="1F153021"/>
     <w:multiLevelType w:val="multilevel"/>
     <w:tmpl w:val="49885DB2"/>
@@ -7924,7 +9500,7 @@
       </w:rPr>
     </w:lvl>
   </w:abstractNum>
-  <w:abstractNum w:abstractNumId="9" w15:restartNumberingAfterBreak="0">
+  <w:abstractNum w:abstractNumId="11" w15:restartNumberingAfterBreak="0">
     <w:nsid w:val="280D422A"/>
     <w:multiLevelType w:val="multilevel"/>
     <w:tmpl w:val="2D9AE25C"/>
@@ -8073,7 +9649,7 @@
       </w:rPr>
     </w:lvl>
   </w:abstractNum>
-  <w:abstractNum w:abstractNumId="10" w15:restartNumberingAfterBreak="0">
+  <w:abstractNum w:abstractNumId="12" w15:restartNumberingAfterBreak="0">
     <w:nsid w:val="29CD59AC"/>
     <w:multiLevelType w:val="multilevel"/>
     <w:tmpl w:val="AD506BC8"/>
@@ -8222,7 +9798,7 @@
       </w:rPr>
     </w:lvl>
   </w:abstractNum>
-  <w:abstractNum w:abstractNumId="11" w15:restartNumberingAfterBreak="0">
+  <w:abstractNum w:abstractNumId="13" w15:restartNumberingAfterBreak="0">
     <w:nsid w:val="30607CE1"/>
     <w:multiLevelType w:val="multilevel"/>
     <w:tmpl w:val="0ADC0110"/>
@@ -8371,7 +9947,7 @@
       </w:rPr>
     </w:lvl>
   </w:abstractNum>
-  <w:abstractNum w:abstractNumId="12" w15:restartNumberingAfterBreak="0">
+  <w:abstractNum w:abstractNumId="14" w15:restartNumberingAfterBreak="0">
     <w:nsid w:val="34764FCE"/>
     <w:multiLevelType w:val="multilevel"/>
     <w:tmpl w:val="ACE44528"/>
@@ -8520,7 +10096,7 @@
       </w:rPr>
     </w:lvl>
   </w:abstractNum>
-  <w:abstractNum w:abstractNumId="13" w15:restartNumberingAfterBreak="0">
+  <w:abstractNum w:abstractNumId="15" w15:restartNumberingAfterBreak="0">
     <w:nsid w:val="35023D8A"/>
     <w:multiLevelType w:val="multilevel"/>
     <w:tmpl w:val="10D2C716"/>
@@ -8669,7 +10245,7 @@
       </w:rPr>
     </w:lvl>
   </w:abstractNum>
-  <w:abstractNum w:abstractNumId="14" w15:restartNumberingAfterBreak="0">
+  <w:abstractNum w:abstractNumId="16" w15:restartNumberingAfterBreak="0">
     <w:nsid w:val="37CF2D78"/>
     <w:multiLevelType w:val="multilevel"/>
     <w:tmpl w:val="33385F66"/>
@@ -8818,7 +10394,7 @@
       </w:rPr>
     </w:lvl>
   </w:abstractNum>
-  <w:abstractNum w:abstractNumId="15" w15:restartNumberingAfterBreak="0">
+  <w:abstractNum w:abstractNumId="17" w15:restartNumberingAfterBreak="0">
     <w:nsid w:val="380974D1"/>
     <w:multiLevelType w:val="multilevel"/>
     <w:tmpl w:val="97B47962"/>
@@ -8967,7 +10543,7 @@
       </w:rPr>
     </w:lvl>
   </w:abstractNum>
-  <w:abstractNum w:abstractNumId="16" w15:restartNumberingAfterBreak="0">
+  <w:abstractNum w:abstractNumId="18" w15:restartNumberingAfterBreak="0">
     <w:nsid w:val="3B475590"/>
     <w:multiLevelType w:val="multilevel"/>
     <w:tmpl w:val="5A94470C"/>
@@ -9116,7 +10692,7 @@
       </w:rPr>
     </w:lvl>
   </w:abstractNum>
-  <w:abstractNum w:abstractNumId="17" w15:restartNumberingAfterBreak="0">
+  <w:abstractNum w:abstractNumId="19" w15:restartNumberingAfterBreak="0">
     <w:nsid w:val="3CBC441F"/>
     <w:multiLevelType w:val="multilevel"/>
     <w:tmpl w:val="37D2D3DE"/>
@@ -9265,7 +10841,7 @@
       </w:rPr>
     </w:lvl>
   </w:abstractNum>
-  <w:abstractNum w:abstractNumId="18" w15:restartNumberingAfterBreak="0">
+  <w:abstractNum w:abstractNumId="20" w15:restartNumberingAfterBreak="0">
     <w:nsid w:val="3D7B5690"/>
     <w:multiLevelType w:val="multilevel"/>
     <w:tmpl w:val="31807168"/>
@@ -9414,7 +10990,305 @@
       </w:rPr>
     </w:lvl>
   </w:abstractNum>
-  <w:abstractNum w:abstractNumId="19" w15:restartNumberingAfterBreak="0">
+  <w:abstractNum w:abstractNumId="21" w15:restartNumberingAfterBreak="0">
+    <w:nsid w:val="3E297016"/>
+    <w:multiLevelType w:val="multilevel"/>
+    <w:tmpl w:val="8F9CEA28"/>
+    <w:lvl w:ilvl="0">
+      <w:start w:val="1"/>
+      <w:numFmt w:val="bullet"/>
+      <w:lvlText w:val=""/>
+      <w:lvlJc w:val="left"/>
+      <w:pPr>
+        <w:tabs>
+          <w:tab w:val="num" w:pos="720"/>
+        </w:tabs>
+        <w:ind w:left="720" w:hanging="360"/>
+      </w:pPr>
+      <w:rPr>
+        <w:rFonts w:ascii="Symbol" w:hAnsi="Symbol" w:hint="default"/>
+        <w:sz w:val="20"/>
+      </w:rPr>
+    </w:lvl>
+    <w:lvl w:ilvl="1" w:tentative="1">
+      <w:start w:val="1"/>
+      <w:numFmt w:val="bullet"/>
+      <w:lvlText w:val="o"/>
+      <w:lvlJc w:val="left"/>
+      <w:pPr>
+        <w:tabs>
+          <w:tab w:val="num" w:pos="1440"/>
+        </w:tabs>
+        <w:ind w:left="1440" w:hanging="360"/>
+      </w:pPr>
+      <w:rPr>
+        <w:rFonts w:ascii="Courier New" w:hAnsi="Courier New" w:hint="default"/>
+        <w:sz w:val="20"/>
+      </w:rPr>
+    </w:lvl>
+    <w:lvl w:ilvl="2" w:tentative="1">
+      <w:start w:val="1"/>
+      <w:numFmt w:val="bullet"/>
+      <w:lvlText w:val=""/>
+      <w:lvlJc w:val="left"/>
+      <w:pPr>
+        <w:tabs>
+          <w:tab w:val="num" w:pos="2160"/>
+        </w:tabs>
+        <w:ind w:left="2160" w:hanging="360"/>
+      </w:pPr>
+      <w:rPr>
+        <w:rFonts w:ascii="Wingdings" w:hAnsi="Wingdings" w:hint="default"/>
+        <w:sz w:val="20"/>
+      </w:rPr>
+    </w:lvl>
+    <w:lvl w:ilvl="3" w:tentative="1">
+      <w:start w:val="1"/>
+      <w:numFmt w:val="bullet"/>
+      <w:lvlText w:val=""/>
+      <w:lvlJc w:val="left"/>
+      <w:pPr>
+        <w:tabs>
+          <w:tab w:val="num" w:pos="2880"/>
+        </w:tabs>
+        <w:ind w:left="2880" w:hanging="360"/>
+      </w:pPr>
+      <w:rPr>
+        <w:rFonts w:ascii="Wingdings" w:hAnsi="Wingdings" w:hint="default"/>
+        <w:sz w:val="20"/>
+      </w:rPr>
+    </w:lvl>
+    <w:lvl w:ilvl="4" w:tentative="1">
+      <w:start w:val="1"/>
+      <w:numFmt w:val="bullet"/>
+      <w:lvlText w:val=""/>
+      <w:lvlJc w:val="left"/>
+      <w:pPr>
+        <w:tabs>
+          <w:tab w:val="num" w:pos="3600"/>
+        </w:tabs>
+        <w:ind w:left="3600" w:hanging="360"/>
+      </w:pPr>
+      <w:rPr>
+        <w:rFonts w:ascii="Wingdings" w:hAnsi="Wingdings" w:hint="default"/>
+        <w:sz w:val="20"/>
+      </w:rPr>
+    </w:lvl>
+    <w:lvl w:ilvl="5" w:tentative="1">
+      <w:start w:val="1"/>
+      <w:numFmt w:val="bullet"/>
+      <w:lvlText w:val=""/>
+      <w:lvlJc w:val="left"/>
+      <w:pPr>
+        <w:tabs>
+          <w:tab w:val="num" w:pos="4320"/>
+        </w:tabs>
+        <w:ind w:left="4320" w:hanging="360"/>
+      </w:pPr>
+      <w:rPr>
+        <w:rFonts w:ascii="Wingdings" w:hAnsi="Wingdings" w:hint="default"/>
+        <w:sz w:val="20"/>
+      </w:rPr>
+    </w:lvl>
+    <w:lvl w:ilvl="6" w:tentative="1">
+      <w:start w:val="1"/>
+      <w:numFmt w:val="bullet"/>
+      <w:lvlText w:val=""/>
+      <w:lvlJc w:val="left"/>
+      <w:pPr>
+        <w:tabs>
+          <w:tab w:val="num" w:pos="5040"/>
+        </w:tabs>
+        <w:ind w:left="5040" w:hanging="360"/>
+      </w:pPr>
+      <w:rPr>
+        <w:rFonts w:ascii="Wingdings" w:hAnsi="Wingdings" w:hint="default"/>
+        <w:sz w:val="20"/>
+      </w:rPr>
+    </w:lvl>
+    <w:lvl w:ilvl="7" w:tentative="1">
+      <w:start w:val="1"/>
+      <w:numFmt w:val="bullet"/>
+      <w:lvlText w:val=""/>
+      <w:lvlJc w:val="left"/>
+      <w:pPr>
+        <w:tabs>
+          <w:tab w:val="num" w:pos="5760"/>
+        </w:tabs>
+        <w:ind w:left="5760" w:hanging="360"/>
+      </w:pPr>
+      <w:rPr>
+        <w:rFonts w:ascii="Wingdings" w:hAnsi="Wingdings" w:hint="default"/>
+        <w:sz w:val="20"/>
+      </w:rPr>
+    </w:lvl>
+    <w:lvl w:ilvl="8" w:tentative="1">
+      <w:start w:val="1"/>
+      <w:numFmt w:val="bullet"/>
+      <w:lvlText w:val=""/>
+      <w:lvlJc w:val="left"/>
+      <w:pPr>
+        <w:tabs>
+          <w:tab w:val="num" w:pos="6480"/>
+        </w:tabs>
+        <w:ind w:left="6480" w:hanging="360"/>
+      </w:pPr>
+      <w:rPr>
+        <w:rFonts w:ascii="Wingdings" w:hAnsi="Wingdings" w:hint="default"/>
+        <w:sz w:val="20"/>
+      </w:rPr>
+    </w:lvl>
+  </w:abstractNum>
+  <w:abstractNum w:abstractNumId="22" w15:restartNumberingAfterBreak="0">
+    <w:nsid w:val="3E3D6B2D"/>
+    <w:multiLevelType w:val="multilevel"/>
+    <w:tmpl w:val="E8FE1B2E"/>
+    <w:lvl w:ilvl="0">
+      <w:start w:val="1"/>
+      <w:numFmt w:val="bullet"/>
+      <w:lvlText w:val=""/>
+      <w:lvlJc w:val="left"/>
+      <w:pPr>
+        <w:tabs>
+          <w:tab w:val="num" w:pos="720"/>
+        </w:tabs>
+        <w:ind w:left="720" w:hanging="360"/>
+      </w:pPr>
+      <w:rPr>
+        <w:rFonts w:ascii="Symbol" w:hAnsi="Symbol" w:hint="default"/>
+        <w:sz w:val="20"/>
+      </w:rPr>
+    </w:lvl>
+    <w:lvl w:ilvl="1" w:tentative="1">
+      <w:start w:val="1"/>
+      <w:numFmt w:val="bullet"/>
+      <w:lvlText w:val="o"/>
+      <w:lvlJc w:val="left"/>
+      <w:pPr>
+        <w:tabs>
+          <w:tab w:val="num" w:pos="1440"/>
+        </w:tabs>
+        <w:ind w:left="1440" w:hanging="360"/>
+      </w:pPr>
+      <w:rPr>
+        <w:rFonts w:ascii="Courier New" w:hAnsi="Courier New" w:hint="default"/>
+        <w:sz w:val="20"/>
+      </w:rPr>
+    </w:lvl>
+    <w:lvl w:ilvl="2" w:tentative="1">
+      <w:start w:val="1"/>
+      <w:numFmt w:val="bullet"/>
+      <w:lvlText w:val=""/>
+      <w:lvlJc w:val="left"/>
+      <w:pPr>
+        <w:tabs>
+          <w:tab w:val="num" w:pos="2160"/>
+        </w:tabs>
+        <w:ind w:left="2160" w:hanging="360"/>
+      </w:pPr>
+      <w:rPr>
+        <w:rFonts w:ascii="Wingdings" w:hAnsi="Wingdings" w:hint="default"/>
+        <w:sz w:val="20"/>
+      </w:rPr>
+    </w:lvl>
+    <w:lvl w:ilvl="3" w:tentative="1">
+      <w:start w:val="1"/>
+      <w:numFmt w:val="bullet"/>
+      <w:lvlText w:val=""/>
+      <w:lvlJc w:val="left"/>
+      <w:pPr>
+        <w:tabs>
+          <w:tab w:val="num" w:pos="2880"/>
+        </w:tabs>
+        <w:ind w:left="2880" w:hanging="360"/>
+      </w:pPr>
+      <w:rPr>
+        <w:rFonts w:ascii="Wingdings" w:hAnsi="Wingdings" w:hint="default"/>
+        <w:sz w:val="20"/>
+      </w:rPr>
+    </w:lvl>
+    <w:lvl w:ilvl="4" w:tentative="1">
+      <w:start w:val="1"/>
+      <w:numFmt w:val="bullet"/>
+      <w:lvlText w:val=""/>
+      <w:lvlJc w:val="left"/>
+      <w:pPr>
+        <w:tabs>
+          <w:tab w:val="num" w:pos="3600"/>
+        </w:tabs>
+        <w:ind w:left="3600" w:hanging="360"/>
+      </w:pPr>
+      <w:rPr>
+        <w:rFonts w:ascii="Wingdings" w:hAnsi="Wingdings" w:hint="default"/>
+        <w:sz w:val="20"/>
+      </w:rPr>
+    </w:lvl>
+    <w:lvl w:ilvl="5" w:tentative="1">
+      <w:start w:val="1"/>
+      <w:numFmt w:val="bullet"/>
+      <w:lvlText w:val=""/>
+      <w:lvlJc w:val="left"/>
+      <w:pPr>
+        <w:tabs>
+          <w:tab w:val="num" w:pos="4320"/>
+        </w:tabs>
+        <w:ind w:left="4320" w:hanging="360"/>
+      </w:pPr>
+      <w:rPr>
+        <w:rFonts w:ascii="Wingdings" w:hAnsi="Wingdings" w:hint="default"/>
+        <w:sz w:val="20"/>
+      </w:rPr>
+    </w:lvl>
+    <w:lvl w:ilvl="6" w:tentative="1">
+      <w:start w:val="1"/>
+      <w:numFmt w:val="bullet"/>
+      <w:lvlText w:val=""/>
+      <w:lvlJc w:val="left"/>
+      <w:pPr>
+        <w:tabs>
+          <w:tab w:val="num" w:pos="5040"/>
+        </w:tabs>
+        <w:ind w:left="5040" w:hanging="360"/>
+      </w:pPr>
+      <w:rPr>
+        <w:rFonts w:ascii="Wingdings" w:hAnsi="Wingdings" w:hint="default"/>
+        <w:sz w:val="20"/>
+      </w:rPr>
+    </w:lvl>
+    <w:lvl w:ilvl="7" w:tentative="1">
+      <w:start w:val="1"/>
+      <w:numFmt w:val="bullet"/>
+      <w:lvlText w:val=""/>
+      <w:lvlJc w:val="left"/>
+      <w:pPr>
+        <w:tabs>
+          <w:tab w:val="num" w:pos="5760"/>
+        </w:tabs>
+        <w:ind w:left="5760" w:hanging="360"/>
+      </w:pPr>
+      <w:rPr>
+        <w:rFonts w:ascii="Wingdings" w:hAnsi="Wingdings" w:hint="default"/>
+        <w:sz w:val="20"/>
+      </w:rPr>
+    </w:lvl>
+    <w:lvl w:ilvl="8" w:tentative="1">
+      <w:start w:val="1"/>
+      <w:numFmt w:val="bullet"/>
+      <w:lvlText w:val=""/>
+      <w:lvlJc w:val="left"/>
+      <w:pPr>
+        <w:tabs>
+          <w:tab w:val="num" w:pos="6480"/>
+        </w:tabs>
+        <w:ind w:left="6480" w:hanging="360"/>
+      </w:pPr>
+      <w:rPr>
+        <w:rFonts w:ascii="Wingdings" w:hAnsi="Wingdings" w:hint="default"/>
+        <w:sz w:val="20"/>
+      </w:rPr>
+    </w:lvl>
+  </w:abstractNum>
+  <w:abstractNum w:abstractNumId="23" w15:restartNumberingAfterBreak="0">
     <w:nsid w:val="48F8196E"/>
     <w:multiLevelType w:val="multilevel"/>
     <w:tmpl w:val="B0540AAC"/>
@@ -9563,7 +11437,156 @@
       </w:rPr>
     </w:lvl>
   </w:abstractNum>
-  <w:abstractNum w:abstractNumId="20" w15:restartNumberingAfterBreak="0">
+  <w:abstractNum w:abstractNumId="24" w15:restartNumberingAfterBreak="0">
+    <w:nsid w:val="4A270F21"/>
+    <w:multiLevelType w:val="multilevel"/>
+    <w:tmpl w:val="0D4A3A8A"/>
+    <w:lvl w:ilvl="0">
+      <w:start w:val="1"/>
+      <w:numFmt w:val="bullet"/>
+      <w:lvlText w:val=""/>
+      <w:lvlJc w:val="left"/>
+      <w:pPr>
+        <w:tabs>
+          <w:tab w:val="num" w:pos="720"/>
+        </w:tabs>
+        <w:ind w:left="720" w:hanging="360"/>
+      </w:pPr>
+      <w:rPr>
+        <w:rFonts w:ascii="Symbol" w:hAnsi="Symbol" w:hint="default"/>
+        <w:sz w:val="20"/>
+      </w:rPr>
+    </w:lvl>
+    <w:lvl w:ilvl="1" w:tentative="1">
+      <w:start w:val="1"/>
+      <w:numFmt w:val="bullet"/>
+      <w:lvlText w:val="o"/>
+      <w:lvlJc w:val="left"/>
+      <w:pPr>
+        <w:tabs>
+          <w:tab w:val="num" w:pos="1440"/>
+        </w:tabs>
+        <w:ind w:left="1440" w:hanging="360"/>
+      </w:pPr>
+      <w:rPr>
+        <w:rFonts w:ascii="Courier New" w:hAnsi="Courier New" w:hint="default"/>
+        <w:sz w:val="20"/>
+      </w:rPr>
+    </w:lvl>
+    <w:lvl w:ilvl="2" w:tentative="1">
+      <w:start w:val="1"/>
+      <w:numFmt w:val="bullet"/>
+      <w:lvlText w:val=""/>
+      <w:lvlJc w:val="left"/>
+      <w:pPr>
+        <w:tabs>
+          <w:tab w:val="num" w:pos="2160"/>
+        </w:tabs>
+        <w:ind w:left="2160" w:hanging="360"/>
+      </w:pPr>
+      <w:rPr>
+        <w:rFonts w:ascii="Wingdings" w:hAnsi="Wingdings" w:hint="default"/>
+        <w:sz w:val="20"/>
+      </w:rPr>
+    </w:lvl>
+    <w:lvl w:ilvl="3" w:tentative="1">
+      <w:start w:val="1"/>
+      <w:numFmt w:val="bullet"/>
+      <w:lvlText w:val=""/>
+      <w:lvlJc w:val="left"/>
+      <w:pPr>
+        <w:tabs>
+          <w:tab w:val="num" w:pos="2880"/>
+        </w:tabs>
+        <w:ind w:left="2880" w:hanging="360"/>
+      </w:pPr>
+      <w:rPr>
+        <w:rFonts w:ascii="Wingdings" w:hAnsi="Wingdings" w:hint="default"/>
+        <w:sz w:val="20"/>
+      </w:rPr>
+    </w:lvl>
+    <w:lvl w:ilvl="4" w:tentative="1">
+      <w:start w:val="1"/>
+      <w:numFmt w:val="bullet"/>
+      <w:lvlText w:val=""/>
+      <w:lvlJc w:val="left"/>
+      <w:pPr>
+        <w:tabs>
+          <w:tab w:val="num" w:pos="3600"/>
+        </w:tabs>
+        <w:ind w:left="3600" w:hanging="360"/>
+      </w:pPr>
+      <w:rPr>
+        <w:rFonts w:ascii="Wingdings" w:hAnsi="Wingdings" w:hint="default"/>
+        <w:sz w:val="20"/>
+      </w:rPr>
+    </w:lvl>
+    <w:lvl w:ilvl="5" w:tentative="1">
+      <w:start w:val="1"/>
+      <w:numFmt w:val="bullet"/>
+      <w:lvlText w:val=""/>
+      <w:lvlJc w:val="left"/>
+      <w:pPr>
+        <w:tabs>
+          <w:tab w:val="num" w:pos="4320"/>
+        </w:tabs>
+        <w:ind w:left="4320" w:hanging="360"/>
+      </w:pPr>
+      <w:rPr>
+        <w:rFonts w:ascii="Wingdings" w:hAnsi="Wingdings" w:hint="default"/>
+        <w:sz w:val="20"/>
+      </w:rPr>
+    </w:lvl>
+    <w:lvl w:ilvl="6" w:tentative="1">
+      <w:start w:val="1"/>
+      <w:numFmt w:val="bullet"/>
+      <w:lvlText w:val=""/>
+      <w:lvlJc w:val="left"/>
+      <w:pPr>
+        <w:tabs>
+          <w:tab w:val="num" w:pos="5040"/>
+        </w:tabs>
+        <w:ind w:left="5040" w:hanging="360"/>
+      </w:pPr>
+      <w:rPr>
+        <w:rFonts w:ascii="Wingdings" w:hAnsi="Wingdings" w:hint="default"/>
+        <w:sz w:val="20"/>
+      </w:rPr>
+    </w:lvl>
+    <w:lvl w:ilvl="7" w:tentative="1">
+      <w:start w:val="1"/>
+      <w:numFmt w:val="bullet"/>
+      <w:lvlText w:val=""/>
+      <w:lvlJc w:val="left"/>
+      <w:pPr>
+        <w:tabs>
+          <w:tab w:val="num" w:pos="5760"/>
+        </w:tabs>
+        <w:ind w:left="5760" w:hanging="360"/>
+      </w:pPr>
+      <w:rPr>
+        <w:rFonts w:ascii="Wingdings" w:hAnsi="Wingdings" w:hint="default"/>
+        <w:sz w:val="20"/>
+      </w:rPr>
+    </w:lvl>
+    <w:lvl w:ilvl="8" w:tentative="1">
+      <w:start w:val="1"/>
+      <w:numFmt w:val="bullet"/>
+      <w:lvlText w:val=""/>
+      <w:lvlJc w:val="left"/>
+      <w:pPr>
+        <w:tabs>
+          <w:tab w:val="num" w:pos="6480"/>
+        </w:tabs>
+        <w:ind w:left="6480" w:hanging="360"/>
+      </w:pPr>
+      <w:rPr>
+        <w:rFonts w:ascii="Wingdings" w:hAnsi="Wingdings" w:hint="default"/>
+        <w:sz w:val="20"/>
+      </w:rPr>
+    </w:lvl>
+  </w:abstractNum>
+  <w:abstractNum w:abstractNumId="25" w15:restartNumberingAfterBreak="0">
     <w:nsid w:val="4D6551BF"/>
     <w:multiLevelType w:val="multilevel"/>
     <w:tmpl w:val="ADE49D40"/>
@@ -9712,7 +11735,7 @@
       </w:rPr>
     </w:lvl>
   </w:abstractNum>
-  <w:abstractNum w:abstractNumId="21" w15:restartNumberingAfterBreak="0">
+  <w:abstractNum w:abstractNumId="26" w15:restartNumberingAfterBreak="0">
     <w:nsid w:val="50602847"/>
     <w:multiLevelType w:val="multilevel"/>
     <w:tmpl w:val="CD6E6D62"/>
@@ -9861,7 +11884,7 @@
       </w:rPr>
     </w:lvl>
   </w:abstractNum>
-  <w:abstractNum w:abstractNumId="22" w15:restartNumberingAfterBreak="0">
+  <w:abstractNum w:abstractNumId="27" w15:restartNumberingAfterBreak="0">
     <w:nsid w:val="50CC7765"/>
     <w:multiLevelType w:val="multilevel"/>
     <w:tmpl w:val="759C47E8"/>
@@ -10010,7 +12033,156 @@
       </w:rPr>
     </w:lvl>
   </w:abstractNum>
-  <w:abstractNum w:abstractNumId="23" w15:restartNumberingAfterBreak="0">
+  <w:abstractNum w:abstractNumId="28" w15:restartNumberingAfterBreak="0">
+    <w:nsid w:val="514A3868"/>
+    <w:multiLevelType w:val="multilevel"/>
+    <w:tmpl w:val="4E72D3C4"/>
+    <w:lvl w:ilvl="0">
+      <w:start w:val="1"/>
+      <w:numFmt w:val="bullet"/>
+      <w:lvlText w:val=""/>
+      <w:lvlJc w:val="left"/>
+      <w:pPr>
+        <w:tabs>
+          <w:tab w:val="num" w:pos="720"/>
+        </w:tabs>
+        <w:ind w:left="720" w:hanging="360"/>
+      </w:pPr>
+      <w:rPr>
+        <w:rFonts w:ascii="Symbol" w:hAnsi="Symbol" w:hint="default"/>
+        <w:sz w:val="20"/>
+      </w:rPr>
+    </w:lvl>
+    <w:lvl w:ilvl="1" w:tentative="1">
+      <w:start w:val="1"/>
+      <w:numFmt w:val="bullet"/>
+      <w:lvlText w:val="o"/>
+      <w:lvlJc w:val="left"/>
+      <w:pPr>
+        <w:tabs>
+          <w:tab w:val="num" w:pos="1440"/>
+        </w:tabs>
+        <w:ind w:left="1440" w:hanging="360"/>
+      </w:pPr>
+      <w:rPr>
+        <w:rFonts w:ascii="Courier New" w:hAnsi="Courier New" w:hint="default"/>
+        <w:sz w:val="20"/>
+      </w:rPr>
+    </w:lvl>
+    <w:lvl w:ilvl="2" w:tentative="1">
+      <w:start w:val="1"/>
+      <w:numFmt w:val="bullet"/>
+      <w:lvlText w:val=""/>
+      <w:lvlJc w:val="left"/>
+      <w:pPr>
+        <w:tabs>
+          <w:tab w:val="num" w:pos="2160"/>
+        </w:tabs>
+        <w:ind w:left="2160" w:hanging="360"/>
+      </w:pPr>
+      <w:rPr>
+        <w:rFonts w:ascii="Wingdings" w:hAnsi="Wingdings" w:hint="default"/>
+        <w:sz w:val="20"/>
+      </w:rPr>
+    </w:lvl>
+    <w:lvl w:ilvl="3" w:tentative="1">
+      <w:start w:val="1"/>
+      <w:numFmt w:val="bullet"/>
+      <w:lvlText w:val=""/>
+      <w:lvlJc w:val="left"/>
+      <w:pPr>
+        <w:tabs>
+          <w:tab w:val="num" w:pos="2880"/>
+        </w:tabs>
+        <w:ind w:left="2880" w:hanging="360"/>
+      </w:pPr>
+      <w:rPr>
+        <w:rFonts w:ascii="Wingdings" w:hAnsi="Wingdings" w:hint="default"/>
+        <w:sz w:val="20"/>
+      </w:rPr>
+    </w:lvl>
+    <w:lvl w:ilvl="4" w:tentative="1">
+      <w:start w:val="1"/>
+      <w:numFmt w:val="bullet"/>
+      <w:lvlText w:val=""/>
+      <w:lvlJc w:val="left"/>
+      <w:pPr>
+        <w:tabs>
+          <w:tab w:val="num" w:pos="3600"/>
+        </w:tabs>
+        <w:ind w:left="3600" w:hanging="360"/>
+      </w:pPr>
+      <w:rPr>
+        <w:rFonts w:ascii="Wingdings" w:hAnsi="Wingdings" w:hint="default"/>
+        <w:sz w:val="20"/>
+      </w:rPr>
+    </w:lvl>
+    <w:lvl w:ilvl="5" w:tentative="1">
+      <w:start w:val="1"/>
+      <w:numFmt w:val="bullet"/>
+      <w:lvlText w:val=""/>
+      <w:lvlJc w:val="left"/>
+      <w:pPr>
+        <w:tabs>
+          <w:tab w:val="num" w:pos="4320"/>
+        </w:tabs>
+        <w:ind w:left="4320" w:hanging="360"/>
+      </w:pPr>
+      <w:rPr>
+        <w:rFonts w:ascii="Wingdings" w:hAnsi="Wingdings" w:hint="default"/>
+        <w:sz w:val="20"/>
+      </w:rPr>
+    </w:lvl>
+    <w:lvl w:ilvl="6" w:tentative="1">
+      <w:start w:val="1"/>
+      <w:numFmt w:val="bullet"/>
+      <w:lvlText w:val=""/>
+      <w:lvlJc w:val="left"/>
+      <w:pPr>
+        <w:tabs>
+          <w:tab w:val="num" w:pos="5040"/>
+        </w:tabs>
+        <w:ind w:left="5040" w:hanging="360"/>
+      </w:pPr>
+      <w:rPr>
+        <w:rFonts w:ascii="Wingdings" w:hAnsi="Wingdings" w:hint="default"/>
+        <w:sz w:val="20"/>
+      </w:rPr>
+    </w:lvl>
+    <w:lvl w:ilvl="7" w:tentative="1">
+      <w:start w:val="1"/>
+      <w:numFmt w:val="bullet"/>
+      <w:lvlText w:val=""/>
+      <w:lvlJc w:val="left"/>
+      <w:pPr>
+        <w:tabs>
+          <w:tab w:val="num" w:pos="5760"/>
+        </w:tabs>
+        <w:ind w:left="5760" w:hanging="360"/>
+      </w:pPr>
+      <w:rPr>
+        <w:rFonts w:ascii="Wingdings" w:hAnsi="Wingdings" w:hint="default"/>
+        <w:sz w:val="20"/>
+      </w:rPr>
+    </w:lvl>
+    <w:lvl w:ilvl="8" w:tentative="1">
+      <w:start w:val="1"/>
+      <w:numFmt w:val="bullet"/>
+      <w:lvlText w:val=""/>
+      <w:lvlJc w:val="left"/>
+      <w:pPr>
+        <w:tabs>
+          <w:tab w:val="num" w:pos="6480"/>
+        </w:tabs>
+        <w:ind w:left="6480" w:hanging="360"/>
+      </w:pPr>
+      <w:rPr>
+        <w:rFonts w:ascii="Wingdings" w:hAnsi="Wingdings" w:hint="default"/>
+        <w:sz w:val="20"/>
+      </w:rPr>
+    </w:lvl>
+  </w:abstractNum>
+  <w:abstractNum w:abstractNumId="29" w15:restartNumberingAfterBreak="0">
     <w:nsid w:val="53A46EE4"/>
     <w:multiLevelType w:val="multilevel"/>
     <w:tmpl w:val="DE0612E0"/>
@@ -10159,7 +12331,7 @@
       </w:rPr>
     </w:lvl>
   </w:abstractNum>
-  <w:abstractNum w:abstractNumId="24" w15:restartNumberingAfterBreak="0">
+  <w:abstractNum w:abstractNumId="30" w15:restartNumberingAfterBreak="0">
     <w:nsid w:val="54877B99"/>
     <w:multiLevelType w:val="multilevel"/>
     <w:tmpl w:val="FA0C5B04"/>
@@ -10308,7 +12480,7 @@
       </w:rPr>
     </w:lvl>
   </w:abstractNum>
-  <w:abstractNum w:abstractNumId="25" w15:restartNumberingAfterBreak="0">
+  <w:abstractNum w:abstractNumId="31" w15:restartNumberingAfterBreak="0">
     <w:nsid w:val="56221B4E"/>
     <w:multiLevelType w:val="multilevel"/>
     <w:tmpl w:val="4C12CE6E"/>
@@ -10457,7 +12629,7 @@
       </w:rPr>
     </w:lvl>
   </w:abstractNum>
-  <w:abstractNum w:abstractNumId="26" w15:restartNumberingAfterBreak="0">
+  <w:abstractNum w:abstractNumId="32" w15:restartNumberingAfterBreak="0">
     <w:nsid w:val="56BD4743"/>
     <w:multiLevelType w:val="multilevel"/>
     <w:tmpl w:val="31DA023C"/>
@@ -10606,7 +12778,305 @@
       </w:rPr>
     </w:lvl>
   </w:abstractNum>
-  <w:abstractNum w:abstractNumId="27" w15:restartNumberingAfterBreak="0">
+  <w:abstractNum w:abstractNumId="33" w15:restartNumberingAfterBreak="0">
+    <w:nsid w:val="56D3313E"/>
+    <w:multiLevelType w:val="multilevel"/>
+    <w:tmpl w:val="9BCA2848"/>
+    <w:lvl w:ilvl="0">
+      <w:start w:val="1"/>
+      <w:numFmt w:val="bullet"/>
+      <w:lvlText w:val=""/>
+      <w:lvlJc w:val="left"/>
+      <w:pPr>
+        <w:tabs>
+          <w:tab w:val="num" w:pos="720"/>
+        </w:tabs>
+        <w:ind w:left="720" w:hanging="360"/>
+      </w:pPr>
+      <w:rPr>
+        <w:rFonts w:ascii="Symbol" w:hAnsi="Symbol" w:hint="default"/>
+        <w:sz w:val="20"/>
+      </w:rPr>
+    </w:lvl>
+    <w:lvl w:ilvl="1" w:tentative="1">
+      <w:start w:val="1"/>
+      <w:numFmt w:val="bullet"/>
+      <w:lvlText w:val="o"/>
+      <w:lvlJc w:val="left"/>
+      <w:pPr>
+        <w:tabs>
+          <w:tab w:val="num" w:pos="1440"/>
+        </w:tabs>
+        <w:ind w:left="1440" w:hanging="360"/>
+      </w:pPr>
+      <w:rPr>
+        <w:rFonts w:ascii="Courier New" w:hAnsi="Courier New" w:hint="default"/>
+        <w:sz w:val="20"/>
+      </w:rPr>
+    </w:lvl>
+    <w:lvl w:ilvl="2" w:tentative="1">
+      <w:start w:val="1"/>
+      <w:numFmt w:val="bullet"/>
+      <w:lvlText w:val=""/>
+      <w:lvlJc w:val="left"/>
+      <w:pPr>
+        <w:tabs>
+          <w:tab w:val="num" w:pos="2160"/>
+        </w:tabs>
+        <w:ind w:left="2160" w:hanging="360"/>
+      </w:pPr>
+      <w:rPr>
+        <w:rFonts w:ascii="Wingdings" w:hAnsi="Wingdings" w:hint="default"/>
+        <w:sz w:val="20"/>
+      </w:rPr>
+    </w:lvl>
+    <w:lvl w:ilvl="3" w:tentative="1">
+      <w:start w:val="1"/>
+      <w:numFmt w:val="bullet"/>
+      <w:lvlText w:val=""/>
+      <w:lvlJc w:val="left"/>
+      <w:pPr>
+        <w:tabs>
+          <w:tab w:val="num" w:pos="2880"/>
+        </w:tabs>
+        <w:ind w:left="2880" w:hanging="360"/>
+      </w:pPr>
+      <w:rPr>
+        <w:rFonts w:ascii="Wingdings" w:hAnsi="Wingdings" w:hint="default"/>
+        <w:sz w:val="20"/>
+      </w:rPr>
+    </w:lvl>
+    <w:lvl w:ilvl="4" w:tentative="1">
+      <w:start w:val="1"/>
+      <w:numFmt w:val="bullet"/>
+      <w:lvlText w:val=""/>
+      <w:lvlJc w:val="left"/>
+      <w:pPr>
+        <w:tabs>
+          <w:tab w:val="num" w:pos="3600"/>
+        </w:tabs>
+        <w:ind w:left="3600" w:hanging="360"/>
+      </w:pPr>
+      <w:rPr>
+        <w:rFonts w:ascii="Wingdings" w:hAnsi="Wingdings" w:hint="default"/>
+        <w:sz w:val="20"/>
+      </w:rPr>
+    </w:lvl>
+    <w:lvl w:ilvl="5" w:tentative="1">
+      <w:start w:val="1"/>
+      <w:numFmt w:val="bullet"/>
+      <w:lvlText w:val=""/>
+      <w:lvlJc w:val="left"/>
+      <w:pPr>
+        <w:tabs>
+          <w:tab w:val="num" w:pos="4320"/>
+        </w:tabs>
+        <w:ind w:left="4320" w:hanging="360"/>
+      </w:pPr>
+      <w:rPr>
+        <w:rFonts w:ascii="Wingdings" w:hAnsi="Wingdings" w:hint="default"/>
+        <w:sz w:val="20"/>
+      </w:rPr>
+    </w:lvl>
+    <w:lvl w:ilvl="6" w:tentative="1">
+      <w:start w:val="1"/>
+      <w:numFmt w:val="bullet"/>
+      <w:lvlText w:val=""/>
+      <w:lvlJc w:val="left"/>
+      <w:pPr>
+        <w:tabs>
+          <w:tab w:val="num" w:pos="5040"/>
+        </w:tabs>
+        <w:ind w:left="5040" w:hanging="360"/>
+      </w:pPr>
+      <w:rPr>
+        <w:rFonts w:ascii="Wingdings" w:hAnsi="Wingdings" w:hint="default"/>
+        <w:sz w:val="20"/>
+      </w:rPr>
+    </w:lvl>
+    <w:lvl w:ilvl="7" w:tentative="1">
+      <w:start w:val="1"/>
+      <w:numFmt w:val="bullet"/>
+      <w:lvlText w:val=""/>
+      <w:lvlJc w:val="left"/>
+      <w:pPr>
+        <w:tabs>
+          <w:tab w:val="num" w:pos="5760"/>
+        </w:tabs>
+        <w:ind w:left="5760" w:hanging="360"/>
+      </w:pPr>
+      <w:rPr>
+        <w:rFonts w:ascii="Wingdings" w:hAnsi="Wingdings" w:hint="default"/>
+        <w:sz w:val="20"/>
+      </w:rPr>
+    </w:lvl>
+    <w:lvl w:ilvl="8" w:tentative="1">
+      <w:start w:val="1"/>
+      <w:numFmt w:val="bullet"/>
+      <w:lvlText w:val=""/>
+      <w:lvlJc w:val="left"/>
+      <w:pPr>
+        <w:tabs>
+          <w:tab w:val="num" w:pos="6480"/>
+        </w:tabs>
+        <w:ind w:left="6480" w:hanging="360"/>
+      </w:pPr>
+      <w:rPr>
+        <w:rFonts w:ascii="Wingdings" w:hAnsi="Wingdings" w:hint="default"/>
+        <w:sz w:val="20"/>
+      </w:rPr>
+    </w:lvl>
+  </w:abstractNum>
+  <w:abstractNum w:abstractNumId="34" w15:restartNumberingAfterBreak="0">
+    <w:nsid w:val="5BC6064E"/>
+    <w:multiLevelType w:val="multilevel"/>
+    <w:tmpl w:val="196A46F6"/>
+    <w:lvl w:ilvl="0">
+      <w:start w:val="1"/>
+      <w:numFmt w:val="bullet"/>
+      <w:lvlText w:val=""/>
+      <w:lvlJc w:val="left"/>
+      <w:pPr>
+        <w:tabs>
+          <w:tab w:val="num" w:pos="720"/>
+        </w:tabs>
+        <w:ind w:left="720" w:hanging="360"/>
+      </w:pPr>
+      <w:rPr>
+        <w:rFonts w:ascii="Symbol" w:hAnsi="Symbol" w:hint="default"/>
+        <w:sz w:val="20"/>
+      </w:rPr>
+    </w:lvl>
+    <w:lvl w:ilvl="1" w:tentative="1">
+      <w:start w:val="1"/>
+      <w:numFmt w:val="bullet"/>
+      <w:lvlText w:val="o"/>
+      <w:lvlJc w:val="left"/>
+      <w:pPr>
+        <w:tabs>
+          <w:tab w:val="num" w:pos="1440"/>
+        </w:tabs>
+        <w:ind w:left="1440" w:hanging="360"/>
+      </w:pPr>
+      <w:rPr>
+        <w:rFonts w:ascii="Courier New" w:hAnsi="Courier New" w:hint="default"/>
+        <w:sz w:val="20"/>
+      </w:rPr>
+    </w:lvl>
+    <w:lvl w:ilvl="2" w:tentative="1">
+      <w:start w:val="1"/>
+      <w:numFmt w:val="bullet"/>
+      <w:lvlText w:val=""/>
+      <w:lvlJc w:val="left"/>
+      <w:pPr>
+        <w:tabs>
+          <w:tab w:val="num" w:pos="2160"/>
+        </w:tabs>
+        <w:ind w:left="2160" w:hanging="360"/>
+      </w:pPr>
+      <w:rPr>
+        <w:rFonts w:ascii="Wingdings" w:hAnsi="Wingdings" w:hint="default"/>
+        <w:sz w:val="20"/>
+      </w:rPr>
+    </w:lvl>
+    <w:lvl w:ilvl="3" w:tentative="1">
+      <w:start w:val="1"/>
+      <w:numFmt w:val="bullet"/>
+      <w:lvlText w:val=""/>
+      <w:lvlJc w:val="left"/>
+      <w:pPr>
+        <w:tabs>
+          <w:tab w:val="num" w:pos="2880"/>
+        </w:tabs>
+        <w:ind w:left="2880" w:hanging="360"/>
+      </w:pPr>
+      <w:rPr>
+        <w:rFonts w:ascii="Wingdings" w:hAnsi="Wingdings" w:hint="default"/>
+        <w:sz w:val="20"/>
+      </w:rPr>
+    </w:lvl>
+    <w:lvl w:ilvl="4" w:tentative="1">
+      <w:start w:val="1"/>
+      <w:numFmt w:val="bullet"/>
+      <w:lvlText w:val=""/>
+      <w:lvlJc w:val="left"/>
+      <w:pPr>
+        <w:tabs>
+          <w:tab w:val="num" w:pos="3600"/>
+        </w:tabs>
+        <w:ind w:left="3600" w:hanging="360"/>
+      </w:pPr>
+      <w:rPr>
+        <w:rFonts w:ascii="Wingdings" w:hAnsi="Wingdings" w:hint="default"/>
+        <w:sz w:val="20"/>
+      </w:rPr>
+    </w:lvl>
+    <w:lvl w:ilvl="5" w:tentative="1">
+      <w:start w:val="1"/>
+      <w:numFmt w:val="bullet"/>
+      <w:lvlText w:val=""/>
+      <w:lvlJc w:val="left"/>
+      <w:pPr>
+        <w:tabs>
+          <w:tab w:val="num" w:pos="4320"/>
+        </w:tabs>
+        <w:ind w:left="4320" w:hanging="360"/>
+      </w:pPr>
+      <w:rPr>
+        <w:rFonts w:ascii="Wingdings" w:hAnsi="Wingdings" w:hint="default"/>
+        <w:sz w:val="20"/>
+      </w:rPr>
+    </w:lvl>
+    <w:lvl w:ilvl="6" w:tentative="1">
+      <w:start w:val="1"/>
+      <w:numFmt w:val="bullet"/>
+      <w:lvlText w:val=""/>
+      <w:lvlJc w:val="left"/>
+      <w:pPr>
+        <w:tabs>
+          <w:tab w:val="num" w:pos="5040"/>
+        </w:tabs>
+        <w:ind w:left="5040" w:hanging="360"/>
+      </w:pPr>
+      <w:rPr>
+        <w:rFonts w:ascii="Wingdings" w:hAnsi="Wingdings" w:hint="default"/>
+        <w:sz w:val="20"/>
+      </w:rPr>
+    </w:lvl>
+    <w:lvl w:ilvl="7" w:tentative="1">
+      <w:start w:val="1"/>
+      <w:numFmt w:val="bullet"/>
+      <w:lvlText w:val=""/>
+      <w:lvlJc w:val="left"/>
+      <w:pPr>
+        <w:tabs>
+          <w:tab w:val="num" w:pos="5760"/>
+        </w:tabs>
+        <w:ind w:left="5760" w:hanging="360"/>
+      </w:pPr>
+      <w:rPr>
+        <w:rFonts w:ascii="Wingdings" w:hAnsi="Wingdings" w:hint="default"/>
+        <w:sz w:val="20"/>
+      </w:rPr>
+    </w:lvl>
+    <w:lvl w:ilvl="8" w:tentative="1">
+      <w:start w:val="1"/>
+      <w:numFmt w:val="bullet"/>
+      <w:lvlText w:val=""/>
+      <w:lvlJc w:val="left"/>
+      <w:pPr>
+        <w:tabs>
+          <w:tab w:val="num" w:pos="6480"/>
+        </w:tabs>
+        <w:ind w:left="6480" w:hanging="360"/>
+      </w:pPr>
+      <w:rPr>
+        <w:rFonts w:ascii="Wingdings" w:hAnsi="Wingdings" w:hint="default"/>
+        <w:sz w:val="20"/>
+      </w:rPr>
+    </w:lvl>
+  </w:abstractNum>
+  <w:abstractNum w:abstractNumId="35" w15:restartNumberingAfterBreak="0">
     <w:nsid w:val="5E9D0AB3"/>
     <w:multiLevelType w:val="multilevel"/>
     <w:tmpl w:val="4E7A1B34"/>
@@ -10755,7 +13225,7 @@
       </w:rPr>
     </w:lvl>
   </w:abstractNum>
-  <w:abstractNum w:abstractNumId="28" w15:restartNumberingAfterBreak="0">
+  <w:abstractNum w:abstractNumId="36" w15:restartNumberingAfterBreak="0">
     <w:nsid w:val="5F0105B4"/>
     <w:multiLevelType w:val="multilevel"/>
     <w:tmpl w:val="07080532"/>
@@ -10904,7 +13374,7 @@
       </w:rPr>
     </w:lvl>
   </w:abstractNum>
-  <w:abstractNum w:abstractNumId="29" w15:restartNumberingAfterBreak="0">
+  <w:abstractNum w:abstractNumId="37" w15:restartNumberingAfterBreak="0">
     <w:nsid w:val="60DA5859"/>
     <w:multiLevelType w:val="multilevel"/>
     <w:tmpl w:val="2394289A"/>
@@ -11053,7 +13523,7 @@
       </w:rPr>
     </w:lvl>
   </w:abstractNum>
-  <w:abstractNum w:abstractNumId="30" w15:restartNumberingAfterBreak="0">
+  <w:abstractNum w:abstractNumId="38" w15:restartNumberingAfterBreak="0">
     <w:nsid w:val="63B8580B"/>
     <w:multiLevelType w:val="hybridMultilevel"/>
     <w:tmpl w:val="D8AE475E"/>
@@ -11166,7 +13636,7 @@
       </w:rPr>
     </w:lvl>
   </w:abstractNum>
-  <w:abstractNum w:abstractNumId="31" w15:restartNumberingAfterBreak="0">
+  <w:abstractNum w:abstractNumId="39" w15:restartNumberingAfterBreak="0">
     <w:nsid w:val="678D671D"/>
     <w:multiLevelType w:val="multilevel"/>
     <w:tmpl w:val="42A886D4"/>
@@ -11315,7 +13785,7 @@
       </w:rPr>
     </w:lvl>
   </w:abstractNum>
-  <w:abstractNum w:abstractNumId="32" w15:restartNumberingAfterBreak="0">
+  <w:abstractNum w:abstractNumId="40" w15:restartNumberingAfterBreak="0">
     <w:nsid w:val="6E493141"/>
     <w:multiLevelType w:val="multilevel"/>
     <w:tmpl w:val="8904D7B2"/>
@@ -11464,7 +13934,305 @@
       </w:rPr>
     </w:lvl>
   </w:abstractNum>
-  <w:abstractNum w:abstractNumId="33" w15:restartNumberingAfterBreak="0">
+  <w:abstractNum w:abstractNumId="41" w15:restartNumberingAfterBreak="0">
+    <w:nsid w:val="728E6FD9"/>
+    <w:multiLevelType w:val="multilevel"/>
+    <w:tmpl w:val="6E58AC2C"/>
+    <w:lvl w:ilvl="0">
+      <w:start w:val="1"/>
+      <w:numFmt w:val="bullet"/>
+      <w:lvlText w:val=""/>
+      <w:lvlJc w:val="left"/>
+      <w:pPr>
+        <w:tabs>
+          <w:tab w:val="num" w:pos="720"/>
+        </w:tabs>
+        <w:ind w:left="720" w:hanging="360"/>
+      </w:pPr>
+      <w:rPr>
+        <w:rFonts w:ascii="Symbol" w:hAnsi="Symbol" w:hint="default"/>
+        <w:sz w:val="20"/>
+      </w:rPr>
+    </w:lvl>
+    <w:lvl w:ilvl="1" w:tentative="1">
+      <w:start w:val="1"/>
+      <w:numFmt w:val="bullet"/>
+      <w:lvlText w:val="o"/>
+      <w:lvlJc w:val="left"/>
+      <w:pPr>
+        <w:tabs>
+          <w:tab w:val="num" w:pos="1440"/>
+        </w:tabs>
+        <w:ind w:left="1440" w:hanging="360"/>
+      </w:pPr>
+      <w:rPr>
+        <w:rFonts w:ascii="Courier New" w:hAnsi="Courier New" w:hint="default"/>
+        <w:sz w:val="20"/>
+      </w:rPr>
+    </w:lvl>
+    <w:lvl w:ilvl="2" w:tentative="1">
+      <w:start w:val="1"/>
+      <w:numFmt w:val="bullet"/>
+      <w:lvlText w:val=""/>
+      <w:lvlJc w:val="left"/>
+      <w:pPr>
+        <w:tabs>
+          <w:tab w:val="num" w:pos="2160"/>
+        </w:tabs>
+        <w:ind w:left="2160" w:hanging="360"/>
+      </w:pPr>
+      <w:rPr>
+        <w:rFonts w:ascii="Wingdings" w:hAnsi="Wingdings" w:hint="default"/>
+        <w:sz w:val="20"/>
+      </w:rPr>
+    </w:lvl>
+    <w:lvl w:ilvl="3" w:tentative="1">
+      <w:start w:val="1"/>
+      <w:numFmt w:val="bullet"/>
+      <w:lvlText w:val=""/>
+      <w:lvlJc w:val="left"/>
+      <w:pPr>
+        <w:tabs>
+          <w:tab w:val="num" w:pos="2880"/>
+        </w:tabs>
+        <w:ind w:left="2880" w:hanging="360"/>
+      </w:pPr>
+      <w:rPr>
+        <w:rFonts w:ascii="Wingdings" w:hAnsi="Wingdings" w:hint="default"/>
+        <w:sz w:val="20"/>
+      </w:rPr>
+    </w:lvl>
+    <w:lvl w:ilvl="4" w:tentative="1">
+      <w:start w:val="1"/>
+      <w:numFmt w:val="bullet"/>
+      <w:lvlText w:val=""/>
+      <w:lvlJc w:val="left"/>
+      <w:pPr>
+        <w:tabs>
+          <w:tab w:val="num" w:pos="3600"/>
+        </w:tabs>
+        <w:ind w:left="3600" w:hanging="360"/>
+      </w:pPr>
+      <w:rPr>
+        <w:rFonts w:ascii="Wingdings" w:hAnsi="Wingdings" w:hint="default"/>
+        <w:sz w:val="20"/>
+      </w:rPr>
+    </w:lvl>
+    <w:lvl w:ilvl="5" w:tentative="1">
+      <w:start w:val="1"/>
+      <w:numFmt w:val="bullet"/>
+      <w:lvlText w:val=""/>
+      <w:lvlJc w:val="left"/>
+      <w:pPr>
+        <w:tabs>
+          <w:tab w:val="num" w:pos="4320"/>
+        </w:tabs>
+        <w:ind w:left="4320" w:hanging="360"/>
+      </w:pPr>
+      <w:rPr>
+        <w:rFonts w:ascii="Wingdings" w:hAnsi="Wingdings" w:hint="default"/>
+        <w:sz w:val="20"/>
+      </w:rPr>
+    </w:lvl>
+    <w:lvl w:ilvl="6" w:tentative="1">
+      <w:start w:val="1"/>
+      <w:numFmt w:val="bullet"/>
+      <w:lvlText w:val=""/>
+      <w:lvlJc w:val="left"/>
+      <w:pPr>
+        <w:tabs>
+          <w:tab w:val="num" w:pos="5040"/>
+        </w:tabs>
+        <w:ind w:left="5040" w:hanging="360"/>
+      </w:pPr>
+      <w:rPr>
+        <w:rFonts w:ascii="Wingdings" w:hAnsi="Wingdings" w:hint="default"/>
+        <w:sz w:val="20"/>
+      </w:rPr>
+    </w:lvl>
+    <w:lvl w:ilvl="7" w:tentative="1">
+      <w:start w:val="1"/>
+      <w:numFmt w:val="bullet"/>
+      <w:lvlText w:val=""/>
+      <w:lvlJc w:val="left"/>
+      <w:pPr>
+        <w:tabs>
+          <w:tab w:val="num" w:pos="5760"/>
+        </w:tabs>
+        <w:ind w:left="5760" w:hanging="360"/>
+      </w:pPr>
+      <w:rPr>
+        <w:rFonts w:ascii="Wingdings" w:hAnsi="Wingdings" w:hint="default"/>
+        <w:sz w:val="20"/>
+      </w:rPr>
+    </w:lvl>
+    <w:lvl w:ilvl="8" w:tentative="1">
+      <w:start w:val="1"/>
+      <w:numFmt w:val="bullet"/>
+      <w:lvlText w:val=""/>
+      <w:lvlJc w:val="left"/>
+      <w:pPr>
+        <w:tabs>
+          <w:tab w:val="num" w:pos="6480"/>
+        </w:tabs>
+        <w:ind w:left="6480" w:hanging="360"/>
+      </w:pPr>
+      <w:rPr>
+        <w:rFonts w:ascii="Wingdings" w:hAnsi="Wingdings" w:hint="default"/>
+        <w:sz w:val="20"/>
+      </w:rPr>
+    </w:lvl>
+  </w:abstractNum>
+  <w:abstractNum w:abstractNumId="42" w15:restartNumberingAfterBreak="0">
+    <w:nsid w:val="74A82E56"/>
+    <w:multiLevelType w:val="multilevel"/>
+    <w:tmpl w:val="B4FA86EA"/>
+    <w:lvl w:ilvl="0">
+      <w:start w:val="1"/>
+      <w:numFmt w:val="bullet"/>
+      <w:lvlText w:val=""/>
+      <w:lvlJc w:val="left"/>
+      <w:pPr>
+        <w:tabs>
+          <w:tab w:val="num" w:pos="720"/>
+        </w:tabs>
+        <w:ind w:left="720" w:hanging="360"/>
+      </w:pPr>
+      <w:rPr>
+        <w:rFonts w:ascii="Symbol" w:hAnsi="Symbol" w:hint="default"/>
+        <w:sz w:val="20"/>
+      </w:rPr>
+    </w:lvl>
+    <w:lvl w:ilvl="1" w:tentative="1">
+      <w:start w:val="1"/>
+      <w:numFmt w:val="bullet"/>
+      <w:lvlText w:val="o"/>
+      <w:lvlJc w:val="left"/>
+      <w:pPr>
+        <w:tabs>
+          <w:tab w:val="num" w:pos="1440"/>
+        </w:tabs>
+        <w:ind w:left="1440" w:hanging="360"/>
+      </w:pPr>
+      <w:rPr>
+        <w:rFonts w:ascii="Courier New" w:hAnsi="Courier New" w:hint="default"/>
+        <w:sz w:val="20"/>
+      </w:rPr>
+    </w:lvl>
+    <w:lvl w:ilvl="2" w:tentative="1">
+      <w:start w:val="1"/>
+      <w:numFmt w:val="bullet"/>
+      <w:lvlText w:val=""/>
+      <w:lvlJc w:val="left"/>
+      <w:pPr>
+        <w:tabs>
+          <w:tab w:val="num" w:pos="2160"/>
+        </w:tabs>
+        <w:ind w:left="2160" w:hanging="360"/>
+      </w:pPr>
+      <w:rPr>
+        <w:rFonts w:ascii="Wingdings" w:hAnsi="Wingdings" w:hint="default"/>
+        <w:sz w:val="20"/>
+      </w:rPr>
+    </w:lvl>
+    <w:lvl w:ilvl="3" w:tentative="1">
+      <w:start w:val="1"/>
+      <w:numFmt w:val="bullet"/>
+      <w:lvlText w:val=""/>
+      <w:lvlJc w:val="left"/>
+      <w:pPr>
+        <w:tabs>
+          <w:tab w:val="num" w:pos="2880"/>
+        </w:tabs>
+        <w:ind w:left="2880" w:hanging="360"/>
+      </w:pPr>
+      <w:rPr>
+        <w:rFonts w:ascii="Wingdings" w:hAnsi="Wingdings" w:hint="default"/>
+        <w:sz w:val="20"/>
+      </w:rPr>
+    </w:lvl>
+    <w:lvl w:ilvl="4" w:tentative="1">
+      <w:start w:val="1"/>
+      <w:numFmt w:val="bullet"/>
+      <w:lvlText w:val=""/>
+      <w:lvlJc w:val="left"/>
+      <w:pPr>
+        <w:tabs>
+          <w:tab w:val="num" w:pos="3600"/>
+        </w:tabs>
+        <w:ind w:left="3600" w:hanging="360"/>
+      </w:pPr>
+      <w:rPr>
+        <w:rFonts w:ascii="Wingdings" w:hAnsi="Wingdings" w:hint="default"/>
+        <w:sz w:val="20"/>
+      </w:rPr>
+    </w:lvl>
+    <w:lvl w:ilvl="5" w:tentative="1">
+      <w:start w:val="1"/>
+      <w:numFmt w:val="bullet"/>
+      <w:lvlText w:val=""/>
+      <w:lvlJc w:val="left"/>
+      <w:pPr>
+        <w:tabs>
+          <w:tab w:val="num" w:pos="4320"/>
+        </w:tabs>
+        <w:ind w:left="4320" w:hanging="360"/>
+      </w:pPr>
+      <w:rPr>
+        <w:rFonts w:ascii="Wingdings" w:hAnsi="Wingdings" w:hint="default"/>
+        <w:sz w:val="20"/>
+      </w:rPr>
+    </w:lvl>
+    <w:lvl w:ilvl="6" w:tentative="1">
+      <w:start w:val="1"/>
+      <w:numFmt w:val="bullet"/>
+      <w:lvlText w:val=""/>
+      <w:lvlJc w:val="left"/>
+      <w:pPr>
+        <w:tabs>
+          <w:tab w:val="num" w:pos="5040"/>
+        </w:tabs>
+        <w:ind w:left="5040" w:hanging="360"/>
+      </w:pPr>
+      <w:rPr>
+        <w:rFonts w:ascii="Wingdings" w:hAnsi="Wingdings" w:hint="default"/>
+        <w:sz w:val="20"/>
+      </w:rPr>
+    </w:lvl>
+    <w:lvl w:ilvl="7" w:tentative="1">
+      <w:start w:val="1"/>
+      <w:numFmt w:val="bullet"/>
+      <w:lvlText w:val=""/>
+      <w:lvlJc w:val="left"/>
+      <w:pPr>
+        <w:tabs>
+          <w:tab w:val="num" w:pos="5760"/>
+        </w:tabs>
+        <w:ind w:left="5760" w:hanging="360"/>
+      </w:pPr>
+      <w:rPr>
+        <w:rFonts w:ascii="Wingdings" w:hAnsi="Wingdings" w:hint="default"/>
+        <w:sz w:val="20"/>
+      </w:rPr>
+    </w:lvl>
+    <w:lvl w:ilvl="8" w:tentative="1">
+      <w:start w:val="1"/>
+      <w:numFmt w:val="bullet"/>
+      <w:lvlText w:val=""/>
+      <w:lvlJc w:val="left"/>
+      <w:pPr>
+        <w:tabs>
+          <w:tab w:val="num" w:pos="6480"/>
+        </w:tabs>
+        <w:ind w:left="6480" w:hanging="360"/>
+      </w:pPr>
+      <w:rPr>
+        <w:rFonts w:ascii="Wingdings" w:hAnsi="Wingdings" w:hint="default"/>
+        <w:sz w:val="20"/>
+      </w:rPr>
+    </w:lvl>
+  </w:abstractNum>
+  <w:abstractNum w:abstractNumId="43" w15:restartNumberingAfterBreak="0">
     <w:nsid w:val="78CD150C"/>
     <w:multiLevelType w:val="multilevel"/>
     <w:tmpl w:val="5172EE82"/>
@@ -11613,7 +14381,7 @@
       </w:rPr>
     </w:lvl>
   </w:abstractNum>
-  <w:abstractNum w:abstractNumId="34" w15:restartNumberingAfterBreak="0">
+  <w:abstractNum w:abstractNumId="44" w15:restartNumberingAfterBreak="0">
     <w:nsid w:val="79FA448B"/>
     <w:multiLevelType w:val="hybridMultilevel"/>
     <w:tmpl w:val="C7FC9E44"/>
@@ -11699,7 +14467,7 @@
       </w:pPr>
     </w:lvl>
   </w:abstractNum>
-  <w:abstractNum w:abstractNumId="35" w15:restartNumberingAfterBreak="0">
+  <w:abstractNum w:abstractNumId="45" w15:restartNumberingAfterBreak="0">
     <w:nsid w:val="7CE0601C"/>
     <w:multiLevelType w:val="multilevel"/>
     <w:tmpl w:val="AD6816DC"/>
@@ -11848,7 +14616,7 @@
       </w:rPr>
     </w:lvl>
   </w:abstractNum>
-  <w:abstractNum w:abstractNumId="36" w15:restartNumberingAfterBreak="0">
+  <w:abstractNum w:abstractNumId="46" w15:restartNumberingAfterBreak="0">
     <w:nsid w:val="7E7229F2"/>
     <w:multiLevelType w:val="multilevel"/>
     <w:tmpl w:val="E1BEBE9A"/>
@@ -11997,107 +14765,256 @@
       </w:rPr>
     </w:lvl>
   </w:abstractNum>
+  <w:abstractNum w:abstractNumId="47" w15:restartNumberingAfterBreak="0">
+    <w:nsid w:val="7E7C35A7"/>
+    <w:multiLevelType w:val="multilevel"/>
+    <w:tmpl w:val="F7CCF912"/>
+    <w:lvl w:ilvl="0">
+      <w:start w:val="1"/>
+      <w:numFmt w:val="bullet"/>
+      <w:lvlText w:val=""/>
+      <w:lvlJc w:val="left"/>
+      <w:pPr>
+        <w:tabs>
+          <w:tab w:val="num" w:pos="720"/>
+        </w:tabs>
+        <w:ind w:left="720" w:hanging="360"/>
+      </w:pPr>
+      <w:rPr>
+        <w:rFonts w:ascii="Symbol" w:hAnsi="Symbol" w:hint="default"/>
+        <w:sz w:val="20"/>
+      </w:rPr>
+    </w:lvl>
+    <w:lvl w:ilvl="1" w:tentative="1">
+      <w:start w:val="1"/>
+      <w:numFmt w:val="bullet"/>
+      <w:lvlText w:val="o"/>
+      <w:lvlJc w:val="left"/>
+      <w:pPr>
+        <w:tabs>
+          <w:tab w:val="num" w:pos="1440"/>
+        </w:tabs>
+        <w:ind w:left="1440" w:hanging="360"/>
+      </w:pPr>
+      <w:rPr>
+        <w:rFonts w:ascii="Courier New" w:hAnsi="Courier New" w:hint="default"/>
+        <w:sz w:val="20"/>
+      </w:rPr>
+    </w:lvl>
+    <w:lvl w:ilvl="2" w:tentative="1">
+      <w:start w:val="1"/>
+      <w:numFmt w:val="bullet"/>
+      <w:lvlText w:val=""/>
+      <w:lvlJc w:val="left"/>
+      <w:pPr>
+        <w:tabs>
+          <w:tab w:val="num" w:pos="2160"/>
+        </w:tabs>
+        <w:ind w:left="2160" w:hanging="360"/>
+      </w:pPr>
+      <w:rPr>
+        <w:rFonts w:ascii="Wingdings" w:hAnsi="Wingdings" w:hint="default"/>
+        <w:sz w:val="20"/>
+      </w:rPr>
+    </w:lvl>
+    <w:lvl w:ilvl="3" w:tentative="1">
+      <w:start w:val="1"/>
+      <w:numFmt w:val="bullet"/>
+      <w:lvlText w:val=""/>
+      <w:lvlJc w:val="left"/>
+      <w:pPr>
+        <w:tabs>
+          <w:tab w:val="num" w:pos="2880"/>
+        </w:tabs>
+        <w:ind w:left="2880" w:hanging="360"/>
+      </w:pPr>
+      <w:rPr>
+        <w:rFonts w:ascii="Wingdings" w:hAnsi="Wingdings" w:hint="default"/>
+        <w:sz w:val="20"/>
+      </w:rPr>
+    </w:lvl>
+    <w:lvl w:ilvl="4" w:tentative="1">
+      <w:start w:val="1"/>
+      <w:numFmt w:val="bullet"/>
+      <w:lvlText w:val=""/>
+      <w:lvlJc w:val="left"/>
+      <w:pPr>
+        <w:tabs>
+          <w:tab w:val="num" w:pos="3600"/>
+        </w:tabs>
+        <w:ind w:left="3600" w:hanging="360"/>
+      </w:pPr>
+      <w:rPr>
+        <w:rFonts w:ascii="Wingdings" w:hAnsi="Wingdings" w:hint="default"/>
+        <w:sz w:val="20"/>
+      </w:rPr>
+    </w:lvl>
+    <w:lvl w:ilvl="5" w:tentative="1">
+      <w:start w:val="1"/>
+      <w:numFmt w:val="bullet"/>
+      <w:lvlText w:val=""/>
+      <w:lvlJc w:val="left"/>
+      <w:pPr>
+        <w:tabs>
+          <w:tab w:val="num" w:pos="4320"/>
+        </w:tabs>
+        <w:ind w:left="4320" w:hanging="360"/>
+      </w:pPr>
+      <w:rPr>
+        <w:rFonts w:ascii="Wingdings" w:hAnsi="Wingdings" w:hint="default"/>
+        <w:sz w:val="20"/>
+      </w:rPr>
+    </w:lvl>
+    <w:lvl w:ilvl="6" w:tentative="1">
+      <w:start w:val="1"/>
+      <w:numFmt w:val="bullet"/>
+      <w:lvlText w:val=""/>
+      <w:lvlJc w:val="left"/>
+      <w:pPr>
+        <w:tabs>
+          <w:tab w:val="num" w:pos="5040"/>
+        </w:tabs>
+        <w:ind w:left="5040" w:hanging="360"/>
+      </w:pPr>
+      <w:rPr>
+        <w:rFonts w:ascii="Wingdings" w:hAnsi="Wingdings" w:hint="default"/>
+        <w:sz w:val="20"/>
+      </w:rPr>
+    </w:lvl>
+    <w:lvl w:ilvl="7" w:tentative="1">
+      <w:start w:val="1"/>
+      <w:numFmt w:val="bullet"/>
+      <w:lvlText w:val=""/>
+      <w:lvlJc w:val="left"/>
+      <w:pPr>
+        <w:tabs>
+          <w:tab w:val="num" w:pos="5760"/>
+        </w:tabs>
+        <w:ind w:left="5760" w:hanging="360"/>
+      </w:pPr>
+      <w:rPr>
+        <w:rFonts w:ascii="Wingdings" w:hAnsi="Wingdings" w:hint="default"/>
+        <w:sz w:val="20"/>
+      </w:rPr>
+    </w:lvl>
+    <w:lvl w:ilvl="8" w:tentative="1">
+      <w:start w:val="1"/>
+      <w:numFmt w:val="bullet"/>
+      <w:lvlText w:val=""/>
+      <w:lvlJc w:val="left"/>
+      <w:pPr>
+        <w:tabs>
+          <w:tab w:val="num" w:pos="6480"/>
+        </w:tabs>
+        <w:ind w:left="6480" w:hanging="360"/>
+      </w:pPr>
+      <w:rPr>
+        <w:rFonts w:ascii="Wingdings" w:hAnsi="Wingdings" w:hint="default"/>
+        <w:sz w:val="20"/>
+      </w:rPr>
+    </w:lvl>
+  </w:abstractNum>
   <w:num w:numId="1" w16cid:durableId="1912082903">
-    <w:abstractNumId w:val="29"/>
+    <w:abstractNumId w:val="37"/>
   </w:num>
   <w:num w:numId="2" w16cid:durableId="1967613957">
+    <w:abstractNumId w:val="38"/>
+  </w:num>
+  <w:num w:numId="3" w16cid:durableId="2136824951">
+    <w:abstractNumId w:val="27"/>
+  </w:num>
+  <w:num w:numId="4" w16cid:durableId="503055371">
+    <w:abstractNumId w:val="12"/>
+  </w:num>
+  <w:num w:numId="5" w16cid:durableId="527372012">
     <w:abstractNumId w:val="30"/>
   </w:num>
-  <w:num w:numId="3" w16cid:durableId="2136824951">
-    <w:abstractNumId w:val="22"/>
-  </w:num>
-  <w:num w:numId="4" w16cid:durableId="503055371">
-    <w:abstractNumId w:val="10"/>
-  </w:num>
-  <w:num w:numId="5" w16cid:durableId="527372012">
-    <w:abstractNumId w:val="24"/>
-  </w:num>
   <w:num w:numId="6" w16cid:durableId="2117405750">
-    <w:abstractNumId w:val="5"/>
+    <w:abstractNumId w:val="7"/>
   </w:num>
   <w:num w:numId="7" w16cid:durableId="1326712469">
-    <w:abstractNumId w:val="12"/>
+    <w:abstractNumId w:val="14"/>
   </w:num>
   <w:num w:numId="8" w16cid:durableId="1214078119">
-    <w:abstractNumId w:val="9"/>
+    <w:abstractNumId w:val="11"/>
   </w:num>
   <w:num w:numId="9" w16cid:durableId="426393119">
-    <w:abstractNumId w:val="18"/>
+    <w:abstractNumId w:val="20"/>
   </w:num>
   <w:num w:numId="10" w16cid:durableId="1544710818">
-    <w:abstractNumId w:val="28"/>
+    <w:abstractNumId w:val="36"/>
   </w:num>
   <w:num w:numId="11" w16cid:durableId="885071025">
-    <w:abstractNumId w:val="6"/>
+    <w:abstractNumId w:val="8"/>
   </w:num>
   <w:num w:numId="12" w16cid:durableId="119956559">
-    <w:abstractNumId w:val="31"/>
+    <w:abstractNumId w:val="39"/>
   </w:num>
   <w:num w:numId="13" w16cid:durableId="822770162">
-    <w:abstractNumId w:val="35"/>
+    <w:abstractNumId w:val="45"/>
   </w:num>
   <w:num w:numId="14" w16cid:durableId="1658344284">
     <w:abstractNumId w:val="3"/>
   </w:num>
   <w:num w:numId="15" w16cid:durableId="1688673129">
+    <w:abstractNumId w:val="23"/>
+  </w:num>
+  <w:num w:numId="16" w16cid:durableId="1971982197">
+    <w:abstractNumId w:val="18"/>
+  </w:num>
+  <w:num w:numId="17" w16cid:durableId="277375314">
+    <w:abstractNumId w:val="17"/>
+  </w:num>
+  <w:num w:numId="18" w16cid:durableId="659968514">
+    <w:abstractNumId w:val="15"/>
+  </w:num>
+  <w:num w:numId="19" w16cid:durableId="1449012400">
+    <w:abstractNumId w:val="26"/>
+  </w:num>
+  <w:num w:numId="20" w16cid:durableId="1395205377">
+    <w:abstractNumId w:val="9"/>
+  </w:num>
+  <w:num w:numId="21" w16cid:durableId="221066696">
+    <w:abstractNumId w:val="35"/>
+  </w:num>
+  <w:num w:numId="22" w16cid:durableId="181360465">
+    <w:abstractNumId w:val="44"/>
+  </w:num>
+  <w:num w:numId="23" w16cid:durableId="1163280346">
     <w:abstractNumId w:val="19"/>
   </w:num>
-  <w:num w:numId="16" w16cid:durableId="1971982197">
-    <w:abstractNumId w:val="16"/>
-  </w:num>
-  <w:num w:numId="17" w16cid:durableId="277375314">
-    <w:abstractNumId w:val="15"/>
-  </w:num>
-  <w:num w:numId="18" w16cid:durableId="659968514">
-    <w:abstractNumId w:val="13"/>
-  </w:num>
-  <w:num w:numId="19" w16cid:durableId="1449012400">
-    <w:abstractNumId w:val="21"/>
-  </w:num>
-  <w:num w:numId="20" w16cid:durableId="1395205377">
-    <w:abstractNumId w:val="7"/>
-  </w:num>
-  <w:num w:numId="21" w16cid:durableId="221066696">
-    <w:abstractNumId w:val="27"/>
-  </w:num>
-  <w:num w:numId="22" w16cid:durableId="181360465">
-    <w:abstractNumId w:val="34"/>
-  </w:num>
-  <w:num w:numId="23" w16cid:durableId="1163280346">
-    <w:abstractNumId w:val="17"/>
-  </w:num>
   <w:num w:numId="24" w16cid:durableId="135338183">
-    <w:abstractNumId w:val="26"/>
+    <w:abstractNumId w:val="32"/>
   </w:num>
   <w:num w:numId="25" w16cid:durableId="919753086">
     <w:abstractNumId w:val="2"/>
   </w:num>
   <w:num w:numId="26" w16cid:durableId="1260141111">
-    <w:abstractNumId w:val="23"/>
+    <w:abstractNumId w:val="29"/>
   </w:num>
   <w:num w:numId="27" w16cid:durableId="142476967">
-    <w:abstractNumId w:val="25"/>
+    <w:abstractNumId w:val="31"/>
   </w:num>
   <w:num w:numId="28" w16cid:durableId="1038821728">
-    <w:abstractNumId w:val="32"/>
+    <w:abstractNumId w:val="40"/>
   </w:num>
   <w:num w:numId="29" w16cid:durableId="561134564">
-    <w:abstractNumId w:val="11"/>
+    <w:abstractNumId w:val="13"/>
   </w:num>
   <w:num w:numId="30" w16cid:durableId="663241235">
-    <w:abstractNumId w:val="20"/>
+    <w:abstractNumId w:val="25"/>
   </w:num>
   <w:num w:numId="31" w16cid:durableId="2062824366">
     <w:abstractNumId w:val="0"/>
   </w:num>
   <w:num w:numId="32" w16cid:durableId="2099859432">
-    <w:abstractNumId w:val="8"/>
+    <w:abstractNumId w:val="10"/>
   </w:num>
   <w:num w:numId="33" w16cid:durableId="726950297">
-    <w:abstractNumId w:val="14"/>
+    <w:abstractNumId w:val="16"/>
   </w:num>
   <w:num w:numId="34" w16cid:durableId="1453553782">
-    <w:abstractNumId w:val="36"/>
+    <w:abstractNumId w:val="46"/>
   </w:num>
   <w:num w:numId="35" w16cid:durableId="1953122144">
     <w:abstractNumId w:val="4"/>
@@ -12106,7 +15023,40 @@
     <w:abstractNumId w:val="1"/>
   </w:num>
   <w:num w:numId="37" w16cid:durableId="950865576">
+    <w:abstractNumId w:val="43"/>
+  </w:num>
+  <w:num w:numId="38" w16cid:durableId="474222460">
+    <w:abstractNumId w:val="6"/>
+  </w:num>
+  <w:num w:numId="39" w16cid:durableId="1645815532">
+    <w:abstractNumId w:val="21"/>
+  </w:num>
+  <w:num w:numId="40" w16cid:durableId="1314529702">
     <w:abstractNumId w:val="33"/>
+  </w:num>
+  <w:num w:numId="41" w16cid:durableId="1349524197">
+    <w:abstractNumId w:val="5"/>
+  </w:num>
+  <w:num w:numId="42" w16cid:durableId="504784691">
+    <w:abstractNumId w:val="42"/>
+  </w:num>
+  <w:num w:numId="43" w16cid:durableId="1903130648">
+    <w:abstractNumId w:val="34"/>
+  </w:num>
+  <w:num w:numId="44" w16cid:durableId="1876696441">
+    <w:abstractNumId w:val="47"/>
+  </w:num>
+  <w:num w:numId="45" w16cid:durableId="1142230718">
+    <w:abstractNumId w:val="28"/>
+  </w:num>
+  <w:num w:numId="46" w16cid:durableId="462386475">
+    <w:abstractNumId w:val="22"/>
+  </w:num>
+  <w:num w:numId="47" w16cid:durableId="334769791">
+    <w:abstractNumId w:val="24"/>
+  </w:num>
+  <w:num w:numId="48" w16cid:durableId="1561674174">
+    <w:abstractNumId w:val="41"/>
   </w:num>
   <w:numIdMacAtCleanup w:val="28"/>
 </w:numbering>
@@ -12713,7 +15663,6 @@
   <w:style w:type="character" w:default="1" w:styleId="DefaultParagraphFont">
     <w:name w:val="Default Paragraph Font"/>
     <w:uiPriority w:val="1"/>
-    <w:semiHidden/>
     <w:unhideWhenUsed/>
   </w:style>
   <w:style w:type="table" w:default="1" w:styleId="TableNormal">

</xml_diff>

<commit_message>
Now that I'm getting good data from the IMU, remove all the code that took the linear acceleration and integrated it to get an x, z position that I could graph and use to visualize the gesture.
Add the code to send the data needed for ML training:
    g.timestamp_us,          // timestamp is relative to gesture start (first sample has timestamp 0)
    g.ax, g.ay, g.az,        // ax, ay, az are linear acceleration (sensor frame, gravity removed by BNO08x), m/s^2
    g.gx, g.gy, g.gz,        // gx, gy, gz are gyroscope (sensor frame, calibrated by BNO08x), rad/s
    g.qw, g.qx, g.qy, g.qz   // qw, qx, qy, qz are the fused game rotation vector quaternion components (game rotation vector / fused orientation)
</commit_message>
<xml_diff>
--- a/docs/🪄 Magic Wand Maker Project.docx
+++ b/docs/🪄 Magic Wand Maker Project.docx
@@ -24,10 +24,147 @@
         <w:pStyle w:val="Heading1"/>
       </w:pPr>
       <w:r>
+        <w:t>Software</w:t>
+      </w:r>
+    </w:p>
+    <w:p>
+      <w:pPr>
+        <w:pStyle w:val="ListParagraph"/>
+        <w:numPr>
+          <w:ilvl w:val="0"/>
+          <w:numId w:val="49"/>
+        </w:numPr>
+      </w:pPr>
+      <w:r>
+        <w:t xml:space="preserve">What is the best sampling rate for </w:t>
+      </w:r>
+      <w:r>
+        <w:t>gestures that are 1-3 seconds in length</w:t>
+      </w:r>
+      <w:r>
+        <w:t>;</w:t>
+      </w:r>
+    </w:p>
+    <w:p>
+      <w:pPr>
+        <w:pStyle w:val="ListParagraph"/>
+        <w:numPr>
+          <w:ilvl w:val="0"/>
+          <w:numId w:val="49"/>
+        </w:numPr>
+      </w:pPr>
+      <w:r>
+        <w:t>What is the best inference window size to use for gestures that are 1-3 seconds in length</w:t>
+      </w:r>
+      <w:r>
+        <w:t xml:space="preserve"> with a 200 hz sampling rate</w:t>
+      </w:r>
+      <w:r>
+        <w:t xml:space="preserve">? </w:t>
+      </w:r>
+    </w:p>
+    <w:p>
+      <w:pPr>
+        <w:pStyle w:val="ListParagraph"/>
+        <w:numPr>
+          <w:ilvl w:val="0"/>
+          <w:numId w:val="49"/>
+        </w:numPr>
+      </w:pPr>
+      <w:r>
+        <w:t>Should each gesture only contain the motion or will I get better recognition if I include some samples of ‘stillness’ at the beginning and ending of the gesture?</w:t>
+      </w:r>
+    </w:p>
+    <w:p>
+      <w:pPr>
+        <w:pStyle w:val="ListParagraph"/>
+        <w:numPr>
+          <w:ilvl w:val="0"/>
+          <w:numId w:val="49"/>
+        </w:numPr>
+      </w:pPr>
+      <w:r>
+        <w:t>Do I need to include the time relative to the gesture start of is the fact that all gestures are normalized to the same window size and timeframes mean this has no value?</w:t>
+      </w:r>
+    </w:p>
+    <w:p>
+      <w:pPr>
+        <w:pStyle w:val="ListParagraph"/>
+        <w:numPr>
+          <w:ilvl w:val="0"/>
+          <w:numId w:val="49"/>
+        </w:numPr>
+      </w:pPr>
+      <w:r>
+        <w:t>Are there values other than the timestamp, liner acceleration, calibrated gyroscope, and rotation vector quaternion that will help get better recognition?</w:t>
+      </w:r>
+    </w:p>
+    <w:p>
+      <w:pPr>
+        <w:pStyle w:val="ListParagraph"/>
+        <w:numPr>
+          <w:ilvl w:val="0"/>
+          <w:numId w:val="49"/>
+        </w:numPr>
+      </w:pPr>
+      <w:r>
+        <w:t>Am I better off normalizing the gesture in my capture application or later in TensorFlow Lite or Edge Impulse? Why?</w:t>
+      </w:r>
+    </w:p>
+    <w:p>
+      <w:pPr>
+        <w:pStyle w:val="ListParagraph"/>
+        <w:numPr>
+          <w:ilvl w:val="0"/>
+          <w:numId w:val="49"/>
+        </w:numPr>
+      </w:pPr>
+      <w:r>
+        <w:t>What type of normalization should be done so that I get good recognition no matter how fast or slow, large or small, wand orientation agnostic, the gestures are performed?</w:t>
+      </w:r>
+    </w:p>
+    <w:p>
+      <w:pPr>
+        <w:pStyle w:val="ListParagraph"/>
+        <w:numPr>
+          <w:ilvl w:val="0"/>
+          <w:numId w:val="49"/>
+        </w:numPr>
+      </w:pPr>
+      <w:r>
+        <w:t>What is the type of inference network best for m</w:t>
+      </w:r>
+      <w:r>
+        <w:t>git add -uasdfasdfasdf</w:t>
+      </w:r>
+      <w:r>
+        <w:t xml:space="preserve">y needs? </w:t>
+      </w:r>
+    </w:p>
+    <w:p>
+      <w:pPr>
+        <w:pStyle w:val="ListParagraph"/>
+        <w:numPr>
+          <w:ilvl w:val="0"/>
+          <w:numId w:val="49"/>
+        </w:numPr>
+      </w:pPr>
+      <w:r>
+        <w:t>How do I set that up in Edge Impulse? TensorFlow?</w:t>
+      </w:r>
+    </w:p>
+    <w:p>
+      <w:pPr>
+        <w:pStyle w:val="Heading1"/>
+      </w:pPr>
+      <w:r>
         <w:t>Hardware:</w:t>
       </w:r>
     </w:p>
     <w:p>
+      <w:pPr>
+        <w:pStyle w:val="Heading2"/>
+      </w:pPr>
       <w:r>
         <w:t>Hosyond ESP32S3</w:t>
       </w:r>
@@ -178,6 +315,7 @@
               </w:numPr>
             </w:pPr>
             <w:r>
+              <w:lastRenderedPageBreak/>
               <w:t>8MB QSPI Flash</w:t>
             </w:r>
           </w:p>
@@ -246,6 +384,7 @@
               </w:numPr>
             </w:pPr>
             <w:r>
+              <w:lastRenderedPageBreak/>
               <w:t>LiPo Battery Charging</w:t>
             </w:r>
           </w:p>
@@ -279,6 +418,7 @@
               </w:numPr>
             </w:pPr>
             <w:r>
+              <w:lastRenderedPageBreak/>
               <w:t>USB Serial JTAG support</w:t>
             </w:r>
           </w:p>
@@ -337,122 +477,30 @@
       <w:pPr>
         <w:pStyle w:val="Heading2"/>
       </w:pPr>
+      <w:r>
+        <w:lastRenderedPageBreak/>
+        <w:t>BNO08x IMU</w:t>
+      </w:r>
+    </w:p>
+    <w:p>
+      <w:r>
+        <w:t>Use the Game Rotation Vector to rotate linear acceleration to world frame. Use linear acceleration for gesture capture and motion detection.</w:t>
+      </w:r>
+    </w:p>
+    <w:p/>
+    <w:p>
+      <w:r>
+        <w:t>My smoothed_motion_energy calculations have proven to be a better indication of starting/stopping a gesture. The transition to ‘motion’ is similar but the transition to ‘stable’ takes several seconds of inactivity. I do like the transition to ‘On_TABLE’ and it could be used to go into low power mode.</w:t>
+      </w:r>
+    </w:p>
+    <w:p>
+      <w:pPr>
+        <w:pStyle w:val="Heading2"/>
+        <w:tabs>
+          <w:tab w:val="left" w:pos="9405"/>
+        </w:tabs>
+      </w:pPr>
       <w:hyperlink r:id="rId6" w:history="1">
-        <w:r>
-          <w:rPr>
-            <w:rStyle w:val="Hyperlink"/>
-          </w:rPr>
-          <w:t>ICM-42688-P | TDK InvenSense</w:t>
-        </w:r>
-      </w:hyperlink>
-    </w:p>
-    <w:p>
-      <w:pPr>
-        <w:pStyle w:val="ListParagraph"/>
-        <w:numPr>
-          <w:ilvl w:val="0"/>
-          <w:numId w:val="25"/>
-        </w:numPr>
-      </w:pPr>
-      <w:r>
-        <w:t>This one is the best. Really this time… - Copilot</w:t>
-      </w:r>
-    </w:p>
-    <w:p>
-      <w:pPr>
-        <w:pStyle w:val="ListParagraph"/>
-        <w:numPr>
-          <w:ilvl w:val="0"/>
-          <w:numId w:val="25"/>
-        </w:numPr>
-      </w:pPr>
-      <w:r>
-        <w:t>Software stack</w:t>
-      </w:r>
-      <w:r>
-        <w:t xml:space="preserve"> </w:t>
-      </w:r>
-      <w:r>
-        <w:t>on the ESP32</w:t>
-      </w:r>
-    </w:p>
-    <w:p>
-      <w:pPr>
-        <w:pStyle w:val="ListParagraph"/>
-        <w:numPr>
-          <w:ilvl w:val="1"/>
-          <w:numId w:val="25"/>
-        </w:numPr>
-      </w:pPr>
-      <w:r>
-        <w:t>Run Madgwick</w:t>
-      </w:r>
-      <w:r>
-        <w:rPr>
-          <w:strike/>
-        </w:rPr>
-        <w:t>/Mahony</w:t>
-      </w:r>
-      <w:r>
-        <w:t xml:space="preserve"> sensor fusion</w:t>
-      </w:r>
-    </w:p>
-    <w:p>
-      <w:pPr>
-        <w:pStyle w:val="ListParagraph"/>
-        <w:numPr>
-          <w:ilvl w:val="1"/>
-          <w:numId w:val="25"/>
-        </w:numPr>
-      </w:pPr>
-      <w:r>
-        <w:t>Quaternion output</w:t>
-      </w:r>
-    </w:p>
-    <w:p>
-      <w:pPr>
-        <w:pStyle w:val="ListParagraph"/>
-        <w:numPr>
-          <w:ilvl w:val="1"/>
-          <w:numId w:val="25"/>
-        </w:numPr>
-      </w:pPr>
-      <w:r>
-        <w:t>Gravity vector output</w:t>
-      </w:r>
-    </w:p>
-    <w:p>
-      <w:pPr>
-        <w:pStyle w:val="ListParagraph"/>
-        <w:numPr>
-          <w:ilvl w:val="1"/>
-          <w:numId w:val="25"/>
-        </w:numPr>
-      </w:pPr>
-      <w:r>
-        <w:t>World frame gravity vector</w:t>
-      </w:r>
-    </w:p>
-    <w:p>
-      <w:pPr>
-        <w:pStyle w:val="ListParagraph"/>
-        <w:numPr>
-          <w:ilvl w:val="1"/>
-          <w:numId w:val="25"/>
-        </w:numPr>
-      </w:pPr>
-      <w:r>
-        <w:t>Orientation independent gestures</w:t>
-      </w:r>
-    </w:p>
-    <w:p>
-      <w:pPr>
-        <w:pStyle w:val="Heading2"/>
-        <w:tabs>
-          <w:tab w:val="left" w:pos="9405"/>
-        </w:tabs>
-      </w:pPr>
-      <w:hyperlink r:id="rId7" w:history="1">
         <w:r>
           <w:rPr>
             <w:rStyle w:val="Hyperlink"/>
@@ -465,7 +513,7 @@
       <w:pPr>
         <w:pStyle w:val="Heading2"/>
       </w:pPr>
-      <w:hyperlink r:id="rId8" w:history="1">
+      <w:hyperlink r:id="rId7" w:history="1">
         <w:r>
           <w:rPr>
             <w:rStyle w:val="Hyperlink"/>
@@ -566,231 +614,367 @@
       <w:r>
         <w:t xml:space="preserve"> </w:t>
       </w:r>
+      <w:hyperlink r:id="rId8" w:history="1">
+        <w:r>
+          <w:rPr>
+            <w:rStyle w:val="Hyperlink"/>
+          </w:rPr>
+          <w:t>myles-parfeniuk.github.io</w:t>
+        </w:r>
+      </w:hyperlink>
+      <w:r>
+        <w:t xml:space="preserve"> </w:t>
+      </w:r>
+      <w:r>
+        <w:br/>
+        <w:t xml:space="preserve">This is the </w:t>
+      </w:r>
+      <w:r>
+        <w:rPr>
+          <w:b/>
+          <w:bCs/>
+        </w:rPr>
+        <w:t>#1 most important</w:t>
+      </w:r>
+      <w:r>
+        <w:t xml:space="preserve"> report for your wand.</w:t>
+      </w:r>
+    </w:p>
+    <w:p>
+      <w:pPr>
+        <w:rPr>
+          <w:b/>
+          <w:bCs/>
+        </w:rPr>
+      </w:pPr>
+      <w:r>
+        <w:rPr>
+          <w:b/>
+          <w:bCs/>
+        </w:rPr>
+        <w:t>What it gives you</w:t>
+      </w:r>
+    </w:p>
+    <w:p>
+      <w:pPr>
+        <w:numPr>
+          <w:ilvl w:val="0"/>
+          <w:numId w:val="38"/>
+        </w:numPr>
+      </w:pPr>
+      <w:r>
+        <w:t xml:space="preserve">A </w:t>
+      </w:r>
+      <w:r>
+        <w:rPr>
+          <w:b/>
+          <w:bCs/>
+        </w:rPr>
+        <w:t>quaternion</w:t>
+      </w:r>
+      <w:r>
+        <w:t xml:space="preserve"> representing orientation</w:t>
+      </w:r>
+    </w:p>
+    <w:p>
+      <w:pPr>
+        <w:numPr>
+          <w:ilvl w:val="0"/>
+          <w:numId w:val="38"/>
+        </w:numPr>
+      </w:pPr>
+      <w:r>
+        <w:rPr>
+          <w:b/>
+          <w:bCs/>
+        </w:rPr>
+        <w:t>No magnetometer correction</w:t>
+      </w:r>
+    </w:p>
+    <w:p>
+      <w:pPr>
+        <w:numPr>
+          <w:ilvl w:val="0"/>
+          <w:numId w:val="38"/>
+        </w:numPr>
+      </w:pPr>
+      <w:r>
+        <w:t>Drift</w:t>
+      </w:r>
+      <w:r>
+        <w:noBreakHyphen/>
+        <w:t>free for short gestures</w:t>
+      </w:r>
+    </w:p>
+    <w:p>
+      <w:pPr>
+        <w:numPr>
+          <w:ilvl w:val="0"/>
+          <w:numId w:val="38"/>
+        </w:numPr>
+      </w:pPr>
+      <w:r>
+        <w:t>No heading jumps</w:t>
+      </w:r>
+    </w:p>
+    <w:p>
+      <w:pPr>
+        <w:numPr>
+          <w:ilvl w:val="0"/>
+          <w:numId w:val="38"/>
+        </w:numPr>
+      </w:pPr>
+      <w:r>
+        <w:t>Very stable during fast motion</w:t>
+      </w:r>
+    </w:p>
+    <w:p>
+      <w:pPr>
+        <w:rPr>
+          <w:b/>
+          <w:bCs/>
+        </w:rPr>
+      </w:pPr>
+      <w:r>
+        <w:rPr>
+          <w:b/>
+          <w:bCs/>
+        </w:rPr>
+        <w:t>Why it’s ideal for a wand</w:t>
+      </w:r>
+    </w:p>
+    <w:p>
+      <w:pPr>
+        <w:numPr>
+          <w:ilvl w:val="0"/>
+          <w:numId w:val="39"/>
+        </w:numPr>
+      </w:pPr>
+      <w:r>
+        <w:t>You don’t care about absolute north</w:t>
+      </w:r>
+    </w:p>
+    <w:p>
+      <w:pPr>
+        <w:numPr>
+          <w:ilvl w:val="0"/>
+          <w:numId w:val="39"/>
+        </w:numPr>
+      </w:pPr>
+      <w:r>
+        <w:t xml:space="preserve">You </w:t>
+      </w:r>
+      <w:r>
+        <w:rPr>
+          <w:i/>
+          <w:iCs/>
+        </w:rPr>
+        <w:t>do</w:t>
+      </w:r>
+      <w:r>
+        <w:t xml:space="preserve"> care about smooth, drift</w:t>
+      </w:r>
+      <w:r>
+        <w:noBreakHyphen/>
+        <w:t>free orientation</w:t>
+      </w:r>
+    </w:p>
+    <w:p>
+      <w:pPr>
+        <w:numPr>
+          <w:ilvl w:val="0"/>
+          <w:numId w:val="39"/>
+        </w:numPr>
+      </w:pPr>
+      <w:r>
+        <w:t>You want consistent gesture shapes</w:t>
+      </w:r>
+    </w:p>
+    <w:p>
+      <w:pPr>
+        <w:numPr>
+          <w:ilvl w:val="0"/>
+          <w:numId w:val="39"/>
+        </w:numPr>
+      </w:pPr>
+      <w:r>
+        <w:lastRenderedPageBreak/>
+        <w:t>You want no sudden yaw jumps from magnetometer recalibration</w:t>
+      </w:r>
+    </w:p>
+    <w:p>
+      <w:r>
+        <w:t>This is the orientation stream you should feed into your gesture segmentation + ML pipeline.</w:t>
+      </w:r>
+    </w:p>
+    <w:p>
+      <w:pPr>
+        <w:pStyle w:val="Heading4"/>
+      </w:pPr>
+      <w:r>
+        <w:t>Gravity Vector</w:t>
+      </w:r>
+      <w:r>
+        <w:t xml:space="preserve"> (unused)</w:t>
+      </w:r>
+    </w:p>
+    <w:p>
+      <w:r>
+        <w:t xml:space="preserve">Class: </w:t>
+      </w:r>
+      <w:r>
+        <w:rPr>
+          <w:b/>
+          <w:bCs/>
+        </w:rPr>
+        <w:t>BNO08xRptGravity</w:t>
+      </w:r>
+      <w:r>
+        <w:t xml:space="preserve"> </w:t>
+      </w:r>
       <w:hyperlink r:id="rId9" w:history="1">
         <w:r>
           <w:rPr>
             <w:rStyle w:val="Hyperlink"/>
           </w:rPr>
-          <w:t>myles-parfeniuk.git</w:t>
-        </w:r>
-        <w:r>
-          <w:rPr>
-            <w:rStyle w:val="Hyperlink"/>
-          </w:rPr>
-          <w:t>h</w:t>
-        </w:r>
-        <w:r>
-          <w:rPr>
-            <w:rStyle w:val="Hyperlink"/>
-          </w:rPr>
-          <w:t>ub.io</w:t>
+          <w:t>myles-parfeniuk.github.io</w:t>
         </w:r>
       </w:hyperlink>
-      <w:r>
-        <w:t xml:space="preserve"> </w:t>
-      </w:r>
-      <w:r>
-        <w:br/>
-        <w:t xml:space="preserve">This is the </w:t>
-      </w:r>
-      <w:r>
+    </w:p>
+    <w:p>
+      <w:pPr>
         <w:rPr>
           <w:b/>
           <w:bCs/>
         </w:rPr>
-        <w:t>#1 most important</w:t>
-      </w:r>
-      <w:r>
-        <w:t xml:space="preserve"> report for your wand.</w:t>
-      </w:r>
-    </w:p>
-    <w:p>
-      <w:pPr>
+      </w:pPr>
+      <w:r>
         <w:rPr>
           <w:b/>
           <w:bCs/>
         </w:rPr>
-      </w:pPr>
-      <w:r>
+        <w:t>What it gives you</w:t>
+      </w:r>
+    </w:p>
+    <w:p>
+      <w:pPr>
+        <w:numPr>
+          <w:ilvl w:val="0"/>
+          <w:numId w:val="40"/>
+        </w:numPr>
+      </w:pPr>
+      <w:r>
+        <w:t>A 3</w:t>
+      </w:r>
+      <w:r>
+        <w:noBreakHyphen/>
+        <w:t>axis vector representing gravity in device coordinates</w:t>
+      </w:r>
+    </w:p>
+    <w:p>
+      <w:pPr>
+        <w:numPr>
+          <w:ilvl w:val="0"/>
+          <w:numId w:val="40"/>
+        </w:numPr>
+      </w:pPr>
+      <w:r>
+        <w:t>Fully fused and stable</w:t>
+      </w:r>
+    </w:p>
+    <w:p>
+      <w:pPr>
+        <w:numPr>
+          <w:ilvl w:val="0"/>
+          <w:numId w:val="40"/>
+        </w:numPr>
+      </w:pPr>
+      <w:r>
+        <w:t>No need to compute gravity yourself</w:t>
+      </w:r>
+    </w:p>
+    <w:p>
+      <w:pPr>
         <w:rPr>
           <w:b/>
           <w:bCs/>
         </w:rPr>
-        <w:t>What it gives you</w:t>
-      </w:r>
-    </w:p>
-    <w:p>
-      <w:pPr>
-        <w:numPr>
-          <w:ilvl w:val="0"/>
-          <w:numId w:val="38"/>
-        </w:numPr>
-      </w:pPr>
-      <w:r>
-        <w:t xml:space="preserve">A </w:t>
-      </w:r>
+      </w:pPr>
       <w:r>
         <w:rPr>
           <w:b/>
           <w:bCs/>
         </w:rPr>
-        <w:t>quaternion</w:t>
-      </w:r>
-      <w:r>
-        <w:t xml:space="preserve"> representing orientation</w:t>
-      </w:r>
-    </w:p>
-    <w:p>
-      <w:pPr>
-        <w:numPr>
-          <w:ilvl w:val="0"/>
-          <w:numId w:val="38"/>
-        </w:numPr>
-      </w:pPr>
+        <w:t>Why it matters</w:t>
+      </w:r>
+    </w:p>
+    <w:p>
+      <w:pPr>
+        <w:numPr>
+          <w:ilvl w:val="0"/>
+          <w:numId w:val="41"/>
+        </w:numPr>
+      </w:pPr>
+      <w:r>
+        <w:t>Lets you remove tilt effects</w:t>
+      </w:r>
+    </w:p>
+    <w:p>
+      <w:pPr>
+        <w:numPr>
+          <w:ilvl w:val="0"/>
+          <w:numId w:val="41"/>
+        </w:numPr>
+      </w:pPr>
+      <w:r>
+        <w:t>Lets you compute “tip direction”</w:t>
+      </w:r>
+    </w:p>
+    <w:p>
+      <w:pPr>
+        <w:numPr>
+          <w:ilvl w:val="0"/>
+          <w:numId w:val="41"/>
+        </w:numPr>
+      </w:pPr>
+      <w:r>
+        <w:t>Lets you detect stillness</w:t>
+      </w:r>
+    </w:p>
+    <w:p>
+      <w:pPr>
+        <w:numPr>
+          <w:ilvl w:val="0"/>
+          <w:numId w:val="41"/>
+        </w:numPr>
+      </w:pPr>
+      <w:r>
+        <w:t>Lets you normalize gestures independent of wand orientation</w:t>
+      </w:r>
+    </w:p>
+    <w:p>
+      <w:r>
+        <w:t>This replaces your entire custom gravity estimation pipeline.</w:t>
+      </w:r>
+    </w:p>
+    <w:p>
+      <w:pPr>
+        <w:pStyle w:val="Heading4"/>
+      </w:pPr>
+      <w:r>
+        <w:t>Linear Acceleration</w:t>
+      </w:r>
+    </w:p>
+    <w:p>
+      <w:r>
+        <w:t xml:space="preserve">Class: </w:t>
+      </w:r>
       <w:r>
         <w:rPr>
           <w:b/>
           <w:bCs/>
         </w:rPr>
-        <w:t>No magnetometer correction</w:t>
-      </w:r>
-    </w:p>
-    <w:p>
-      <w:pPr>
-        <w:numPr>
-          <w:ilvl w:val="0"/>
-          <w:numId w:val="38"/>
-        </w:numPr>
-      </w:pPr>
-      <w:r>
-        <w:t>Drift</w:t>
-      </w:r>
-      <w:r>
-        <w:noBreakHyphen/>
-        <w:t>free for short gestures</w:t>
-      </w:r>
-    </w:p>
-    <w:p>
-      <w:pPr>
-        <w:numPr>
-          <w:ilvl w:val="0"/>
-          <w:numId w:val="38"/>
-        </w:numPr>
-      </w:pPr>
-      <w:r>
-        <w:t>No heading jumps</w:t>
-      </w:r>
-    </w:p>
-    <w:p>
-      <w:pPr>
-        <w:numPr>
-          <w:ilvl w:val="0"/>
-          <w:numId w:val="38"/>
-        </w:numPr>
-      </w:pPr>
-      <w:r>
-        <w:t>Very stable during fast motion</w:t>
-      </w:r>
-    </w:p>
-    <w:p>
-      <w:pPr>
-        <w:rPr>
-          <w:b/>
-          <w:bCs/>
-        </w:rPr>
-      </w:pPr>
-      <w:r>
-        <w:rPr>
-          <w:b/>
-          <w:bCs/>
-        </w:rPr>
-        <w:t>Why it’s ideal for a wand</w:t>
-      </w:r>
-    </w:p>
-    <w:p>
-      <w:pPr>
-        <w:numPr>
-          <w:ilvl w:val="0"/>
-          <w:numId w:val="39"/>
-        </w:numPr>
-      </w:pPr>
-      <w:r>
-        <w:t>You don’t care about absolute north</w:t>
-      </w:r>
-    </w:p>
-    <w:p>
-      <w:pPr>
-        <w:numPr>
-          <w:ilvl w:val="0"/>
-          <w:numId w:val="39"/>
-        </w:numPr>
-      </w:pPr>
-      <w:r>
-        <w:t xml:space="preserve">You </w:t>
-      </w:r>
-      <w:r>
-        <w:rPr>
-          <w:i/>
-          <w:iCs/>
-        </w:rPr>
-        <w:t>do</w:t>
-      </w:r>
-      <w:r>
-        <w:t xml:space="preserve"> care about smooth, drift</w:t>
-      </w:r>
-      <w:r>
-        <w:noBreakHyphen/>
-        <w:t>free orientation</w:t>
-      </w:r>
-    </w:p>
-    <w:p>
-      <w:pPr>
-        <w:numPr>
-          <w:ilvl w:val="0"/>
-          <w:numId w:val="39"/>
-        </w:numPr>
-      </w:pPr>
-      <w:r>
-        <w:t>You want consistent gesture shapes</w:t>
-      </w:r>
-    </w:p>
-    <w:p>
-      <w:pPr>
-        <w:numPr>
-          <w:ilvl w:val="0"/>
-          <w:numId w:val="39"/>
-        </w:numPr>
-      </w:pPr>
-      <w:r>
-        <w:t>You want no sudden yaw jumps from magnetometer recalibration</w:t>
-      </w:r>
-    </w:p>
-    <w:p>
-      <w:r>
-        <w:t>This is the orientation stream you should feed into your gesture segmentation + ML pipeline.</w:t>
-      </w:r>
-    </w:p>
-    <w:p>
-      <w:pPr>
-        <w:pStyle w:val="Heading4"/>
-      </w:pPr>
-      <w:r>
-        <w:t>Gravity Vector</w:t>
-      </w:r>
-      <w:r>
-        <w:t xml:space="preserve"> (unused)</w:t>
-      </w:r>
-    </w:p>
-    <w:p>
-      <w:r>
-        <w:t xml:space="preserve">Class: </w:t>
-      </w:r>
-      <w:r>
-        <w:rPr>
-          <w:b/>
-          <w:bCs/>
-        </w:rPr>
-        <w:t>BNO08xRptGravity</w:t>
+        <w:t>BNO08xRptLinearAcceleration</w:t>
       </w:r>
       <w:r>
         <w:t xml:space="preserve"> </w:t>
@@ -800,19 +984,7 @@
           <w:rPr>
             <w:rStyle w:val="Hyperlink"/>
           </w:rPr>
-          <w:t>myles-parfeniuk.gith</w:t>
-        </w:r>
-        <w:r>
-          <w:rPr>
-            <w:rStyle w:val="Hyperlink"/>
-          </w:rPr>
-          <w:t>u</w:t>
-        </w:r>
-        <w:r>
-          <w:rPr>
-            <w:rStyle w:val="Hyperlink"/>
-          </w:rPr>
-          <w:t>b.io</w:t>
+          <w:t>myles-parfeniuk.github.io</w:t>
         </w:r>
       </w:hyperlink>
     </w:p>
@@ -835,125 +1007,150 @@
       <w:pPr>
         <w:numPr>
           <w:ilvl w:val="0"/>
-          <w:numId w:val="40"/>
-        </w:numPr>
-      </w:pPr>
-      <w:r>
-        <w:t>A 3</w:t>
-      </w:r>
-      <w:r>
-        <w:noBreakHyphen/>
-        <w:t>axis vector representing gravity in device coordinates</w:t>
-      </w:r>
-    </w:p>
-    <w:p>
-      <w:pPr>
-        <w:numPr>
-          <w:ilvl w:val="0"/>
-          <w:numId w:val="40"/>
-        </w:numPr>
-      </w:pPr>
-      <w:r>
-        <w:t>Fully fused and stable</w:t>
-      </w:r>
-    </w:p>
-    <w:p>
-      <w:pPr>
-        <w:numPr>
-          <w:ilvl w:val="0"/>
-          <w:numId w:val="40"/>
-        </w:numPr>
-      </w:pPr>
-      <w:r>
-        <w:t>No need to compute gravity yourself</w:t>
-      </w:r>
-    </w:p>
-    <w:p>
-      <w:pPr>
+          <w:numId w:val="42"/>
+        </w:numPr>
+      </w:pPr>
+      <w:r>
+        <w:t xml:space="preserve">Acceleration </w:t>
+      </w:r>
+      <w:r>
         <w:rPr>
           <w:b/>
           <w:bCs/>
         </w:rPr>
-      </w:pPr>
-      <w:r>
+        <w:t>minus gravity</w:t>
+      </w:r>
+    </w:p>
+    <w:p>
+      <w:pPr>
+        <w:numPr>
+          <w:ilvl w:val="0"/>
+          <w:numId w:val="42"/>
+        </w:numPr>
+      </w:pPr>
+      <w:r>
+        <w:t>Clean, drift</w:t>
+      </w:r>
+      <w:r>
+        <w:noBreakHyphen/>
+        <w:t>free motion energy</w:t>
+      </w:r>
+    </w:p>
+    <w:p>
+      <w:pPr>
+        <w:numPr>
+          <w:ilvl w:val="0"/>
+          <w:numId w:val="42"/>
+        </w:numPr>
+      </w:pPr>
+      <w:r>
+        <w:t>Perfect for gesture segmentation</w:t>
+      </w:r>
+    </w:p>
+    <w:p>
+      <w:pPr>
         <w:rPr>
           <w:b/>
           <w:bCs/>
         </w:rPr>
-        <w:t>Why it matters</w:t>
-      </w:r>
-    </w:p>
-    <w:p>
-      <w:pPr>
-        <w:numPr>
-          <w:ilvl w:val="0"/>
-          <w:numId w:val="41"/>
-        </w:numPr>
-      </w:pPr>
-      <w:r>
-        <w:t>Lets you remove tilt effects</w:t>
-      </w:r>
-    </w:p>
-    <w:p>
-      <w:pPr>
-        <w:numPr>
-          <w:ilvl w:val="0"/>
-          <w:numId w:val="41"/>
-        </w:numPr>
-      </w:pPr>
-      <w:r>
-        <w:t>Lets you compute “tip direction”</w:t>
-      </w:r>
-    </w:p>
-    <w:p>
-      <w:pPr>
-        <w:numPr>
-          <w:ilvl w:val="0"/>
-          <w:numId w:val="41"/>
-        </w:numPr>
-      </w:pPr>
-      <w:r>
-        <w:t>Lets you detect stillness</w:t>
-      </w:r>
-    </w:p>
-    <w:p>
-      <w:pPr>
-        <w:numPr>
-          <w:ilvl w:val="0"/>
-          <w:numId w:val="41"/>
-        </w:numPr>
-      </w:pPr>
-      <w:r>
-        <w:t>Lets you normalize gestures independent of wand orientation</w:t>
-      </w:r>
-    </w:p>
-    <w:p>
-      <w:r>
-        <w:lastRenderedPageBreak/>
-        <w:t>This replaces your entire custom gravity estimation pipeline.</w:t>
-      </w:r>
-    </w:p>
-    <w:p>
-      <w:pPr>
-        <w:pStyle w:val="Heading4"/>
-      </w:pPr>
-      <w:r>
-        <w:t>Linear Acceleration</w:t>
-      </w:r>
-    </w:p>
-    <w:p>
-      <w:r>
-        <w:t xml:space="preserve">Class: </w:t>
-      </w:r>
+      </w:pPr>
       <w:r>
         <w:rPr>
           <w:b/>
           <w:bCs/>
         </w:rPr>
-        <w:t>BNO08xRptLinearAcceleration</w:t>
-      </w:r>
-      <w:r>
-        <w:t xml:space="preserve"> </w:t>
+        <w:t>Why it matters</w:t>
+      </w:r>
+    </w:p>
+    <w:p>
+      <w:pPr>
+        <w:numPr>
+          <w:ilvl w:val="0"/>
+          <w:numId w:val="43"/>
+        </w:numPr>
+      </w:pPr>
+      <w:r>
+        <w:t>You no longer need to subtract gravity</w:t>
+      </w:r>
+    </w:p>
+    <w:p>
+      <w:pPr>
+        <w:numPr>
+          <w:ilvl w:val="0"/>
+          <w:numId w:val="43"/>
+        </w:numPr>
+      </w:pPr>
+      <w:r>
+        <w:t>You get clean “motion bursts” for spell detection</w:t>
+      </w:r>
+    </w:p>
+    <w:p>
+      <w:pPr>
+        <w:numPr>
+          <w:ilvl w:val="0"/>
+          <w:numId w:val="43"/>
+        </w:numPr>
+      </w:pPr>
+      <w:r>
+        <w:t>You can compute gesture start/stop reliably</w:t>
+      </w:r>
+    </w:p>
+    <w:p>
+      <w:r>
+        <w:t>This replaces your custom accel</w:t>
+      </w:r>
+      <w:r>
+        <w:noBreakHyphen/>
+        <w:t>integration + gravity</w:t>
+      </w:r>
+      <w:r>
+        <w:noBreakHyphen/>
+        <w:t>removal logic.</w:t>
+      </w:r>
+    </w:p>
+    <w:p>
+      <w:r>
+        <w:pict w14:anchorId="0916D0DA">
+          <v:rect id="_x0000_i1025" style="width:0;height:1.5pt" o:hralign="center" o:hrstd="t" o:hr="t" fillcolor="#a0a0a0" stroked="f"/>
+        </w:pict>
+      </w:r>
+    </w:p>
+    <w:p>
+      <w:pPr>
+        <w:rPr>
+          <w:b/>
+          <w:bCs/>
+        </w:rPr>
+      </w:pPr>
+      <w:r>
+        <w:rPr>
+          <w:rFonts w:ascii="Segoe UI Emoji" w:hAnsi="Segoe UI Emoji" w:cs="Segoe UI Emoji"/>
+          <w:b/>
+          <w:bCs/>
+        </w:rPr>
+        <w:t>🧘</w:t>
+      </w:r>
+      <w:r>
+        <w:rPr>
+          <w:b/>
+          <w:bCs/>
+        </w:rPr>
+        <w:t xml:space="preserve"> 4. Stability Classifier</w:t>
+      </w:r>
+    </w:p>
+    <w:p>
+      <w:r>
+        <w:t xml:space="preserve">Class: </w:t>
+      </w:r>
+      <w:r>
+        <w:rPr>
+          <w:b/>
+          <w:bCs/>
+        </w:rPr>
+        <w:t>BNO08xRptStabilityClassifier</w:t>
+      </w:r>
+      <w:r>
+        <w:t xml:space="preserve"> (in your tab) </w:t>
       </w:r>
       <w:hyperlink r:id="rId11" w:history="1">
         <w:r>
@@ -983,58 +1180,58 @@
       <w:pPr>
         <w:numPr>
           <w:ilvl w:val="0"/>
-          <w:numId w:val="42"/>
-        </w:numPr>
-      </w:pPr>
-      <w:r>
-        <w:t xml:space="preserve">Acceleration </w:t>
-      </w:r>
-      <w:r>
+          <w:numId w:val="44"/>
+        </w:numPr>
+      </w:pPr>
+      <w:r>
+        <w:t>STABLE</w:t>
+      </w:r>
+    </w:p>
+    <w:p>
+      <w:pPr>
+        <w:numPr>
+          <w:ilvl w:val="0"/>
+          <w:numId w:val="44"/>
+        </w:numPr>
+      </w:pPr>
+      <w:r>
+        <w:t>REST</w:t>
+      </w:r>
+    </w:p>
+    <w:p>
+      <w:pPr>
+        <w:numPr>
+          <w:ilvl w:val="0"/>
+          <w:numId w:val="44"/>
+        </w:numPr>
+      </w:pPr>
+      <w:r>
+        <w:t>MOTION</w:t>
+      </w:r>
+    </w:p>
+    <w:p>
+      <w:pPr>
+        <w:numPr>
+          <w:ilvl w:val="0"/>
+          <w:numId w:val="44"/>
+        </w:numPr>
+      </w:pPr>
+      <w:r>
+        <w:t>ERROR</w:t>
+      </w:r>
+    </w:p>
+    <w:p>
+      <w:pPr>
         <w:rPr>
           <w:b/>
           <w:bCs/>
         </w:rPr>
-        <w:t>minus gravity</w:t>
-      </w:r>
-    </w:p>
-    <w:p>
-      <w:pPr>
-        <w:numPr>
-          <w:ilvl w:val="0"/>
-          <w:numId w:val="42"/>
-        </w:numPr>
-      </w:pPr>
-      <w:r>
-        <w:t>Clean, drift</w:t>
-      </w:r>
-      <w:r>
-        <w:noBreakHyphen/>
-        <w:t>free motion energy</w:t>
-      </w:r>
-    </w:p>
-    <w:p>
-      <w:pPr>
-        <w:numPr>
-          <w:ilvl w:val="0"/>
-          <w:numId w:val="42"/>
-        </w:numPr>
-      </w:pPr>
-      <w:r>
-        <w:t>Perfect for gesture segmentation</w:t>
-      </w:r>
-    </w:p>
-    <w:p>
-      <w:pPr>
+      </w:pPr>
+      <w:r>
         <w:rPr>
           <w:b/>
           <w:bCs/>
         </w:rPr>
-      </w:pPr>
-      <w:r>
-        <w:rPr>
-          <w:b/>
-          <w:bCs/>
-        </w:rPr>
         <w:t>Why it matters</w:t>
       </w:r>
     </w:p>
@@ -1042,52 +1239,44 @@
       <w:pPr>
         <w:numPr>
           <w:ilvl w:val="0"/>
-          <w:numId w:val="43"/>
-        </w:numPr>
-      </w:pPr>
-      <w:r>
-        <w:t>You no longer need to subtract gravity</w:t>
-      </w:r>
-    </w:p>
-    <w:p>
-      <w:pPr>
-        <w:numPr>
-          <w:ilvl w:val="0"/>
-          <w:numId w:val="43"/>
-        </w:numPr>
-      </w:pPr>
-      <w:r>
-        <w:t>You get clean “motion bursts” for spell detection</w:t>
-      </w:r>
-    </w:p>
-    <w:p>
-      <w:pPr>
-        <w:numPr>
-          <w:ilvl w:val="0"/>
-          <w:numId w:val="43"/>
-        </w:numPr>
-      </w:pPr>
-      <w:r>
-        <w:t>You can compute gesture start/stop reliably</w:t>
-      </w:r>
-    </w:p>
-    <w:p>
-      <w:r>
-        <w:t>This replaces your custom accel</w:t>
-      </w:r>
-      <w:r>
-        <w:noBreakHyphen/>
-        <w:t>integration + gravity</w:t>
-      </w:r>
-      <w:r>
-        <w:noBreakHyphen/>
-        <w:t>removal logic.</w:t>
-      </w:r>
-    </w:p>
-    <w:p>
-      <w:r>
-        <w:pict w14:anchorId="0916D0DA">
-          <v:rect id="_x0000_i1025" style="width:0;height:1.5pt" o:hralign="center" o:hrstd="t" o:hr="t" fillcolor="#a0a0a0" stroked="f"/>
+          <w:numId w:val="45"/>
+        </w:numPr>
+      </w:pPr>
+      <w:r>
+        <w:t>Perfect for “gesture start” and “gesture end”</w:t>
+      </w:r>
+    </w:p>
+    <w:p>
+      <w:pPr>
+        <w:numPr>
+          <w:ilvl w:val="0"/>
+          <w:numId w:val="45"/>
+        </w:numPr>
+      </w:pPr>
+      <w:r>
+        <w:t>Lets you gate ML inference</w:t>
+      </w:r>
+    </w:p>
+    <w:p>
+      <w:pPr>
+        <w:numPr>
+          <w:ilvl w:val="0"/>
+          <w:numId w:val="45"/>
+        </w:numPr>
+      </w:pPr>
+      <w:r>
+        <w:t>Lets you detect “wand is still” without thresholds</w:t>
+      </w:r>
+    </w:p>
+    <w:p>
+      <w:r>
+        <w:t>This replaces your stillness detector.</w:t>
+      </w:r>
+    </w:p>
+    <w:p>
+      <w:r>
+        <w:pict w14:anchorId="4B56E228">
+          <v:rect id="_x0000_i1026" style="width:0;height:1.5pt" o:hralign="center" o:hrstd="t" o:hr="t" fillcolor="#a0a0a0" stroked="f"/>
         </w:pict>
       </w:r>
     </w:p>
@@ -1104,14 +1293,14 @@
           <w:b/>
           <w:bCs/>
         </w:rPr>
-        <w:t>🧘</w:t>
+        <w:t>👋</w:t>
       </w:r>
       <w:r>
         <w:rPr>
           <w:b/>
           <w:bCs/>
         </w:rPr>
-        <w:t xml:space="preserve"> 4. Stability Classifier</w:t>
+        <w:t xml:space="preserve"> 5. Shake Detector</w:t>
       </w:r>
     </w:p>
     <w:p>
@@ -1123,7 +1312,7 @@
           <w:b/>
           <w:bCs/>
         </w:rPr>
-        <w:t>BNO08xRptStabilityClassifier</w:t>
+        <w:t>BNO08xRptShakeDetector</w:t>
       </w:r>
       <w:r>
         <w:t xml:space="preserve"> (in your tab) </w:t>
@@ -1149,171 +1338,7 @@
           <w:b/>
           <w:bCs/>
         </w:rPr>
-        <w:t>What it gives you</w:t>
-      </w:r>
-    </w:p>
-    <w:p>
-      <w:pPr>
-        <w:numPr>
-          <w:ilvl w:val="0"/>
-          <w:numId w:val="44"/>
-        </w:numPr>
-      </w:pPr>
-      <w:r>
-        <w:t>STABLE</w:t>
-      </w:r>
-    </w:p>
-    <w:p>
-      <w:pPr>
-        <w:numPr>
-          <w:ilvl w:val="0"/>
-          <w:numId w:val="44"/>
-        </w:numPr>
-      </w:pPr>
-      <w:r>
-        <w:t>REST</w:t>
-      </w:r>
-    </w:p>
-    <w:p>
-      <w:pPr>
-        <w:numPr>
-          <w:ilvl w:val="0"/>
-          <w:numId w:val="44"/>
-        </w:numPr>
-      </w:pPr>
-      <w:r>
-        <w:t>MOTION</w:t>
-      </w:r>
-    </w:p>
-    <w:p>
-      <w:pPr>
-        <w:numPr>
-          <w:ilvl w:val="0"/>
-          <w:numId w:val="44"/>
-        </w:numPr>
-      </w:pPr>
-      <w:r>
-        <w:t>ERROR</w:t>
-      </w:r>
-    </w:p>
-    <w:p>
-      <w:pPr>
-        <w:rPr>
-          <w:b/>
-          <w:bCs/>
-        </w:rPr>
-      </w:pPr>
-      <w:r>
-        <w:rPr>
-          <w:b/>
-          <w:bCs/>
-        </w:rPr>
-        <w:t>Why it matters</w:t>
-      </w:r>
-    </w:p>
-    <w:p>
-      <w:pPr>
-        <w:numPr>
-          <w:ilvl w:val="0"/>
-          <w:numId w:val="45"/>
-        </w:numPr>
-      </w:pPr>
-      <w:r>
-        <w:t>Perfect for “gesture start” and “gesture end”</w:t>
-      </w:r>
-    </w:p>
-    <w:p>
-      <w:pPr>
-        <w:numPr>
-          <w:ilvl w:val="0"/>
-          <w:numId w:val="45"/>
-        </w:numPr>
-      </w:pPr>
-      <w:r>
-        <w:t>Lets you gate ML inference</w:t>
-      </w:r>
-    </w:p>
-    <w:p>
-      <w:pPr>
-        <w:numPr>
-          <w:ilvl w:val="0"/>
-          <w:numId w:val="45"/>
-        </w:numPr>
-      </w:pPr>
-      <w:r>
-        <w:t>Lets you detect “wand is still” without thresholds</w:t>
-      </w:r>
-    </w:p>
-    <w:p>
-      <w:r>
-        <w:t>This replaces your stillness detector.</w:t>
-      </w:r>
-    </w:p>
-    <w:p>
-      <w:r>
-        <w:pict w14:anchorId="4B56E228">
-          <v:rect id="_x0000_i1026" style="width:0;height:1.5pt" o:hralign="center" o:hrstd="t" o:hr="t" fillcolor="#a0a0a0" stroked="f"/>
-        </w:pict>
-      </w:r>
-    </w:p>
-    <w:p>
-      <w:pPr>
-        <w:rPr>
-          <w:b/>
-          <w:bCs/>
-        </w:rPr>
-      </w:pPr>
-      <w:r>
-        <w:rPr>
-          <w:rFonts w:ascii="Segoe UI Emoji" w:hAnsi="Segoe UI Emoji" w:cs="Segoe UI Emoji"/>
-          <w:b/>
-          <w:bCs/>
-        </w:rPr>
-        <w:t>👋</w:t>
-      </w:r>
-      <w:r>
-        <w:rPr>
-          <w:b/>
-          <w:bCs/>
-        </w:rPr>
-        <w:t xml:space="preserve"> 5. Shake Detector</w:t>
-      </w:r>
-    </w:p>
-    <w:p>
-      <w:r>
-        <w:t xml:space="preserve">Class: </w:t>
-      </w:r>
-      <w:r>
-        <w:rPr>
-          <w:b/>
-          <w:bCs/>
-        </w:rPr>
-        <w:t>BNO08xRptShakeDetector</w:t>
-      </w:r>
-      <w:r>
-        <w:t xml:space="preserve"> (in your tab) </w:t>
-      </w:r>
-      <w:hyperlink r:id="rId13" w:history="1">
-        <w:r>
-          <w:rPr>
-            <w:rStyle w:val="Hyperlink"/>
-          </w:rPr>
-          <w:t>myles-parfeniuk.github.io</w:t>
-        </w:r>
-      </w:hyperlink>
-    </w:p>
-    <w:p>
-      <w:pPr>
-        <w:rPr>
-          <w:b/>
-          <w:bCs/>
-        </w:rPr>
-      </w:pPr>
-      <w:r>
-        <w:rPr>
-          <w:b/>
-          <w:bCs/>
-        </w:rPr>
+        <w:lastRenderedPageBreak/>
         <w:t>What it gives you</w:t>
       </w:r>
     </w:p>
@@ -1577,7 +1602,6 @@
           </w:tcPr>
           <w:p>
             <w:r>
-              <w:lastRenderedPageBreak/>
               <w:t>Gesture start/stop</w:t>
             </w:r>
           </w:p>
@@ -1931,12 +1955,24 @@
           <w:numId w:val="22"/>
         </w:numPr>
       </w:pPr>
-      <w:hyperlink r:id="rId14" w:history="1">
+      <w:hyperlink r:id="rId13" w:history="1">
         <w:r>
           <w:rPr>
             <w:rStyle w:val="Hyperlink"/>
           </w:rPr>
-          <w:t>Motion recognition with anomaly detection - Edge Impulse Documentation</w:t>
+          <w:t>Motion recognition</w:t>
+        </w:r>
+        <w:r>
+          <w:rPr>
+            <w:rStyle w:val="Hyperlink"/>
+          </w:rPr>
+          <w:t xml:space="preserve"> </w:t>
+        </w:r>
+        <w:r>
+          <w:rPr>
+            <w:rStyle w:val="Hyperlink"/>
+          </w:rPr>
+          <w:t>with anomaly detection - Edge Impulse Documentation</w:t>
         </w:r>
       </w:hyperlink>
     </w:p>
@@ -1964,6 +2000,7 @@
         </w:numPr>
       </w:pPr>
       <w:r>
+        <w:lastRenderedPageBreak/>
         <w:t>Remove noise, irrelevant signals</w:t>
       </w:r>
     </w:p>
@@ -2115,7 +2152,6 @@
         <w:rPr>
           <w:rFonts w:ascii="Courier New" w:hAnsi="Courier New" w:cs="Courier New"/>
         </w:rPr>
-        <w:lastRenderedPageBreak/>
         <w:t>accel_norm = accel_g / 4.0      // ±4g range</w:t>
       </w:r>
       <w:r>
@@ -2417,6 +2453,7 @@
         </w:numPr>
       </w:pPr>
       <w:r>
+        <w:lastRenderedPageBreak/>
         <w:t>most relevant features identified and retained for model training while removing redundant or irrelevant features</w:t>
       </w:r>
     </w:p>
@@ -2443,7 +2480,7 @@
           <w:numId w:val="22"/>
         </w:numPr>
       </w:pPr>
-      <w:hyperlink r:id="rId15" w:history="1">
+      <w:hyperlink r:id="rId14" w:history="1">
         <w:r>
           <w:rPr>
             <w:rStyle w:val="Hyperlink"/>
@@ -2556,7 +2593,6 @@
         <w:pStyle w:val="Heading1"/>
       </w:pPr>
       <w:r>
-        <w:lastRenderedPageBreak/>
         <w:t>Home Assistant Integration</w:t>
       </w:r>
     </w:p>
@@ -2818,6 +2854,7 @@
           <w:b/>
           <w:bCs/>
         </w:rPr>
+        <w:lastRenderedPageBreak/>
         <w:t xml:space="preserve">The Home Assistant dashboard card </w:t>
       </w:r>
       <w:r>
@@ -2941,7 +2978,6 @@
           <w:b/>
           <w:bCs/>
         </w:rPr>
-        <w:lastRenderedPageBreak/>
         <w:t>Fully compatible with your MQTT Discovery setup</w:t>
       </w:r>
     </w:p>
@@ -2980,7 +3016,7 @@
       </w:r>
     </w:p>
     <w:p>
-      <w:hyperlink r:id="rId16" w:anchor="0" w:history="1">
+      <w:hyperlink r:id="rId15" w:anchor="0" w:history="1">
         <w:r>
           <w:rPr>
             <w:rStyle w:val="Hyperlink"/>
@@ -2990,7 +3026,7 @@
       </w:hyperlink>
     </w:p>
     <w:p>
-      <w:hyperlink r:id="rId17" w:history="1">
+      <w:hyperlink r:id="rId16" w:history="1">
         <w:r>
           <w:rPr>
             <w:rStyle w:val="Hyperlink"/>
@@ -3011,7 +3047,7 @@
       <w:pPr>
         <w:pStyle w:val="Heading3"/>
       </w:pPr>
-      <w:hyperlink r:id="rId18" w:history="1">
+      <w:hyperlink r:id="rId17" w:history="1">
         <w:r>
           <w:rPr>
             <w:rStyle w:val="Hyperlink"/>
@@ -3038,7 +3074,7 @@
         </w:rPr>
         <w:t>For Matter projects development with this SDK, it is recommended to utilize ESP-IDF </w:t>
       </w:r>
-      <w:hyperlink r:id="rId19" w:history="1">
+      <w:hyperlink r:id="rId18" w:history="1">
         <w:r>
           <w:rPr>
             <w:rStyle w:val="Hyperlink"/>
@@ -4580,7 +4616,7 @@
       <w:r>
         <w:t xml:space="preserve"> from </w:t>
       </w:r>
-      <w:hyperlink r:id="rId20" w:history="1">
+      <w:hyperlink r:id="rId19" w:history="1">
         <w:r>
           <w:rPr>
             <w:rStyle w:val="Hyperlink"/>
@@ -4590,7 +4626,7 @@
       </w:hyperlink>
     </w:p>
     <w:p>
-      <w:hyperlink r:id="rId21" w:history="1">
+      <w:hyperlink r:id="rId20" w:history="1">
         <w:r>
           <w:rPr>
             <w:rStyle w:val="Hyperlink"/>
@@ -6282,7 +6318,7 @@
                 <w:bCs/>
               </w:rPr>
             </w:pPr>
-            <w:hyperlink r:id="rId22" w:history="1">
+            <w:hyperlink r:id="rId21" w:history="1">
               <w:r>
                 <w:rPr>
                   <w:rStyle w:val="Hyperlink"/>
@@ -6307,7 +6343,7 @@
                 <w:bCs/>
               </w:rPr>
             </w:pPr>
-            <w:hyperlink r:id="rId23" w:history="1">
+            <w:hyperlink r:id="rId22" w:history="1">
               <w:r>
                 <w:rPr>
                   <w:rStyle w:val="Hyperlink"/>
@@ -6341,7 +6377,7 @@
                 <w:bCs/>
               </w:rPr>
             </w:pPr>
-            <w:hyperlink r:id="rId24" w:history="1">
+            <w:hyperlink r:id="rId23" w:history="1">
               <w:r>
                 <w:rPr>
                   <w:rStyle w:val="Hyperlink"/>
@@ -6405,7 +6441,7 @@
             <w:r>
               <w:t xml:space="preserve">, 4.3 mm thick </w:t>
             </w:r>
-            <w:hyperlink r:id="rId25" w:history="1">
+            <w:hyperlink r:id="rId24" w:history="1">
               <w:r>
                 <w:rPr>
                   <w:rStyle w:val="Hyperlink"/>
@@ -6436,7 +6472,7 @@
               <w:noBreakHyphen/>
               <w:t xml:space="preserve">sized) </w:t>
             </w:r>
-            <w:hyperlink r:id="rId26" w:history="1">
+            <w:hyperlink r:id="rId25" w:history="1">
               <w:r>
                 <w:rPr>
                   <w:rStyle w:val="Hyperlink"/>
@@ -6463,7 +6499,7 @@
             <w:r>
               <w:t xml:space="preserve"> </w:t>
             </w:r>
-            <w:hyperlink r:id="rId27" w:history="1">
+            <w:hyperlink r:id="rId26" w:history="1">
               <w:r>
                 <w:rPr>
                   <w:rStyle w:val="Hyperlink"/>
@@ -6516,7 +6552,7 @@
             <w:r>
               <w:t xml:space="preserve"> </w:t>
             </w:r>
-            <w:hyperlink r:id="rId28" w:history="1">
+            <w:hyperlink r:id="rId27" w:history="1">
               <w:r>
                 <w:rPr>
                   <w:rStyle w:val="Hyperlink"/>
@@ -6543,7 +6579,7 @@
             <w:r>
               <w:t xml:space="preserve"> </w:t>
             </w:r>
-            <w:hyperlink r:id="rId29" w:history="1">
+            <w:hyperlink r:id="rId28" w:history="1">
               <w:r>
                 <w:rPr>
                   <w:rStyle w:val="Hyperlink"/>
@@ -6570,7 +6606,7 @@
             <w:r>
               <w:t xml:space="preserve"> (this variant) </w:t>
             </w:r>
-            <w:hyperlink r:id="rId30" w:history="1">
+            <w:hyperlink r:id="rId29" w:history="1">
               <w:r>
                 <w:rPr>
                   <w:rStyle w:val="Hyperlink"/>
@@ -6623,7 +6659,7 @@
             <w:r>
               <w:t xml:space="preserve"> </w:t>
             </w:r>
-            <w:hyperlink r:id="rId31" w:history="1">
+            <w:hyperlink r:id="rId30" w:history="1">
               <w:r>
                 <w:rPr>
                   <w:rStyle w:val="Hyperlink"/>
@@ -6650,7 +6686,7 @@
             <w:r>
               <w:t xml:space="preserve"> </w:t>
             </w:r>
-            <w:hyperlink r:id="rId32" w:history="1">
+            <w:hyperlink r:id="rId31" w:history="1">
               <w:r>
                 <w:rPr>
                   <w:rStyle w:val="Hyperlink"/>
@@ -6677,7 +6713,7 @@
             <w:r>
               <w:t xml:space="preserve"> (this variant) </w:t>
             </w:r>
-            <w:hyperlink r:id="rId33" w:history="1">
+            <w:hyperlink r:id="rId32" w:history="1">
               <w:r>
                 <w:rPr>
                   <w:rStyle w:val="Hyperlink"/>
@@ -6723,7 +6759,7 @@
             <w:r>
               <w:t xml:space="preserve">LiPo charging pads (JST pads on back) </w:t>
             </w:r>
-            <w:hyperlink r:id="rId34" w:history="1">
+            <w:hyperlink r:id="rId33" w:history="1">
               <w:r>
                 <w:rPr>
                   <w:rStyle w:val="Hyperlink"/>
@@ -6758,7 +6794,7 @@
             <w:r>
               <w:t xml:space="preserve">, 50 mA fast charge / 3.8 mA trickle </w:t>
             </w:r>
-            <w:hyperlink r:id="rId35" w:history="1">
+            <w:hyperlink r:id="rId34" w:history="1">
               <w:r>
                 <w:rPr>
                   <w:rStyle w:val="Hyperlink"/>
@@ -6793,7 +6829,7 @@
             <w:r>
               <w:t xml:space="preserve">, MAX17048 fuel gauge </w:t>
             </w:r>
-            <w:hyperlink r:id="rId36" w:history="1">
+            <w:hyperlink r:id="rId35" w:history="1">
               <w:r>
                 <w:rPr>
                   <w:rStyle w:val="Hyperlink"/>
@@ -6878,7 +6914,7 @@
             <w:r>
               <w:t xml:space="preserve"> </w:t>
             </w:r>
-            <w:hyperlink r:id="rId37" w:history="1">
+            <w:hyperlink r:id="rId36" w:history="1">
               <w:r>
                 <w:rPr>
                   <w:rStyle w:val="Hyperlink"/>
@@ -6898,7 +6934,7 @@
             <w:r>
               <w:t xml:space="preserve">Deep sleep ~100 µA (from Adafruit description) </w:t>
             </w:r>
-            <w:hyperlink r:id="rId38" w:history="1">
+            <w:hyperlink r:id="rId37" w:history="1">
               <w:r>
                 <w:rPr>
                   <w:rStyle w:val="Hyperlink"/>
@@ -6945,7 +6981,7 @@
             <w:r>
               <w:t xml:space="preserve"> (very strong) </w:t>
             </w:r>
-            <w:hyperlink r:id="rId39" w:history="1">
+            <w:hyperlink r:id="rId38" w:history="1">
               <w:r>
                 <w:rPr>
                   <w:rStyle w:val="Hyperlink"/>
@@ -7038,7 +7074,7 @@
             <w:r>
               <w:t xml:space="preserve"> </w:t>
             </w:r>
-            <w:hyperlink r:id="rId40" w:history="1">
+            <w:hyperlink r:id="rId39" w:history="1">
               <w:r>
                 <w:rPr>
                   <w:rStyle w:val="Hyperlink"/>
@@ -7065,7 +7101,7 @@
             <w:r>
               <w:t xml:space="preserve">, U.FL included </w:t>
             </w:r>
-            <w:hyperlink r:id="rId41" w:history="1">
+            <w:hyperlink r:id="rId40" w:history="1">
               <w:r>
                 <w:rPr>
                   <w:rStyle w:val="Hyperlink"/>
@@ -7085,7 +7121,7 @@
             <w:r>
               <w:t xml:space="preserve">PCB antenna (w.FL variant available separately) </w:t>
             </w:r>
-            <w:hyperlink r:id="rId42" w:history="1">
+            <w:hyperlink r:id="rId41" w:history="1">
               <w:r>
                 <w:rPr>
                   <w:rStyle w:val="Hyperlink"/>
@@ -7129,7 +7165,7 @@
               <w:noBreakHyphen/>
               <w:t xml:space="preserve">C </w:t>
             </w:r>
-            <w:hyperlink r:id="rId43" w:history="1">
+            <w:hyperlink r:id="rId42" w:history="1">
               <w:r>
                 <w:rPr>
                   <w:rStyle w:val="Hyperlink"/>
@@ -7153,7 +7189,7 @@
               <w:noBreakHyphen/>
               <w:t xml:space="preserve">C </w:t>
             </w:r>
-            <w:hyperlink r:id="rId44" w:history="1">
+            <w:hyperlink r:id="rId43" w:history="1">
               <w:r>
                 <w:rPr>
                   <w:rStyle w:val="Hyperlink"/>
@@ -7177,7 +7213,7 @@
               <w:noBreakHyphen/>
               <w:t xml:space="preserve">C </w:t>
             </w:r>
-            <w:hyperlink r:id="rId45" w:history="1">
+            <w:hyperlink r:id="rId44" w:history="1">
               <w:r>
                 <w:rPr>
                   <w:rStyle w:val="Hyperlink"/>
@@ -7256,7 +7292,7 @@
             <w:r>
               <w:t xml:space="preserve"> </w:t>
             </w:r>
-            <w:hyperlink r:id="rId46" w:history="1">
+            <w:hyperlink r:id="rId45" w:history="1">
               <w:r>
                 <w:rPr>
                   <w:rStyle w:val="Hyperlink"/>
@@ -7276,7 +7312,7 @@
             <w:r>
               <w:t xml:space="preserve">~100 µA (Adafruit description) </w:t>
             </w:r>
-            <w:hyperlink r:id="rId47" w:history="1">
+            <w:hyperlink r:id="rId46" w:history="1">
               <w:r>
                 <w:rPr>
                   <w:rStyle w:val="Hyperlink"/>
@@ -7316,7 +7352,7 @@
             <w:r>
               <w:t xml:space="preserve">17 GPIO </w:t>
             </w:r>
-            <w:hyperlink r:id="rId48" w:history="1">
+            <w:hyperlink r:id="rId47" w:history="1">
               <w:r>
                 <w:rPr>
                   <w:rStyle w:val="Hyperlink"/>
@@ -7336,7 +7372,7 @@
             <w:r>
               <w:t xml:space="preserve">11 GPIO (PWM), 9 ADC </w:t>
             </w:r>
-            <w:hyperlink r:id="rId49" w:history="1">
+            <w:hyperlink r:id="rId48" w:history="1">
               <w:r>
                 <w:rPr>
                   <w:rStyle w:val="Hyperlink"/>
@@ -7356,7 +7392,7 @@
             <w:r>
               <w:t xml:space="preserve">Full Feather pinout (varies by variant) </w:t>
             </w:r>
-            <w:hyperlink r:id="rId50" w:history="1">
+            <w:hyperlink r:id="rId49" w:history="1">
               <w:r>
                 <w:rPr>
                   <w:rStyle w:val="Hyperlink"/>
@@ -7375,7 +7411,7 @@
       </w:r>
     </w:p>
     <w:p>
-      <w:hyperlink r:id="rId51" w:history="1">
+      <w:hyperlink r:id="rId50" w:history="1">
         <w:r>
           <w:rPr>
             <w:rStyle w:val="Hyperlink"/>
@@ -7388,7 +7424,7 @@
       </w:r>
     </w:p>
     <w:p>
-      <w:hyperlink r:id="rId52" w:history="1">
+      <w:hyperlink r:id="rId51" w:history="1">
         <w:r>
           <w:rPr>
             <w:rStyle w:val="Hyperlink"/>
@@ -7458,7 +7494,7 @@
                     </pic:cNvPicPr>
                   </pic:nvPicPr>
                   <pic:blipFill>
-                    <a:blip r:embed="rId53" cstate="print">
+                    <a:blip r:embed="rId52" cstate="print">
                       <a:extLst>
                         <a:ext uri="{28A0092B-C50C-407E-A947-70E740481C1C}">
                           <a14:useLocalDpi xmlns:a14="http://schemas.microsoft.com/office/drawing/2010/main" val="0"/>
@@ -7495,7 +7531,7 @@
           </wp:anchor>
         </w:drawing>
       </w:r>
-      <w:hyperlink r:id="rId54" w:history="1">
+      <w:hyperlink r:id="rId53" w:history="1">
         <w:r>
           <w:rPr>
             <w:rStyle w:val="Hyperlink"/>
@@ -7520,7 +7556,7 @@
       </w:r>
     </w:p>
     <w:p>
-      <w:hyperlink r:id="rId55" w:history="1">
+      <w:hyperlink r:id="rId54" w:history="1">
         <w:r>
           <w:rPr>
             <w:rStyle w:val="Hyperlink"/>
@@ -7530,7 +7566,7 @@
       </w:hyperlink>
     </w:p>
     <w:p>
-      <w:hyperlink r:id="rId56" w:history="1">
+      <w:hyperlink r:id="rId55" w:history="1">
         <w:r>
           <w:rPr>
             <w:rStyle w:val="Hyperlink"/>
@@ -7543,7 +7579,7 @@
       </w:r>
     </w:p>
     <w:p>
-      <w:hyperlink r:id="rId57" w:history="1">
+      <w:hyperlink r:id="rId56" w:history="1">
         <w:r>
           <w:rPr>
             <w:rStyle w:val="Hyperlink"/>
@@ -7608,7 +7644,7 @@
                     </pic:cNvPicPr>
                   </pic:nvPicPr>
                   <pic:blipFill>
-                    <a:blip r:embed="rId58" cstate="print">
+                    <a:blip r:embed="rId57" cstate="print">
                       <a:extLst>
                         <a:ext uri="{28A0092B-C50C-407E-A947-70E740481C1C}">
                           <a14:useLocalDpi xmlns:a14="http://schemas.microsoft.com/office/drawing/2010/main" val="0"/>
@@ -7636,7 +7672,7 @@
           </wp:anchor>
         </w:drawing>
       </w:r>
-      <w:hyperlink r:id="rId59" w:anchor="nav-specification" w:history="1">
+      <w:hyperlink r:id="rId58" w:anchor="nav-specification" w:history="1">
         <w:r>
           <w:rPr>
             <w:rStyle w:val="Hyperlink"/>
@@ -7731,7 +7767,7 @@
                     </pic:cNvPicPr>
                   </pic:nvPicPr>
                   <pic:blipFill>
-                    <a:blip r:embed="rId60" cstate="print">
+                    <a:blip r:embed="rId59" cstate="print">
                       <a:extLst>
                         <a:ext uri="{28A0092B-C50C-407E-A947-70E740481C1C}">
                           <a14:useLocalDpi xmlns:a14="http://schemas.microsoft.com/office/drawing/2010/main" val="0"/>
@@ -7762,7 +7798,7 @@
           </wp:anchor>
         </w:drawing>
       </w:r>
-      <w:hyperlink r:id="rId61" w:history="1">
+      <w:hyperlink r:id="rId60" w:history="1">
         <w:r>
           <w:rPr>
             <w:rStyle w:val="Hyperlink"/>
@@ -7781,7 +7817,7 @@
       </w:r>
     </w:p>
     <w:p>
-      <w:hyperlink r:id="rId62" w:history="1">
+      <w:hyperlink r:id="rId61" w:history="1">
         <w:r>
           <w:rPr>
             <w:rStyle w:val="Hyperlink"/>
@@ -7791,7 +7827,7 @@
       </w:hyperlink>
     </w:p>
     <w:p>
-      <w:hyperlink r:id="rId63" w:history="1">
+      <w:hyperlink r:id="rId62" w:history="1">
         <w:r>
           <w:rPr>
             <w:rStyle w:val="Hyperlink"/>
@@ -7832,7 +7868,7 @@
                     <pic:cNvPicPr/>
                   </pic:nvPicPr>
                   <pic:blipFill>
-                    <a:blip r:embed="rId64" cstate="print">
+                    <a:blip r:embed="rId63" cstate="print">
                       <a:extLst>
                         <a:ext uri="{28A0092B-C50C-407E-A947-70E740481C1C}">
                           <a14:useLocalDpi xmlns:a14="http://schemas.microsoft.com/office/drawing/2010/main" val="0"/>
@@ -7858,7 +7894,7 @@
           </wp:anchor>
         </w:drawing>
       </w:r>
-      <w:hyperlink r:id="rId65" w:history="1">
+      <w:hyperlink r:id="rId64" w:history="1">
         <w:r>
           <w:rPr>
             <w:rStyle w:val="Hyperlink"/>
@@ -7874,7 +7910,7 @@
       </w:hyperlink>
     </w:p>
     <w:p>
-      <w:hyperlink r:id="rId66" w:history="1">
+      <w:hyperlink r:id="rId65" w:history="1">
         <w:r>
           <w:rPr>
             <w:rStyle w:val="Hyperlink"/>
@@ -9948,6 +9984,119 @@
     </w:lvl>
   </w:abstractNum>
   <w:abstractNum w:abstractNumId="14" w15:restartNumberingAfterBreak="0">
+    <w:nsid w:val="337B2894"/>
+    <w:multiLevelType w:val="hybridMultilevel"/>
+    <w:tmpl w:val="CA2E012A"/>
+    <w:lvl w:ilvl="0" w:tplc="04090001">
+      <w:start w:val="1"/>
+      <w:numFmt w:val="bullet"/>
+      <w:lvlText w:val=""/>
+      <w:lvlJc w:val="left"/>
+      <w:pPr>
+        <w:ind w:left="720" w:hanging="360"/>
+      </w:pPr>
+      <w:rPr>
+        <w:rFonts w:ascii="Symbol" w:hAnsi="Symbol" w:hint="default"/>
+      </w:rPr>
+    </w:lvl>
+    <w:lvl w:ilvl="1" w:tplc="04090003" w:tentative="1">
+      <w:start w:val="1"/>
+      <w:numFmt w:val="bullet"/>
+      <w:lvlText w:val="o"/>
+      <w:lvlJc w:val="left"/>
+      <w:pPr>
+        <w:ind w:left="1440" w:hanging="360"/>
+      </w:pPr>
+      <w:rPr>
+        <w:rFonts w:ascii="Courier New" w:hAnsi="Courier New" w:cs="Courier New" w:hint="default"/>
+      </w:rPr>
+    </w:lvl>
+    <w:lvl w:ilvl="2" w:tplc="04090005" w:tentative="1">
+      <w:start w:val="1"/>
+      <w:numFmt w:val="bullet"/>
+      <w:lvlText w:val=""/>
+      <w:lvlJc w:val="left"/>
+      <w:pPr>
+        <w:ind w:left="2160" w:hanging="360"/>
+      </w:pPr>
+      <w:rPr>
+        <w:rFonts w:ascii="Wingdings" w:hAnsi="Wingdings" w:hint="default"/>
+      </w:rPr>
+    </w:lvl>
+    <w:lvl w:ilvl="3" w:tplc="04090001" w:tentative="1">
+      <w:start w:val="1"/>
+      <w:numFmt w:val="bullet"/>
+      <w:lvlText w:val=""/>
+      <w:lvlJc w:val="left"/>
+      <w:pPr>
+        <w:ind w:left="2880" w:hanging="360"/>
+      </w:pPr>
+      <w:rPr>
+        <w:rFonts w:ascii="Symbol" w:hAnsi="Symbol" w:hint="default"/>
+      </w:rPr>
+    </w:lvl>
+    <w:lvl w:ilvl="4" w:tplc="04090003" w:tentative="1">
+      <w:start w:val="1"/>
+      <w:numFmt w:val="bullet"/>
+      <w:lvlText w:val="o"/>
+      <w:lvlJc w:val="left"/>
+      <w:pPr>
+        <w:ind w:left="3600" w:hanging="360"/>
+      </w:pPr>
+      <w:rPr>
+        <w:rFonts w:ascii="Courier New" w:hAnsi="Courier New" w:cs="Courier New" w:hint="default"/>
+      </w:rPr>
+    </w:lvl>
+    <w:lvl w:ilvl="5" w:tplc="04090005" w:tentative="1">
+      <w:start w:val="1"/>
+      <w:numFmt w:val="bullet"/>
+      <w:lvlText w:val=""/>
+      <w:lvlJc w:val="left"/>
+      <w:pPr>
+        <w:ind w:left="4320" w:hanging="360"/>
+      </w:pPr>
+      <w:rPr>
+        <w:rFonts w:ascii="Wingdings" w:hAnsi="Wingdings" w:hint="default"/>
+      </w:rPr>
+    </w:lvl>
+    <w:lvl w:ilvl="6" w:tplc="04090001" w:tentative="1">
+      <w:start w:val="1"/>
+      <w:numFmt w:val="bullet"/>
+      <w:lvlText w:val=""/>
+      <w:lvlJc w:val="left"/>
+      <w:pPr>
+        <w:ind w:left="5040" w:hanging="360"/>
+      </w:pPr>
+      <w:rPr>
+        <w:rFonts w:ascii="Symbol" w:hAnsi="Symbol" w:hint="default"/>
+      </w:rPr>
+    </w:lvl>
+    <w:lvl w:ilvl="7" w:tplc="04090003" w:tentative="1">
+      <w:start w:val="1"/>
+      <w:numFmt w:val="bullet"/>
+      <w:lvlText w:val="o"/>
+      <w:lvlJc w:val="left"/>
+      <w:pPr>
+        <w:ind w:left="5760" w:hanging="360"/>
+      </w:pPr>
+      <w:rPr>
+        <w:rFonts w:ascii="Courier New" w:hAnsi="Courier New" w:cs="Courier New" w:hint="default"/>
+      </w:rPr>
+    </w:lvl>
+    <w:lvl w:ilvl="8" w:tplc="04090005" w:tentative="1">
+      <w:start w:val="1"/>
+      <w:numFmt w:val="bullet"/>
+      <w:lvlText w:val=""/>
+      <w:lvlJc w:val="left"/>
+      <w:pPr>
+        <w:ind w:left="6480" w:hanging="360"/>
+      </w:pPr>
+      <w:rPr>
+        <w:rFonts w:ascii="Wingdings" w:hAnsi="Wingdings" w:hint="default"/>
+      </w:rPr>
+    </w:lvl>
+  </w:abstractNum>
+  <w:abstractNum w:abstractNumId="15" w15:restartNumberingAfterBreak="0">
     <w:nsid w:val="34764FCE"/>
     <w:multiLevelType w:val="multilevel"/>
     <w:tmpl w:val="ACE44528"/>
@@ -10096,7 +10245,7 @@
       </w:rPr>
     </w:lvl>
   </w:abstractNum>
-  <w:abstractNum w:abstractNumId="15" w15:restartNumberingAfterBreak="0">
+  <w:abstractNum w:abstractNumId="16" w15:restartNumberingAfterBreak="0">
     <w:nsid w:val="35023D8A"/>
     <w:multiLevelType w:val="multilevel"/>
     <w:tmpl w:val="10D2C716"/>
@@ -10245,7 +10394,7 @@
       </w:rPr>
     </w:lvl>
   </w:abstractNum>
-  <w:abstractNum w:abstractNumId="16" w15:restartNumberingAfterBreak="0">
+  <w:abstractNum w:abstractNumId="17" w15:restartNumberingAfterBreak="0">
     <w:nsid w:val="37CF2D78"/>
     <w:multiLevelType w:val="multilevel"/>
     <w:tmpl w:val="33385F66"/>
@@ -10394,7 +10543,7 @@
       </w:rPr>
     </w:lvl>
   </w:abstractNum>
-  <w:abstractNum w:abstractNumId="17" w15:restartNumberingAfterBreak="0">
+  <w:abstractNum w:abstractNumId="18" w15:restartNumberingAfterBreak="0">
     <w:nsid w:val="380974D1"/>
     <w:multiLevelType w:val="multilevel"/>
     <w:tmpl w:val="97B47962"/>
@@ -10543,7 +10692,7 @@
       </w:rPr>
     </w:lvl>
   </w:abstractNum>
-  <w:abstractNum w:abstractNumId="18" w15:restartNumberingAfterBreak="0">
+  <w:abstractNum w:abstractNumId="19" w15:restartNumberingAfterBreak="0">
     <w:nsid w:val="3B475590"/>
     <w:multiLevelType w:val="multilevel"/>
     <w:tmpl w:val="5A94470C"/>
@@ -10692,7 +10841,7 @@
       </w:rPr>
     </w:lvl>
   </w:abstractNum>
-  <w:abstractNum w:abstractNumId="19" w15:restartNumberingAfterBreak="0">
+  <w:abstractNum w:abstractNumId="20" w15:restartNumberingAfterBreak="0">
     <w:nsid w:val="3CBC441F"/>
     <w:multiLevelType w:val="multilevel"/>
     <w:tmpl w:val="37D2D3DE"/>
@@ -10841,7 +10990,7 @@
       </w:rPr>
     </w:lvl>
   </w:abstractNum>
-  <w:abstractNum w:abstractNumId="20" w15:restartNumberingAfterBreak="0">
+  <w:abstractNum w:abstractNumId="21" w15:restartNumberingAfterBreak="0">
     <w:nsid w:val="3D7B5690"/>
     <w:multiLevelType w:val="multilevel"/>
     <w:tmpl w:val="31807168"/>
@@ -10990,7 +11139,7 @@
       </w:rPr>
     </w:lvl>
   </w:abstractNum>
-  <w:abstractNum w:abstractNumId="21" w15:restartNumberingAfterBreak="0">
+  <w:abstractNum w:abstractNumId="22" w15:restartNumberingAfterBreak="0">
     <w:nsid w:val="3E297016"/>
     <w:multiLevelType w:val="multilevel"/>
     <w:tmpl w:val="8F9CEA28"/>
@@ -11139,7 +11288,7 @@
       </w:rPr>
     </w:lvl>
   </w:abstractNum>
-  <w:abstractNum w:abstractNumId="22" w15:restartNumberingAfterBreak="0">
+  <w:abstractNum w:abstractNumId="23" w15:restartNumberingAfterBreak="0">
     <w:nsid w:val="3E3D6B2D"/>
     <w:multiLevelType w:val="multilevel"/>
     <w:tmpl w:val="E8FE1B2E"/>
@@ -11288,7 +11437,7 @@
       </w:rPr>
     </w:lvl>
   </w:abstractNum>
-  <w:abstractNum w:abstractNumId="23" w15:restartNumberingAfterBreak="0">
+  <w:abstractNum w:abstractNumId="24" w15:restartNumberingAfterBreak="0">
     <w:nsid w:val="48F8196E"/>
     <w:multiLevelType w:val="multilevel"/>
     <w:tmpl w:val="B0540AAC"/>
@@ -11437,7 +11586,7 @@
       </w:rPr>
     </w:lvl>
   </w:abstractNum>
-  <w:abstractNum w:abstractNumId="24" w15:restartNumberingAfterBreak="0">
+  <w:abstractNum w:abstractNumId="25" w15:restartNumberingAfterBreak="0">
     <w:nsid w:val="4A270F21"/>
     <w:multiLevelType w:val="multilevel"/>
     <w:tmpl w:val="0D4A3A8A"/>
@@ -11586,7 +11735,7 @@
       </w:rPr>
     </w:lvl>
   </w:abstractNum>
-  <w:abstractNum w:abstractNumId="25" w15:restartNumberingAfterBreak="0">
+  <w:abstractNum w:abstractNumId="26" w15:restartNumberingAfterBreak="0">
     <w:nsid w:val="4D6551BF"/>
     <w:multiLevelType w:val="multilevel"/>
     <w:tmpl w:val="ADE49D40"/>
@@ -11735,7 +11884,7 @@
       </w:rPr>
     </w:lvl>
   </w:abstractNum>
-  <w:abstractNum w:abstractNumId="26" w15:restartNumberingAfterBreak="0">
+  <w:abstractNum w:abstractNumId="27" w15:restartNumberingAfterBreak="0">
     <w:nsid w:val="50602847"/>
     <w:multiLevelType w:val="multilevel"/>
     <w:tmpl w:val="CD6E6D62"/>
@@ -11884,7 +12033,7 @@
       </w:rPr>
     </w:lvl>
   </w:abstractNum>
-  <w:abstractNum w:abstractNumId="27" w15:restartNumberingAfterBreak="0">
+  <w:abstractNum w:abstractNumId="28" w15:restartNumberingAfterBreak="0">
     <w:nsid w:val="50CC7765"/>
     <w:multiLevelType w:val="multilevel"/>
     <w:tmpl w:val="759C47E8"/>
@@ -12033,7 +12182,7 @@
       </w:rPr>
     </w:lvl>
   </w:abstractNum>
-  <w:abstractNum w:abstractNumId="28" w15:restartNumberingAfterBreak="0">
+  <w:abstractNum w:abstractNumId="29" w15:restartNumberingAfterBreak="0">
     <w:nsid w:val="514A3868"/>
     <w:multiLevelType w:val="multilevel"/>
     <w:tmpl w:val="4E72D3C4"/>
@@ -12182,7 +12331,7 @@
       </w:rPr>
     </w:lvl>
   </w:abstractNum>
-  <w:abstractNum w:abstractNumId="29" w15:restartNumberingAfterBreak="0">
+  <w:abstractNum w:abstractNumId="30" w15:restartNumberingAfterBreak="0">
     <w:nsid w:val="53A46EE4"/>
     <w:multiLevelType w:val="multilevel"/>
     <w:tmpl w:val="DE0612E0"/>
@@ -12331,7 +12480,7 @@
       </w:rPr>
     </w:lvl>
   </w:abstractNum>
-  <w:abstractNum w:abstractNumId="30" w15:restartNumberingAfterBreak="0">
+  <w:abstractNum w:abstractNumId="31" w15:restartNumberingAfterBreak="0">
     <w:nsid w:val="54877B99"/>
     <w:multiLevelType w:val="multilevel"/>
     <w:tmpl w:val="FA0C5B04"/>
@@ -12480,7 +12629,7 @@
       </w:rPr>
     </w:lvl>
   </w:abstractNum>
-  <w:abstractNum w:abstractNumId="31" w15:restartNumberingAfterBreak="0">
+  <w:abstractNum w:abstractNumId="32" w15:restartNumberingAfterBreak="0">
     <w:nsid w:val="56221B4E"/>
     <w:multiLevelType w:val="multilevel"/>
     <w:tmpl w:val="4C12CE6E"/>
@@ -12629,7 +12778,7 @@
       </w:rPr>
     </w:lvl>
   </w:abstractNum>
-  <w:abstractNum w:abstractNumId="32" w15:restartNumberingAfterBreak="0">
+  <w:abstractNum w:abstractNumId="33" w15:restartNumberingAfterBreak="0">
     <w:nsid w:val="56BD4743"/>
     <w:multiLevelType w:val="multilevel"/>
     <w:tmpl w:val="31DA023C"/>
@@ -12778,7 +12927,7 @@
       </w:rPr>
     </w:lvl>
   </w:abstractNum>
-  <w:abstractNum w:abstractNumId="33" w15:restartNumberingAfterBreak="0">
+  <w:abstractNum w:abstractNumId="34" w15:restartNumberingAfterBreak="0">
     <w:nsid w:val="56D3313E"/>
     <w:multiLevelType w:val="multilevel"/>
     <w:tmpl w:val="9BCA2848"/>
@@ -12927,7 +13076,7 @@
       </w:rPr>
     </w:lvl>
   </w:abstractNum>
-  <w:abstractNum w:abstractNumId="34" w15:restartNumberingAfterBreak="0">
+  <w:abstractNum w:abstractNumId="35" w15:restartNumberingAfterBreak="0">
     <w:nsid w:val="5BC6064E"/>
     <w:multiLevelType w:val="multilevel"/>
     <w:tmpl w:val="196A46F6"/>
@@ -13076,7 +13225,7 @@
       </w:rPr>
     </w:lvl>
   </w:abstractNum>
-  <w:abstractNum w:abstractNumId="35" w15:restartNumberingAfterBreak="0">
+  <w:abstractNum w:abstractNumId="36" w15:restartNumberingAfterBreak="0">
     <w:nsid w:val="5E9D0AB3"/>
     <w:multiLevelType w:val="multilevel"/>
     <w:tmpl w:val="4E7A1B34"/>
@@ -13225,7 +13374,7 @@
       </w:rPr>
     </w:lvl>
   </w:abstractNum>
-  <w:abstractNum w:abstractNumId="36" w15:restartNumberingAfterBreak="0">
+  <w:abstractNum w:abstractNumId="37" w15:restartNumberingAfterBreak="0">
     <w:nsid w:val="5F0105B4"/>
     <w:multiLevelType w:val="multilevel"/>
     <w:tmpl w:val="07080532"/>
@@ -13374,7 +13523,7 @@
       </w:rPr>
     </w:lvl>
   </w:abstractNum>
-  <w:abstractNum w:abstractNumId="37" w15:restartNumberingAfterBreak="0">
+  <w:abstractNum w:abstractNumId="38" w15:restartNumberingAfterBreak="0">
     <w:nsid w:val="60DA5859"/>
     <w:multiLevelType w:val="multilevel"/>
     <w:tmpl w:val="2394289A"/>
@@ -13523,7 +13672,7 @@
       </w:rPr>
     </w:lvl>
   </w:abstractNum>
-  <w:abstractNum w:abstractNumId="38" w15:restartNumberingAfterBreak="0">
+  <w:abstractNum w:abstractNumId="39" w15:restartNumberingAfterBreak="0">
     <w:nsid w:val="63B8580B"/>
     <w:multiLevelType w:val="hybridMultilevel"/>
     <w:tmpl w:val="D8AE475E"/>
@@ -13636,7 +13785,7 @@
       </w:rPr>
     </w:lvl>
   </w:abstractNum>
-  <w:abstractNum w:abstractNumId="39" w15:restartNumberingAfterBreak="0">
+  <w:abstractNum w:abstractNumId="40" w15:restartNumberingAfterBreak="0">
     <w:nsid w:val="678D671D"/>
     <w:multiLevelType w:val="multilevel"/>
     <w:tmpl w:val="42A886D4"/>
@@ -13785,7 +13934,7 @@
       </w:rPr>
     </w:lvl>
   </w:abstractNum>
-  <w:abstractNum w:abstractNumId="40" w15:restartNumberingAfterBreak="0">
+  <w:abstractNum w:abstractNumId="41" w15:restartNumberingAfterBreak="0">
     <w:nsid w:val="6E493141"/>
     <w:multiLevelType w:val="multilevel"/>
     <w:tmpl w:val="8904D7B2"/>
@@ -13934,7 +14083,7 @@
       </w:rPr>
     </w:lvl>
   </w:abstractNum>
-  <w:abstractNum w:abstractNumId="41" w15:restartNumberingAfterBreak="0">
+  <w:abstractNum w:abstractNumId="42" w15:restartNumberingAfterBreak="0">
     <w:nsid w:val="728E6FD9"/>
     <w:multiLevelType w:val="multilevel"/>
     <w:tmpl w:val="6E58AC2C"/>
@@ -14083,7 +14232,7 @@
       </w:rPr>
     </w:lvl>
   </w:abstractNum>
-  <w:abstractNum w:abstractNumId="42" w15:restartNumberingAfterBreak="0">
+  <w:abstractNum w:abstractNumId="43" w15:restartNumberingAfterBreak="0">
     <w:nsid w:val="74A82E56"/>
     <w:multiLevelType w:val="multilevel"/>
     <w:tmpl w:val="B4FA86EA"/>
@@ -14232,7 +14381,7 @@
       </w:rPr>
     </w:lvl>
   </w:abstractNum>
-  <w:abstractNum w:abstractNumId="43" w15:restartNumberingAfterBreak="0">
+  <w:abstractNum w:abstractNumId="44" w15:restartNumberingAfterBreak="0">
     <w:nsid w:val="78CD150C"/>
     <w:multiLevelType w:val="multilevel"/>
     <w:tmpl w:val="5172EE82"/>
@@ -14381,7 +14530,7 @@
       </w:rPr>
     </w:lvl>
   </w:abstractNum>
-  <w:abstractNum w:abstractNumId="44" w15:restartNumberingAfterBreak="0">
+  <w:abstractNum w:abstractNumId="45" w15:restartNumberingAfterBreak="0">
     <w:nsid w:val="79FA448B"/>
     <w:multiLevelType w:val="hybridMultilevel"/>
     <w:tmpl w:val="C7FC9E44"/>
@@ -14467,7 +14616,7 @@
       </w:pPr>
     </w:lvl>
   </w:abstractNum>
-  <w:abstractNum w:abstractNumId="45" w15:restartNumberingAfterBreak="0">
+  <w:abstractNum w:abstractNumId="46" w15:restartNumberingAfterBreak="0">
     <w:nsid w:val="7CE0601C"/>
     <w:multiLevelType w:val="multilevel"/>
     <w:tmpl w:val="AD6816DC"/>
@@ -14616,7 +14765,7 @@
       </w:rPr>
     </w:lvl>
   </w:abstractNum>
-  <w:abstractNum w:abstractNumId="46" w15:restartNumberingAfterBreak="0">
+  <w:abstractNum w:abstractNumId="47" w15:restartNumberingAfterBreak="0">
     <w:nsid w:val="7E7229F2"/>
     <w:multiLevelType w:val="multilevel"/>
     <w:tmpl w:val="E1BEBE9A"/>
@@ -14765,7 +14914,7 @@
       </w:rPr>
     </w:lvl>
   </w:abstractNum>
-  <w:abstractNum w:abstractNumId="47" w15:restartNumberingAfterBreak="0">
+  <w:abstractNum w:abstractNumId="48" w15:restartNumberingAfterBreak="0">
     <w:nsid w:val="7E7C35A7"/>
     <w:multiLevelType w:val="multilevel"/>
     <w:tmpl w:val="F7CCF912"/>
@@ -14915,94 +15064,94 @@
     </w:lvl>
   </w:abstractNum>
   <w:num w:numId="1" w16cid:durableId="1912082903">
-    <w:abstractNumId w:val="37"/>
+    <w:abstractNumId w:val="38"/>
   </w:num>
   <w:num w:numId="2" w16cid:durableId="1967613957">
-    <w:abstractNumId w:val="38"/>
+    <w:abstractNumId w:val="39"/>
   </w:num>
   <w:num w:numId="3" w16cid:durableId="2136824951">
-    <w:abstractNumId w:val="27"/>
+    <w:abstractNumId w:val="28"/>
   </w:num>
   <w:num w:numId="4" w16cid:durableId="503055371">
     <w:abstractNumId w:val="12"/>
   </w:num>
   <w:num w:numId="5" w16cid:durableId="527372012">
-    <w:abstractNumId w:val="30"/>
+    <w:abstractNumId w:val="31"/>
   </w:num>
   <w:num w:numId="6" w16cid:durableId="2117405750">
     <w:abstractNumId w:val="7"/>
   </w:num>
   <w:num w:numId="7" w16cid:durableId="1326712469">
-    <w:abstractNumId w:val="14"/>
+    <w:abstractNumId w:val="15"/>
   </w:num>
   <w:num w:numId="8" w16cid:durableId="1214078119">
     <w:abstractNumId w:val="11"/>
   </w:num>
   <w:num w:numId="9" w16cid:durableId="426393119">
-    <w:abstractNumId w:val="20"/>
+    <w:abstractNumId w:val="21"/>
   </w:num>
   <w:num w:numId="10" w16cid:durableId="1544710818">
-    <w:abstractNumId w:val="36"/>
+    <w:abstractNumId w:val="37"/>
   </w:num>
   <w:num w:numId="11" w16cid:durableId="885071025">
     <w:abstractNumId w:val="8"/>
   </w:num>
   <w:num w:numId="12" w16cid:durableId="119956559">
-    <w:abstractNumId w:val="39"/>
+    <w:abstractNumId w:val="40"/>
   </w:num>
   <w:num w:numId="13" w16cid:durableId="822770162">
-    <w:abstractNumId w:val="45"/>
+    <w:abstractNumId w:val="46"/>
   </w:num>
   <w:num w:numId="14" w16cid:durableId="1658344284">
     <w:abstractNumId w:val="3"/>
   </w:num>
   <w:num w:numId="15" w16cid:durableId="1688673129">
-    <w:abstractNumId w:val="23"/>
+    <w:abstractNumId w:val="24"/>
   </w:num>
   <w:num w:numId="16" w16cid:durableId="1971982197">
+    <w:abstractNumId w:val="19"/>
+  </w:num>
+  <w:num w:numId="17" w16cid:durableId="277375314">
     <w:abstractNumId w:val="18"/>
   </w:num>
-  <w:num w:numId="17" w16cid:durableId="277375314">
-    <w:abstractNumId w:val="17"/>
-  </w:num>
   <w:num w:numId="18" w16cid:durableId="659968514">
-    <w:abstractNumId w:val="15"/>
+    <w:abstractNumId w:val="16"/>
   </w:num>
   <w:num w:numId="19" w16cid:durableId="1449012400">
-    <w:abstractNumId w:val="26"/>
+    <w:abstractNumId w:val="27"/>
   </w:num>
   <w:num w:numId="20" w16cid:durableId="1395205377">
     <w:abstractNumId w:val="9"/>
   </w:num>
   <w:num w:numId="21" w16cid:durableId="221066696">
-    <w:abstractNumId w:val="35"/>
+    <w:abstractNumId w:val="36"/>
   </w:num>
   <w:num w:numId="22" w16cid:durableId="181360465">
-    <w:abstractNumId w:val="44"/>
+    <w:abstractNumId w:val="45"/>
   </w:num>
   <w:num w:numId="23" w16cid:durableId="1163280346">
-    <w:abstractNumId w:val="19"/>
+    <w:abstractNumId w:val="20"/>
   </w:num>
   <w:num w:numId="24" w16cid:durableId="135338183">
-    <w:abstractNumId w:val="32"/>
+    <w:abstractNumId w:val="33"/>
   </w:num>
   <w:num w:numId="25" w16cid:durableId="919753086">
     <w:abstractNumId w:val="2"/>
   </w:num>
   <w:num w:numId="26" w16cid:durableId="1260141111">
-    <w:abstractNumId w:val="29"/>
+    <w:abstractNumId w:val="30"/>
   </w:num>
   <w:num w:numId="27" w16cid:durableId="142476967">
-    <w:abstractNumId w:val="31"/>
+    <w:abstractNumId w:val="32"/>
   </w:num>
   <w:num w:numId="28" w16cid:durableId="1038821728">
-    <w:abstractNumId w:val="40"/>
+    <w:abstractNumId w:val="41"/>
   </w:num>
   <w:num w:numId="29" w16cid:durableId="561134564">
     <w:abstractNumId w:val="13"/>
   </w:num>
   <w:num w:numId="30" w16cid:durableId="663241235">
-    <w:abstractNumId w:val="25"/>
+    <w:abstractNumId w:val="26"/>
   </w:num>
   <w:num w:numId="31" w16cid:durableId="2062824366">
     <w:abstractNumId w:val="0"/>
@@ -15011,10 +15160,10 @@
     <w:abstractNumId w:val="10"/>
   </w:num>
   <w:num w:numId="33" w16cid:durableId="726950297">
-    <w:abstractNumId w:val="16"/>
+    <w:abstractNumId w:val="17"/>
   </w:num>
   <w:num w:numId="34" w16cid:durableId="1453553782">
-    <w:abstractNumId w:val="46"/>
+    <w:abstractNumId w:val="47"/>
   </w:num>
   <w:num w:numId="35" w16cid:durableId="1953122144">
     <w:abstractNumId w:val="4"/>
@@ -15023,40 +15172,43 @@
     <w:abstractNumId w:val="1"/>
   </w:num>
   <w:num w:numId="37" w16cid:durableId="950865576">
-    <w:abstractNumId w:val="43"/>
+    <w:abstractNumId w:val="44"/>
   </w:num>
   <w:num w:numId="38" w16cid:durableId="474222460">
     <w:abstractNumId w:val="6"/>
   </w:num>
   <w:num w:numId="39" w16cid:durableId="1645815532">
-    <w:abstractNumId w:val="21"/>
+    <w:abstractNumId w:val="22"/>
   </w:num>
   <w:num w:numId="40" w16cid:durableId="1314529702">
-    <w:abstractNumId w:val="33"/>
+    <w:abstractNumId w:val="34"/>
   </w:num>
   <w:num w:numId="41" w16cid:durableId="1349524197">
     <w:abstractNumId w:val="5"/>
   </w:num>
   <w:num w:numId="42" w16cid:durableId="504784691">
+    <w:abstractNumId w:val="43"/>
+  </w:num>
+  <w:num w:numId="43" w16cid:durableId="1903130648">
+    <w:abstractNumId w:val="35"/>
+  </w:num>
+  <w:num w:numId="44" w16cid:durableId="1876696441">
+    <w:abstractNumId w:val="48"/>
+  </w:num>
+  <w:num w:numId="45" w16cid:durableId="1142230718">
+    <w:abstractNumId w:val="29"/>
+  </w:num>
+  <w:num w:numId="46" w16cid:durableId="462386475">
+    <w:abstractNumId w:val="23"/>
+  </w:num>
+  <w:num w:numId="47" w16cid:durableId="334769791">
+    <w:abstractNumId w:val="25"/>
+  </w:num>
+  <w:num w:numId="48" w16cid:durableId="1561674174">
     <w:abstractNumId w:val="42"/>
   </w:num>
-  <w:num w:numId="43" w16cid:durableId="1903130648">
-    <w:abstractNumId w:val="34"/>
-  </w:num>
-  <w:num w:numId="44" w16cid:durableId="1876696441">
-    <w:abstractNumId w:val="47"/>
-  </w:num>
-  <w:num w:numId="45" w16cid:durableId="1142230718">
-    <w:abstractNumId w:val="28"/>
-  </w:num>
-  <w:num w:numId="46" w16cid:durableId="462386475">
-    <w:abstractNumId w:val="22"/>
-  </w:num>
-  <w:num w:numId="47" w16cid:durableId="334769791">
-    <w:abstractNumId w:val="24"/>
-  </w:num>
-  <w:num w:numId="48" w16cid:durableId="1561674174">
-    <w:abstractNumId w:val="41"/>
+  <w:num w:numId="49" w16cid:durableId="1331986348">
+    <w:abstractNumId w:val="14"/>
   </w:num>
   <w:numIdMacAtCleanup w:val="28"/>
 </w:numbering>
@@ -15663,6 +15815,7 @@
   <w:style w:type="character" w:default="1" w:styleId="DefaultParagraphFont">
     <w:name w:val="Default Paragraph Font"/>
     <w:uiPriority w:val="1"/>
+    <w:semiHidden/>
     <w:unhideWhenUsed/>
   </w:style>
   <w:style w:type="table" w:default="1" w:styleId="TableNormal">

</xml_diff>

<commit_message>
Update our gesture inference window to include a 500ms PRE_TRIGGER before a gesture is detected, then the 1-3 second gesture then 500ms of POST_PADDING so that the model can better identify complete gestures.
The entire gesture (pre + gesture + post) is then normalized and interpolated
so that all gestures are the same length. This makes our training simpler as
we don't need to train different gesture lengths to ensure proper recognition.
</commit_message>
<xml_diff>
--- a/docs/🪄 Magic Wand Maker Project.docx
+++ b/docs/🪄 Magic Wand Maker Project.docx
@@ -36,28 +36,116 @@
         </w:numPr>
       </w:pPr>
       <w:r>
-        <w:t xml:space="preserve">What is the best sampling rate for </w:t>
-      </w:r>
-      <w:r>
-        <w:t>gestures that are 1-3 seconds in length</w:t>
-      </w:r>
-      <w:r>
-        <w:t>;</w:t>
+        <w:t xml:space="preserve">Q: </w:t>
+      </w:r>
+      <w:r>
+        <w:t>What is the best model for ML:</w:t>
       </w:r>
     </w:p>
     <w:p>
       <w:pPr>
         <w:pStyle w:val="ListParagraph"/>
         <w:numPr>
-          <w:ilvl w:val="0"/>
+          <w:ilvl w:val="1"/>
           <w:numId w:val="49"/>
         </w:numPr>
       </w:pPr>
       <w:r>
+        <w:t>Detect start/stop of gesture and send linear acceleration, calibrated gyroscope, and fused rotation vector quaternion to the ML to do the gesture detection</w:t>
+      </w:r>
+    </w:p>
+    <w:p>
+      <w:pPr>
+        <w:pStyle w:val="ListParagraph"/>
+        <w:numPr>
+          <w:ilvl w:val="1"/>
+          <w:numId w:val="49"/>
+        </w:numPr>
+      </w:pPr>
+      <w:r>
+        <w:t xml:space="preserve">– or </w:t>
+      </w:r>
+      <w:r>
+        <w:t>–</w:t>
+      </w:r>
+    </w:p>
+    <w:p>
+      <w:pPr>
+        <w:pStyle w:val="ListParagraph"/>
+        <w:numPr>
+          <w:ilvl w:val="1"/>
+          <w:numId w:val="49"/>
+        </w:numPr>
+      </w:pPr>
+      <w:r>
+        <w:t xml:space="preserve">Do more like the speech recognition examples I’ve seen that had a circular buffer and try to detect gestures </w:t>
+      </w:r>
+      <w:r>
+        <w:t>with overlapping windows</w:t>
+      </w:r>
+      <w:r>
+        <w:t xml:space="preserve"> in real time using ML to do all the gesture detection</w:t>
+      </w:r>
+    </w:p>
+    <w:p>
+      <w:pPr>
+        <w:pStyle w:val="ListParagraph"/>
+        <w:numPr>
+          <w:ilvl w:val="0"/>
+          <w:numId w:val="49"/>
+        </w:numPr>
+      </w:pPr>
+      <w:r>
+        <w:t>A: None of the above:</w:t>
+      </w:r>
+    </w:p>
+    <w:p>
+      <w:pPr>
+        <w:pStyle w:val="ListParagraph"/>
+        <w:numPr>
+          <w:ilvl w:val="1"/>
+          <w:numId w:val="49"/>
+        </w:numPr>
+      </w:pPr>
+    </w:p>
+    <w:p>
+      <w:pPr>
+        <w:pStyle w:val="ListParagraph"/>
+        <w:numPr>
+          <w:ilvl w:val="0"/>
+          <w:numId w:val="49"/>
+        </w:numPr>
+      </w:pPr>
+      <w:r>
+        <w:t xml:space="preserve">What is the best sampling rate for gestures that are 1-3 seconds in </w:t>
+      </w:r>
+      <w:proofErr w:type="gramStart"/>
+      <w:r>
+        <w:t>length;</w:t>
+      </w:r>
+      <w:proofErr w:type="gramEnd"/>
+    </w:p>
+    <w:p>
+      <w:pPr>
+        <w:pStyle w:val="ListParagraph"/>
+        <w:numPr>
+          <w:ilvl w:val="0"/>
+          <w:numId w:val="49"/>
+        </w:numPr>
+      </w:pPr>
+      <w:r>
         <w:t>What is the best inference window size to use for gestures that are 1-3 seconds in length</w:t>
       </w:r>
       <w:r>
-        <w:t xml:space="preserve"> with a 200 hz sampling rate</w:t>
+        <w:t xml:space="preserve"> with a 200 </w:t>
+      </w:r>
+      <w:proofErr w:type="spellStart"/>
+      <w:r>
+        <w:t>hz</w:t>
+      </w:r>
+      <w:proofErr w:type="spellEnd"/>
+      <w:r>
+        <w:t xml:space="preserve"> sampling rate</w:t>
       </w:r>
       <w:r>
         <w:t xml:space="preserve">? </w:t>
@@ -72,7 +160,15 @@
         </w:numPr>
       </w:pPr>
       <w:r>
-        <w:t>Should each gesture only contain the motion or will I get better recognition if I include some samples of ‘stillness’ at the beginning and ending of the gesture?</w:t>
+        <w:t xml:space="preserve">Should each gesture only contain the </w:t>
+      </w:r>
+      <w:proofErr w:type="gramStart"/>
+      <w:r>
+        <w:t>motion</w:t>
+      </w:r>
+      <w:proofErr w:type="gramEnd"/>
+      <w:r>
+        <w:t xml:space="preserve"> or will I get better recognition if I include some samples of ‘stillness’ at the beginning and ending of the gesture?</w:t>
       </w:r>
     </w:p>
     <w:p>
@@ -132,13 +228,37 @@
         </w:numPr>
       </w:pPr>
       <w:r>
-        <w:t>What is the type of inference network best for m</w:t>
-      </w:r>
-      <w:r>
-        <w:t>git add -uasdfasdfasdf</w:t>
-      </w:r>
-      <w:r>
-        <w:t xml:space="preserve">y needs? </w:t>
+        <w:t xml:space="preserve">What </w:t>
+      </w:r>
+      <w:proofErr w:type="gramStart"/>
+      <w:r>
+        <w:t>is the type of inference network</w:t>
+      </w:r>
+      <w:proofErr w:type="gramEnd"/>
+      <w:r>
+        <w:t xml:space="preserve"> best for </w:t>
+      </w:r>
+      <w:proofErr w:type="spellStart"/>
+      <w:r>
+        <w:t>m</w:t>
+      </w:r>
+      <w:r>
+        <w:t>git</w:t>
+      </w:r>
+      <w:proofErr w:type="spellEnd"/>
+      <w:r>
+        <w:t xml:space="preserve"> add -</w:t>
+      </w:r>
+      <w:proofErr w:type="spellStart"/>
+      <w:r>
+        <w:t>uasdfasdfasdf</w:t>
+      </w:r>
+      <w:r>
+        <w:t>y</w:t>
+      </w:r>
+      <w:proofErr w:type="spellEnd"/>
+      <w:r>
+        <w:t xml:space="preserve"> needs? </w:t>
       </w:r>
     </w:p>
     <w:p>
@@ -165,8 +285,13 @@
       <w:pPr>
         <w:pStyle w:val="Heading2"/>
       </w:pPr>
-      <w:r>
-        <w:t>Hosyond ESP32S3</w:t>
+      <w:proofErr w:type="spellStart"/>
+      <w:r>
+        <w:t>Hosyond</w:t>
+      </w:r>
+      <w:proofErr w:type="spellEnd"/>
+      <w:r>
+        <w:t xml:space="preserve"> ESP32S3</w:t>
       </w:r>
       <w:r>
         <w:br/>
@@ -190,12 +315,28 @@
     </w:p>
     <w:p>
       <w:r>
-        <w:t>GPIO 4  → INT (host interrupt)</w:t>
-      </w:r>
-    </w:p>
-    <w:p>
-      <w:r>
-        <w:t>GPIO 5  → RST</w:t>
+        <w:t xml:space="preserve">GPIO </w:t>
+      </w:r>
+      <w:proofErr w:type="gramStart"/>
+      <w:r>
+        <w:t>4  →</w:t>
+      </w:r>
+      <w:proofErr w:type="gramEnd"/>
+      <w:r>
+        <w:t xml:space="preserve"> INT (host interrupt)</w:t>
+      </w:r>
+    </w:p>
+    <w:p>
+      <w:r>
+        <w:t xml:space="preserve">GPIO </w:t>
+      </w:r>
+      <w:proofErr w:type="gramStart"/>
+      <w:r>
+        <w:t>5  →</w:t>
+      </w:r>
+      <w:proofErr w:type="gramEnd"/>
+      <w:r>
+        <w:t xml:space="preserve"> RST</w:t>
       </w:r>
     </w:p>
     <w:p>
@@ -205,12 +346,21 @@
     </w:p>
     <w:p>
       <w:r>
+        <w:lastRenderedPageBreak/>
         <w:t>GND     → GND</w:t>
       </w:r>
     </w:p>
     <w:p>
       <w:r>
-        <w:t>PS1     → GND   (force SPI mode)</w:t>
+        <w:t>PS1     → GND</w:t>
+      </w:r>
+      <w:proofErr w:type="gramStart"/>
+      <w:r>
+        <w:t xml:space="preserve">   (</w:t>
+      </w:r>
+      <w:proofErr w:type="gramEnd"/>
+      <w:r>
+        <w:t>force SPI mode)</w:t>
       </w:r>
     </w:p>
     <w:p>
@@ -293,7 +443,15 @@
               </w:numPr>
             </w:pPr>
             <w:r>
-              <w:t>2.4GHz Wifi - 802.11b/g/n</w:t>
+              <w:t xml:space="preserve">2.4GHz </w:t>
+            </w:r>
+            <w:proofErr w:type="spellStart"/>
+            <w:r>
+              <w:t>Wifi</w:t>
+            </w:r>
+            <w:proofErr w:type="spellEnd"/>
+            <w:r>
+              <w:t xml:space="preserve"> - 802.11b/g/n</w:t>
             </w:r>
           </w:p>
           <w:p>
@@ -315,7 +473,6 @@
               </w:numPr>
             </w:pPr>
             <w:r>
-              <w:lastRenderedPageBreak/>
               <w:t>8MB QSPI Flash</w:t>
             </w:r>
           </w:p>
@@ -384,7 +541,6 @@
               </w:numPr>
             </w:pPr>
             <w:r>
-              <w:lastRenderedPageBreak/>
               <w:t>LiPo Battery Charging</w:t>
             </w:r>
           </w:p>
@@ -407,7 +563,15 @@
               </w:numPr>
             </w:pPr>
             <w:r>
-              <w:t>17x GPIO broken out</w:t>
+              <w:t xml:space="preserve">17x GPIO </w:t>
+            </w:r>
+            <w:proofErr w:type="gramStart"/>
+            <w:r>
+              <w:t>broken</w:t>
+            </w:r>
+            <w:proofErr w:type="gramEnd"/>
+            <w:r>
+              <w:t xml:space="preserve"> out</w:t>
             </w:r>
           </w:p>
           <w:p>
@@ -418,7 +582,6 @@
               </w:numPr>
             </w:pPr>
             <w:r>
-              <w:lastRenderedPageBreak/>
               <w:t>USB Serial JTAG support</w:t>
             </w:r>
           </w:p>
@@ -478,7 +641,6 @@
         <w:pStyle w:val="Heading2"/>
       </w:pPr>
       <w:r>
-        <w:lastRenderedPageBreak/>
         <w:t>BNO08x IMU</w:t>
       </w:r>
     </w:p>
@@ -490,7 +652,28 @@
     <w:p/>
     <w:p>
       <w:r>
-        <w:t>My smoothed_motion_energy calculations have proven to be a better indication of starting/stopping a gesture. The transition to ‘motion’ is similar but the transition to ‘stable’ takes several seconds of inactivity. I do like the transition to ‘On_TABLE’ and it could be used to go into low power mode.</w:t>
+        <w:t xml:space="preserve">My </w:t>
+      </w:r>
+      <w:proofErr w:type="spellStart"/>
+      <w:r>
+        <w:t>smoothed_motion_energy</w:t>
+      </w:r>
+      <w:proofErr w:type="spellEnd"/>
+      <w:r>
+        <w:t xml:space="preserve"> calculations have proven to be a better indication of starting/stopping a gesture. The transition to ‘motion’ is similar but the transition to ‘stable’ takes several seconds of inactivity. I do like the transition to ‘</w:t>
+      </w:r>
+      <w:proofErr w:type="spellStart"/>
+      <w:r>
+        <w:t>On_TABLE</w:t>
+      </w:r>
+      <w:proofErr w:type="spellEnd"/>
+      <w:proofErr w:type="gramStart"/>
+      <w:r>
+        <w:t>’</w:t>
+      </w:r>
+      <w:proofErr w:type="gramEnd"/>
+      <w:r>
+        <w:t xml:space="preserve"> and it could be used to go into low power mode.</w:t>
       </w:r>
     </w:p>
     <w:p>
@@ -535,7 +718,15 @@
         <w:t>Y</w:t>
       </w:r>
       <w:r>
-        <w:t>ou will need to put your board into download mode first and then flashing the respective firmware you require onto the board.</w:t>
+        <w:t xml:space="preserve">ou will need to put your board into download mode first and then </w:t>
+      </w:r>
+      <w:proofErr w:type="gramStart"/>
+      <w:r>
+        <w:t>flashing</w:t>
+      </w:r>
+      <w:proofErr w:type="gramEnd"/>
+      <w:r>
+        <w:t xml:space="preserve"> the respective firmware you require onto the board.</w:t>
       </w:r>
     </w:p>
     <w:p>
@@ -597,7 +788,15 @@
         <w:pStyle w:val="Heading4"/>
       </w:pPr>
       <w:r>
-        <w:t>Game Rotation Vector (GameRV)</w:t>
+        <w:t>Game Rotation Vector (</w:t>
+      </w:r>
+      <w:proofErr w:type="spellStart"/>
+      <w:r>
+        <w:t>GameRV</w:t>
+      </w:r>
+      <w:proofErr w:type="spellEnd"/>
+      <w:r>
+        <w:t>)</w:t>
       </w:r>
     </w:p>
     <w:p>
@@ -652,6 +851,7 @@
           <w:b/>
           <w:bCs/>
         </w:rPr>
+        <w:lastRenderedPageBreak/>
         <w:t>What it gives you</w:t>
       </w:r>
     </w:p>
@@ -665,6 +865,7 @@
       <w:r>
         <w:t xml:space="preserve">A </w:t>
       </w:r>
+      <w:proofErr w:type="gramStart"/>
       <w:r>
         <w:rPr>
           <w:b/>
@@ -672,6 +873,7 @@
         </w:rPr>
         <w:t>quaternion</w:t>
       </w:r>
+      <w:proofErr w:type="gramEnd"/>
       <w:r>
         <w:t xml:space="preserve"> representing orientation</w:t>
       </w:r>
@@ -798,7 +1000,6 @@
         </w:numPr>
       </w:pPr>
       <w:r>
-        <w:lastRenderedPageBreak/>
         <w:t>You want no sudden yaw jumps from magnetometer recalibration</w:t>
       </w:r>
     </w:p>
@@ -915,8 +1116,15 @@
           <w:numId w:val="41"/>
         </w:numPr>
       </w:pPr>
-      <w:r>
-        <w:t>Lets you remove tilt effects</w:t>
+      <w:proofErr w:type="spellStart"/>
+      <w:proofErr w:type="gramStart"/>
+      <w:r>
+        <w:t>Lets</w:t>
+      </w:r>
+      <w:proofErr w:type="spellEnd"/>
+      <w:proofErr w:type="gramEnd"/>
+      <w:r>
+        <w:t xml:space="preserve"> you remove tilt effects</w:t>
       </w:r>
     </w:p>
     <w:p>
@@ -926,8 +1134,15 @@
           <w:numId w:val="41"/>
         </w:numPr>
       </w:pPr>
-      <w:r>
-        <w:t>Lets you compute “tip direction”</w:t>
+      <w:proofErr w:type="spellStart"/>
+      <w:proofErr w:type="gramStart"/>
+      <w:r>
+        <w:t>Lets</w:t>
+      </w:r>
+      <w:proofErr w:type="spellEnd"/>
+      <w:proofErr w:type="gramEnd"/>
+      <w:r>
+        <w:t xml:space="preserve"> you compute “tip direction”</w:t>
       </w:r>
     </w:p>
     <w:p>
@@ -937,8 +1152,15 @@
           <w:numId w:val="41"/>
         </w:numPr>
       </w:pPr>
-      <w:r>
-        <w:t>Lets you detect stillness</w:t>
+      <w:proofErr w:type="spellStart"/>
+      <w:proofErr w:type="gramStart"/>
+      <w:r>
+        <w:t>Lets</w:t>
+      </w:r>
+      <w:proofErr w:type="spellEnd"/>
+      <w:proofErr w:type="gramEnd"/>
+      <w:r>
+        <w:t xml:space="preserve"> you detect stillness</w:t>
       </w:r>
     </w:p>
     <w:p>
@@ -948,8 +1170,15 @@
           <w:numId w:val="41"/>
         </w:numPr>
       </w:pPr>
-      <w:r>
-        <w:t>Lets you normalize gestures independent of wand orientation</w:t>
+      <w:proofErr w:type="spellStart"/>
+      <w:proofErr w:type="gramStart"/>
+      <w:r>
+        <w:t>Lets</w:t>
+      </w:r>
+      <w:proofErr w:type="spellEnd"/>
+      <w:proofErr w:type="gramEnd"/>
+      <w:r>
+        <w:t xml:space="preserve"> you normalize gestures independent of wand orientation</w:t>
       </w:r>
     </w:p>
     <w:p>
@@ -1206,6 +1435,7 @@
         </w:numPr>
       </w:pPr>
       <w:r>
+        <w:lastRenderedPageBreak/>
         <w:t>MOTION</w:t>
       </w:r>
     </w:p>
@@ -1253,8 +1483,15 @@
           <w:numId w:val="45"/>
         </w:numPr>
       </w:pPr>
-      <w:r>
-        <w:t>Lets you gate ML inference</w:t>
+      <w:proofErr w:type="spellStart"/>
+      <w:proofErr w:type="gramStart"/>
+      <w:r>
+        <w:t>Lets</w:t>
+      </w:r>
+      <w:proofErr w:type="spellEnd"/>
+      <w:proofErr w:type="gramEnd"/>
+      <w:r>
+        <w:t xml:space="preserve"> you gate ML inference</w:t>
       </w:r>
     </w:p>
     <w:p>
@@ -1264,8 +1501,15 @@
           <w:numId w:val="45"/>
         </w:numPr>
       </w:pPr>
-      <w:r>
-        <w:t>Lets you detect “wand is still” without thresholds</w:t>
+      <w:proofErr w:type="spellStart"/>
+      <w:proofErr w:type="gramStart"/>
+      <w:r>
+        <w:t>Lets</w:t>
+      </w:r>
+      <w:proofErr w:type="spellEnd"/>
+      <w:proofErr w:type="gramEnd"/>
+      <w:r>
+        <w:t xml:space="preserve"> you detect “wand is still” without thresholds</w:t>
       </w:r>
     </w:p>
     <w:p>
@@ -1338,7 +1582,6 @@
           <w:b/>
           <w:bCs/>
         </w:rPr>
-        <w:lastRenderedPageBreak/>
         <w:t>What it gives you</w:t>
       </w:r>
     </w:p>
@@ -1728,7 +1971,41 @@
         <w:t>exact report rates</w:t>
       </w:r>
       <w:r>
-        <w:t xml:space="preserve"> (e.g., GameRV @ 200 Hz, LinAcc @ 200 Hz, Gravity @ 100 Hz)</w:t>
+        <w:t xml:space="preserve"> (e.g., </w:t>
+      </w:r>
+      <w:proofErr w:type="spellStart"/>
+      <w:proofErr w:type="gramStart"/>
+      <w:r>
+        <w:t>GameRV</w:t>
+      </w:r>
+      <w:proofErr w:type="spellEnd"/>
+      <w:r>
+        <w:t xml:space="preserve"> @</w:t>
+      </w:r>
+      <w:proofErr w:type="gramEnd"/>
+      <w:r>
+        <w:t xml:space="preserve"> 200 Hz, </w:t>
+      </w:r>
+      <w:proofErr w:type="spellStart"/>
+      <w:proofErr w:type="gramStart"/>
+      <w:r>
+        <w:t>LinAcc</w:t>
+      </w:r>
+      <w:proofErr w:type="spellEnd"/>
+      <w:r>
+        <w:t xml:space="preserve"> @</w:t>
+      </w:r>
+      <w:proofErr w:type="gramEnd"/>
+      <w:r>
+        <w:t xml:space="preserve"> 200 Hz, </w:t>
+      </w:r>
+      <w:proofErr w:type="gramStart"/>
+      <w:r>
+        <w:t>Gravity @</w:t>
+      </w:r>
+      <w:proofErr w:type="gramEnd"/>
+      <w:r>
+        <w:t xml:space="preserve"> 100 Hz)</w:t>
       </w:r>
     </w:p>
     <w:p>
@@ -1779,7 +2056,15 @@
         </w:numPr>
       </w:pPr>
       <w:r>
-        <w:t>Show how to convert GameRV quaternions into tip</w:t>
+        <w:t xml:space="preserve">Show how to convert </w:t>
+      </w:r>
+      <w:proofErr w:type="spellStart"/>
+      <w:r>
+        <w:t>GameRV</w:t>
+      </w:r>
+      <w:proofErr w:type="spellEnd"/>
+      <w:r>
+        <w:t xml:space="preserve"> quaternions into tip</w:t>
       </w:r>
       <w:r>
         <w:noBreakHyphen/>
@@ -1813,7 +2098,17 @@
     </w:p>
     <w:p>
       <w:r>
-        <w:t>In sdkconfig.defaults, add:</w:t>
+        <w:t xml:space="preserve">In </w:t>
+      </w:r>
+      <w:proofErr w:type="spellStart"/>
+      <w:proofErr w:type="gramStart"/>
+      <w:r>
+        <w:t>sdkconfig.defaults</w:t>
+      </w:r>
+      <w:proofErr w:type="spellEnd"/>
+      <w:proofErr w:type="gramEnd"/>
+      <w:r>
+        <w:t>, add:</w:t>
       </w:r>
       <w:r>
         <w:br/>
@@ -1830,7 +2125,21 @@
         <w:rPr>
           <w:rFonts w:ascii="Courier New" w:hAnsi="Courier New" w:cs="Courier New"/>
         </w:rPr>
-        <w:t># FreeRTOS stack overflow detection</w:t>
+        <w:t xml:space="preserve"># </w:t>
+      </w:r>
+      <w:proofErr w:type="spellStart"/>
+      <w:r>
+        <w:rPr>
+          <w:rFonts w:ascii="Courier New" w:hAnsi="Courier New" w:cs="Courier New"/>
+        </w:rPr>
+        <w:t>FreeRTOS</w:t>
+      </w:r>
+      <w:proofErr w:type="spellEnd"/>
+      <w:r>
+        <w:rPr>
+          <w:rFonts w:ascii="Courier New" w:hAnsi="Courier New" w:cs="Courier New"/>
+        </w:rPr>
+        <w:t xml:space="preserve"> stack overflow detection</w:t>
       </w:r>
     </w:p>
     <w:p>
@@ -1872,6 +2181,7 @@
         <w:rPr>
           <w:rFonts w:ascii="Courier New" w:hAnsi="Courier New" w:cs="Courier New"/>
         </w:rPr>
+        <w:lastRenderedPageBreak/>
         <w:t>CONFIG_FREERTOS_ENABLE_STACK_OVERFLOW_HOOK=y</w:t>
       </w:r>
     </w:p>
@@ -1908,13 +2218,71 @@
         </w:numPr>
       </w:pPr>
       <w:r>
-        <w:t xml:space="preserve">In cmd prompt: </w:t>
-      </w:r>
-      <w:r>
-        <w:rPr>
-          <w:rFonts w:ascii="Courier New" w:hAnsi="Courier New" w:cs="Courier New"/>
-        </w:rPr>
-        <w:t>sudo usbipd attach --wsl --busid 4-9</w:t>
+        <w:t xml:space="preserve">In </w:t>
+      </w:r>
+      <w:proofErr w:type="spellStart"/>
+      <w:r>
+        <w:t>cmd</w:t>
+      </w:r>
+      <w:proofErr w:type="spellEnd"/>
+      <w:r>
+        <w:t xml:space="preserve"> prompt: </w:t>
+      </w:r>
+      <w:proofErr w:type="spellStart"/>
+      <w:r>
+        <w:rPr>
+          <w:rFonts w:ascii="Courier New" w:hAnsi="Courier New" w:cs="Courier New"/>
+        </w:rPr>
+        <w:t>sudo</w:t>
+      </w:r>
+      <w:proofErr w:type="spellEnd"/>
+      <w:r>
+        <w:rPr>
+          <w:rFonts w:ascii="Courier New" w:hAnsi="Courier New" w:cs="Courier New"/>
+        </w:rPr>
+        <w:t xml:space="preserve"> </w:t>
+      </w:r>
+      <w:proofErr w:type="spellStart"/>
+      <w:r>
+        <w:rPr>
+          <w:rFonts w:ascii="Courier New" w:hAnsi="Courier New" w:cs="Courier New"/>
+        </w:rPr>
+        <w:t>usbipd</w:t>
+      </w:r>
+      <w:proofErr w:type="spellEnd"/>
+      <w:r>
+        <w:rPr>
+          <w:rFonts w:ascii="Courier New" w:hAnsi="Courier New" w:cs="Courier New"/>
+        </w:rPr>
+        <w:t xml:space="preserve"> attach --</w:t>
+      </w:r>
+      <w:proofErr w:type="spellStart"/>
+      <w:r>
+        <w:rPr>
+          <w:rFonts w:ascii="Courier New" w:hAnsi="Courier New" w:cs="Courier New"/>
+        </w:rPr>
+        <w:t>wsl</w:t>
+      </w:r>
+      <w:proofErr w:type="spellEnd"/>
+      <w:r>
+        <w:rPr>
+          <w:rFonts w:ascii="Courier New" w:hAnsi="Courier New" w:cs="Courier New"/>
+        </w:rPr>
+        <w:t xml:space="preserve"> --</w:t>
+      </w:r>
+      <w:proofErr w:type="spellStart"/>
+      <w:r>
+        <w:rPr>
+          <w:rFonts w:ascii="Courier New" w:hAnsi="Courier New" w:cs="Courier New"/>
+        </w:rPr>
+        <w:t>busid</w:t>
+      </w:r>
+      <w:proofErr w:type="spellEnd"/>
+      <w:r>
+        <w:rPr>
+          <w:rFonts w:ascii="Courier New" w:hAnsi="Courier New" w:cs="Courier New"/>
+        </w:rPr>
+        <w:t xml:space="preserve"> 4-9</w:t>
       </w:r>
     </w:p>
     <w:p>
@@ -1960,19 +2328,7 @@
           <w:rPr>
             <w:rStyle w:val="Hyperlink"/>
           </w:rPr>
-          <w:t>Motion recognition</w:t>
-        </w:r>
-        <w:r>
-          <w:rPr>
-            <w:rStyle w:val="Hyperlink"/>
-          </w:rPr>
-          <w:t xml:space="preserve"> </w:t>
-        </w:r>
-        <w:r>
-          <w:rPr>
-            <w:rStyle w:val="Hyperlink"/>
-          </w:rPr>
-          <w:t>with anomaly detection - Edge Impulse Documentation</w:t>
+          <w:t>Motion recognition with anomaly detection - Edge Impulse Documentation</w:t>
         </w:r>
       </w:hyperlink>
     </w:p>
@@ -2000,7 +2356,6 @@
         </w:numPr>
       </w:pPr>
       <w:r>
-        <w:lastRenderedPageBreak/>
         <w:t>Remove noise, irrelevant signals</w:t>
       </w:r>
     </w:p>
@@ -2120,8 +2475,30 @@
         <w:rPr>
           <w:rFonts w:ascii="Courier New" w:hAnsi="Courier New" w:cs="Courier New"/>
         </w:rPr>
-        <w:t>normalized = (raw_value - mean) / max_abs_value</w:t>
-      </w:r>
+        <w:t>normalized = (</w:t>
+      </w:r>
+      <w:proofErr w:type="spellStart"/>
+      <w:r>
+        <w:rPr>
+          <w:rFonts w:ascii="Courier New" w:hAnsi="Courier New" w:cs="Courier New"/>
+        </w:rPr>
+        <w:t>raw_value</w:t>
+      </w:r>
+      <w:proofErr w:type="spellEnd"/>
+      <w:r>
+        <w:rPr>
+          <w:rFonts w:ascii="Courier New" w:hAnsi="Courier New" w:cs="Courier New"/>
+        </w:rPr>
+        <w:t xml:space="preserve"> - mean) / </w:t>
+      </w:r>
+      <w:proofErr w:type="spellStart"/>
+      <w:r>
+        <w:rPr>
+          <w:rFonts w:ascii="Courier New" w:hAnsi="Courier New" w:cs="Courier New"/>
+        </w:rPr>
+        <w:t>max_abs_value</w:t>
+      </w:r>
+      <w:proofErr w:type="spellEnd"/>
     </w:p>
     <w:p>
       <w:pPr>
@@ -2132,7 +2509,15 @@
         </w:numPr>
       </w:pPr>
       <w:r>
-        <w:t>Assuming Accel [-2.0, +2.0]g and Gyro [-250, 250]</w:t>
+        <w:t>Assuming Accel [-2.0, +2.</w:t>
+      </w:r>
+      <w:proofErr w:type="gramStart"/>
+      <w:r>
+        <w:t>0]g</w:t>
+      </w:r>
+      <w:proofErr w:type="gramEnd"/>
+      <w:r>
+        <w:t xml:space="preserve"> and Gyro [-250, 250]</w:t>
       </w:r>
       <w:r>
         <w:t xml:space="preserve"> </w:t>
@@ -2148,18 +2533,81 @@
           <w:rFonts w:ascii="Courier New" w:hAnsi="Courier New" w:cs="Courier New"/>
         </w:rPr>
       </w:pPr>
-      <w:r>
-        <w:rPr>
-          <w:rFonts w:ascii="Courier New" w:hAnsi="Courier New" w:cs="Courier New"/>
-        </w:rPr>
-        <w:t>accel_norm = accel_g / 4.0      // ±4g range</w:t>
+      <w:proofErr w:type="spellStart"/>
+      <w:r>
+        <w:rPr>
+          <w:rFonts w:ascii="Courier New" w:hAnsi="Courier New" w:cs="Courier New"/>
+        </w:rPr>
+        <w:t>accel_norm</w:t>
+      </w:r>
+      <w:proofErr w:type="spellEnd"/>
+      <w:r>
+        <w:rPr>
+          <w:rFonts w:ascii="Courier New" w:hAnsi="Courier New" w:cs="Courier New"/>
+        </w:rPr>
+        <w:t xml:space="preserve"> = </w:t>
+      </w:r>
+      <w:proofErr w:type="spellStart"/>
+      <w:r>
+        <w:rPr>
+          <w:rFonts w:ascii="Courier New" w:hAnsi="Courier New" w:cs="Courier New"/>
+        </w:rPr>
+        <w:t>accel_g</w:t>
+      </w:r>
+      <w:proofErr w:type="spellEnd"/>
+      <w:r>
+        <w:rPr>
+          <w:rFonts w:ascii="Courier New" w:hAnsi="Courier New" w:cs="Courier New"/>
+        </w:rPr>
+        <w:t xml:space="preserve"> / 4.0      // ±4g range</w:t>
       </w:r>
       <w:r>
         <w:rPr>
           <w:rFonts w:ascii="Courier New" w:hAnsi="Courier New" w:cs="Courier New"/>
         </w:rPr>
         <w:br/>
-        <w:t>gyro_norm  = gyro_dps / 500.0   // ±500°/s range</w:t>
+      </w:r>
+      <w:proofErr w:type="spellStart"/>
+      <w:r>
+        <w:rPr>
+          <w:rFonts w:ascii="Courier New" w:hAnsi="Courier New" w:cs="Courier New"/>
+        </w:rPr>
+        <w:t>gyro_</w:t>
+      </w:r>
+      <w:proofErr w:type="gramStart"/>
+      <w:r>
+        <w:rPr>
+          <w:rFonts w:ascii="Courier New" w:hAnsi="Courier New" w:cs="Courier New"/>
+        </w:rPr>
+        <w:t>norm</w:t>
+      </w:r>
+      <w:proofErr w:type="spellEnd"/>
+      <w:r>
+        <w:rPr>
+          <w:rFonts w:ascii="Courier New" w:hAnsi="Courier New" w:cs="Courier New"/>
+        </w:rPr>
+        <w:t xml:space="preserve">  =</w:t>
+      </w:r>
+      <w:proofErr w:type="gramEnd"/>
+      <w:r>
+        <w:rPr>
+          <w:rFonts w:ascii="Courier New" w:hAnsi="Courier New" w:cs="Courier New"/>
+        </w:rPr>
+        <w:t xml:space="preserve"> </w:t>
+      </w:r>
+      <w:proofErr w:type="spellStart"/>
+      <w:r>
+        <w:rPr>
+          <w:rFonts w:ascii="Courier New" w:hAnsi="Courier New" w:cs="Courier New"/>
+        </w:rPr>
+        <w:t>gyro_dps</w:t>
+      </w:r>
+      <w:proofErr w:type="spellEnd"/>
+      <w:r>
+        <w:rPr>
+          <w:rFonts w:ascii="Courier New" w:hAnsi="Courier New" w:cs="Courier New"/>
+        </w:rPr>
+        <w:t xml:space="preserve"> / 500.0   // ±500°/s range</w:t>
       </w:r>
     </w:p>
     <w:p>
@@ -2206,7 +2654,34 @@
           <w:rFonts w:ascii="Courier New" w:hAnsi="Courier New" w:cs="Courier New"/>
         </w:rPr>
         <w:br/>
-        <w:t>mpu.dmpGetQuaternion(&amp;q, fifoBuffer);</w:t>
+      </w:r>
+      <w:proofErr w:type="spellStart"/>
+      <w:r>
+        <w:rPr>
+          <w:rFonts w:ascii="Courier New" w:hAnsi="Courier New" w:cs="Courier New"/>
+        </w:rPr>
+        <w:t>mpu.dmpGetQuaternion</w:t>
+      </w:r>
+      <w:proofErr w:type="spellEnd"/>
+      <w:r>
+        <w:rPr>
+          <w:rFonts w:ascii="Courier New" w:hAnsi="Courier New" w:cs="Courier New"/>
+        </w:rPr>
+        <w:t xml:space="preserve">(&amp;q, </w:t>
+      </w:r>
+      <w:proofErr w:type="spellStart"/>
+      <w:r>
+        <w:rPr>
+          <w:rFonts w:ascii="Courier New" w:hAnsi="Courier New" w:cs="Courier New"/>
+        </w:rPr>
+        <w:t>fifoBuffer</w:t>
+      </w:r>
+      <w:proofErr w:type="spellEnd"/>
+      <w:r>
+        <w:rPr>
+          <w:rFonts w:ascii="Courier New" w:hAnsi="Courier New" w:cs="Courier New"/>
+        </w:rPr>
+        <w:t>);</w:t>
       </w:r>
       <w:r>
         <w:rPr>
@@ -2245,14 +2720,40 @@
           <w:rFonts w:ascii="Courier New" w:hAnsi="Courier New" w:cs="Courier New"/>
         </w:rPr>
         <w:br/>
-        <w:t>VectorFloat gravity;</w:t>
+      </w:r>
+      <w:proofErr w:type="spellStart"/>
+      <w:r>
+        <w:rPr>
+          <w:rFonts w:ascii="Courier New" w:hAnsi="Courier New" w:cs="Courier New"/>
+        </w:rPr>
+        <w:t>VectorFloat</w:t>
+      </w:r>
+      <w:proofErr w:type="spellEnd"/>
+      <w:r>
+        <w:rPr>
+          <w:rFonts w:ascii="Courier New" w:hAnsi="Courier New" w:cs="Courier New"/>
+        </w:rPr>
+        <w:t xml:space="preserve"> gravity;</w:t>
       </w:r>
       <w:r>
         <w:rPr>
           <w:rFonts w:ascii="Courier New" w:hAnsi="Courier New" w:cs="Courier New"/>
         </w:rPr>
         <w:br/>
-        <w:t>mpu.dmpGetGravity(&amp;gravity, &amp;q);</w:t>
+      </w:r>
+      <w:proofErr w:type="spellStart"/>
+      <w:r>
+        <w:rPr>
+          <w:rFonts w:ascii="Courier New" w:hAnsi="Courier New" w:cs="Courier New"/>
+        </w:rPr>
+        <w:t>mpu.dmpGetGravity</w:t>
+      </w:r>
+      <w:proofErr w:type="spellEnd"/>
+      <w:r>
+        <w:rPr>
+          <w:rFonts w:ascii="Courier New" w:hAnsi="Courier New" w:cs="Courier New"/>
+        </w:rPr>
+        <w:t>(&amp;gravity, &amp;q);</w:t>
       </w:r>
       <w:r>
         <w:rPr>
@@ -2265,14 +2766,55 @@
           <w:rFonts w:ascii="Courier New" w:hAnsi="Courier New" w:cs="Courier New"/>
         </w:rPr>
         <w:br/>
-        <w:t>VectorInt16 aaReal;</w:t>
+        <w:t xml:space="preserve">VectorInt16 </w:t>
+      </w:r>
+      <w:proofErr w:type="spellStart"/>
+      <w:r>
+        <w:rPr>
+          <w:rFonts w:ascii="Courier New" w:hAnsi="Courier New" w:cs="Courier New"/>
+        </w:rPr>
+        <w:t>aaReal</w:t>
+      </w:r>
+      <w:proofErr w:type="spellEnd"/>
+      <w:r>
+        <w:rPr>
+          <w:rFonts w:ascii="Courier New" w:hAnsi="Courier New" w:cs="Courier New"/>
+        </w:rPr>
+        <w:t>;</w:t>
       </w:r>
       <w:r>
         <w:rPr>
           <w:rFonts w:ascii="Courier New" w:hAnsi="Courier New" w:cs="Courier New"/>
         </w:rPr>
         <w:br/>
-        <w:t>mpu.dmpGetLinearAccel(&amp;aaReal, &amp;aa, &amp;gravity);</w:t>
+      </w:r>
+      <w:proofErr w:type="spellStart"/>
+      <w:r>
+        <w:rPr>
+          <w:rFonts w:ascii="Courier New" w:hAnsi="Courier New" w:cs="Courier New"/>
+        </w:rPr>
+        <w:t>mpu.dmpGetLinearAccel</w:t>
+      </w:r>
+      <w:proofErr w:type="spellEnd"/>
+      <w:r>
+        <w:rPr>
+          <w:rFonts w:ascii="Courier New" w:hAnsi="Courier New" w:cs="Courier New"/>
+        </w:rPr>
+        <w:t>(&amp;</w:t>
+      </w:r>
+      <w:proofErr w:type="spellStart"/>
+      <w:r>
+        <w:rPr>
+          <w:rFonts w:ascii="Courier New" w:hAnsi="Courier New" w:cs="Courier New"/>
+        </w:rPr>
+        <w:t>aaReal</w:t>
+      </w:r>
+      <w:proofErr w:type="spellEnd"/>
+      <w:r>
+        <w:rPr>
+          <w:rFonts w:ascii="Courier New" w:hAnsi="Courier New" w:cs="Courier New"/>
+        </w:rPr>
+        <w:t>, &amp;aa, &amp;gravity);</w:t>
       </w:r>
       <w:r>
         <w:rPr>
@@ -2292,14 +2834,82 @@
           <w:rFonts w:ascii="Courier New" w:hAnsi="Courier New" w:cs="Courier New"/>
         </w:rPr>
         <w:br/>
-        <w:t>VectorFloat aaWorld;</w:t>
+      </w:r>
+      <w:proofErr w:type="spellStart"/>
+      <w:r>
+        <w:rPr>
+          <w:rFonts w:ascii="Courier New" w:hAnsi="Courier New" w:cs="Courier New"/>
+        </w:rPr>
+        <w:t>VectorFloat</w:t>
+      </w:r>
+      <w:proofErr w:type="spellEnd"/>
+      <w:r>
+        <w:rPr>
+          <w:rFonts w:ascii="Courier New" w:hAnsi="Courier New" w:cs="Courier New"/>
+        </w:rPr>
+        <w:t xml:space="preserve"> </w:t>
+      </w:r>
+      <w:proofErr w:type="spellStart"/>
+      <w:r>
+        <w:rPr>
+          <w:rFonts w:ascii="Courier New" w:hAnsi="Courier New" w:cs="Courier New"/>
+        </w:rPr>
+        <w:t>aaWorld</w:t>
+      </w:r>
+      <w:proofErr w:type="spellEnd"/>
+      <w:r>
+        <w:rPr>
+          <w:rFonts w:ascii="Courier New" w:hAnsi="Courier New" w:cs="Courier New"/>
+        </w:rPr>
+        <w:t>;</w:t>
       </w:r>
       <w:r>
         <w:rPr>
           <w:rFonts w:ascii="Courier New" w:hAnsi="Courier New" w:cs="Courier New"/>
         </w:rPr>
         <w:br/>
-        <w:t>mpu.dmpGetLinearAccelInWorld(&amp;aaWorld, &amp;aaReal, &amp;q);</w:t>
+      </w:r>
+      <w:proofErr w:type="spellStart"/>
+      <w:r>
+        <w:rPr>
+          <w:rFonts w:ascii="Courier New" w:hAnsi="Courier New" w:cs="Courier New"/>
+        </w:rPr>
+        <w:t>mpu.dmpGetLinearAccelInWorld</w:t>
+      </w:r>
+      <w:proofErr w:type="spellEnd"/>
+      <w:r>
+        <w:rPr>
+          <w:rFonts w:ascii="Courier New" w:hAnsi="Courier New" w:cs="Courier New"/>
+        </w:rPr>
+        <w:t>(&amp;</w:t>
+      </w:r>
+      <w:proofErr w:type="spellStart"/>
+      <w:r>
+        <w:rPr>
+          <w:rFonts w:ascii="Courier New" w:hAnsi="Courier New" w:cs="Courier New"/>
+        </w:rPr>
+        <w:t>aaWorld</w:t>
+      </w:r>
+      <w:proofErr w:type="spellEnd"/>
+      <w:r>
+        <w:rPr>
+          <w:rFonts w:ascii="Courier New" w:hAnsi="Courier New" w:cs="Courier New"/>
+        </w:rPr>
+        <w:t>, &amp;</w:t>
+      </w:r>
+      <w:proofErr w:type="spellStart"/>
+      <w:r>
+        <w:rPr>
+          <w:rFonts w:ascii="Courier New" w:hAnsi="Courier New" w:cs="Courier New"/>
+        </w:rPr>
+        <w:t>aaReal</w:t>
+      </w:r>
+      <w:proofErr w:type="spellEnd"/>
+      <w:r>
+        <w:rPr>
+          <w:rFonts w:ascii="Courier New" w:hAnsi="Courier New" w:cs="Courier New"/>
+        </w:rPr>
+        <w:t>, &amp;q);</w:t>
       </w:r>
       <w:r>
         <w:rPr>
@@ -2320,14 +2930,17 @@
         </w:rPr>
         <w:br/>
       </w:r>
+      <w:proofErr w:type="spellStart"/>
       <w:r>
         <w:rPr>
           <w:rFonts w:ascii="Courier New" w:hAnsi="Courier New" w:cs="Courier New"/>
           <w:b/>
           <w:bCs/>
         </w:rPr>
+        <w:lastRenderedPageBreak/>
         <w:t>aaWorld.x</w:t>
       </w:r>
+      <w:proofErr w:type="spellEnd"/>
       <w:r>
         <w:rPr>
           <w:rFonts w:ascii="Courier New" w:hAnsi="Courier New" w:cs="Courier New"/>
@@ -2340,6 +2953,7 @@
         </w:rPr>
         <w:br/>
       </w:r>
+      <w:proofErr w:type="spellStart"/>
       <w:r>
         <w:rPr>
           <w:rFonts w:ascii="Courier New" w:hAnsi="Courier New" w:cs="Courier New"/>
@@ -2348,6 +2962,7 @@
         </w:rPr>
         <w:t>aaWorld.y</w:t>
       </w:r>
+      <w:proofErr w:type="spellEnd"/>
       <w:r>
         <w:rPr>
           <w:rFonts w:ascii="Courier New" w:hAnsi="Courier New" w:cs="Courier New"/>
@@ -2360,6 +2975,7 @@
         </w:rPr>
         <w:br/>
       </w:r>
+      <w:proofErr w:type="spellStart"/>
       <w:r>
         <w:rPr>
           <w:rFonts w:ascii="Courier New" w:hAnsi="Courier New" w:cs="Courier New"/>
@@ -2368,6 +2984,7 @@
         </w:rPr>
         <w:t>aaWorld.z</w:t>
       </w:r>
+      <w:proofErr w:type="spellEnd"/>
       <w:r>
         <w:rPr>
           <w:rFonts w:ascii="Courier New" w:hAnsi="Courier New" w:cs="Courier New"/>
@@ -2453,7 +3070,6 @@
         </w:numPr>
       </w:pPr>
       <w:r>
-        <w:lastRenderedPageBreak/>
         <w:t>most relevant features identified and retained for model training while removing redundant or irrelevant features</w:t>
       </w:r>
     </w:p>
@@ -2485,8 +3101,16 @@
           <w:rPr>
             <w:rStyle w:val="Hyperlink"/>
           </w:rPr>
-          <w:t>Conv1D (32 filters, kernel=3) + ReLU</w:t>
+          <w:t xml:space="preserve">Conv1D (32 filters, kernel=3) + </w:t>
         </w:r>
+        <w:proofErr w:type="spellStart"/>
+        <w:r>
+          <w:rPr>
+            <w:rStyle w:val="Hyperlink"/>
+          </w:rPr>
+          <w:t>ReLU</w:t>
+        </w:r>
+        <w:proofErr w:type="spellEnd"/>
       </w:hyperlink>
     </w:p>
     <w:p>
@@ -2510,8 +3134,13 @@
         </w:numPr>
       </w:pPr>
       <w:r>
-        <w:t>Conv1D (64 filters, kernel=3) + ReLU</w:t>
-      </w:r>
+        <w:t xml:space="preserve">Conv1D (64 filters, kernel=3) + </w:t>
+      </w:r>
+      <w:proofErr w:type="spellStart"/>
+      <w:r>
+        <w:t>ReLU</w:t>
+      </w:r>
+      <w:proofErr w:type="spellEnd"/>
     </w:p>
     <w:p>
       <w:pPr>
@@ -2546,7 +3175,23 @@
         </w:numPr>
       </w:pPr>
       <w:r>
-        <w:t>Dense (64 units) + ReLU + Dropout(0.5)</w:t>
+        <w:t xml:space="preserve">Dense (64 units) + </w:t>
+      </w:r>
+      <w:proofErr w:type="spellStart"/>
+      <w:r>
+        <w:t>ReLU</w:t>
+      </w:r>
+      <w:proofErr w:type="spellEnd"/>
+      <w:r>
+        <w:t xml:space="preserve"> + </w:t>
+      </w:r>
+      <w:proofErr w:type="gramStart"/>
+      <w:r>
+        <w:t>Dropout(</w:t>
+      </w:r>
+      <w:proofErr w:type="gramEnd"/>
+      <w:r>
+        <w:t>0.5)</w:t>
       </w:r>
     </w:p>
     <w:p>
@@ -2558,7 +3203,15 @@
         </w:numPr>
       </w:pPr>
       <w:r>
-        <w:t>Dense (3 units) + Softmax → movement class output</w:t>
+        <w:t xml:space="preserve">Dense (3 units) + </w:t>
+      </w:r>
+      <w:proofErr w:type="spellStart"/>
+      <w:r>
+        <w:t>Softmax</w:t>
+      </w:r>
+      <w:proofErr w:type="spellEnd"/>
+      <w:r>
+        <w:t xml:space="preserve"> → movement class output</w:t>
       </w:r>
     </w:p>
     <w:p>
@@ -2708,28 +3361,24 @@
           <w:numId w:val="30"/>
         </w:numPr>
       </w:pPr>
+      <w:proofErr w:type="spellStart"/>
+      <w:proofErr w:type="gramStart"/>
       <w:r>
         <w:rPr>
           <w:b/>
           <w:bCs/>
         </w:rPr>
-        <w:t>sensor.wand_last_gesture</w:t>
-      </w:r>
-    </w:p>
-    <w:p>
-      <w:pPr>
-        <w:numPr>
-          <w:ilvl w:val="0"/>
-          <w:numId w:val="30"/>
-        </w:numPr>
-      </w:pPr>
+        <w:t>sensor.wand</w:t>
+      </w:r>
+      <w:proofErr w:type="gramEnd"/>
       <w:r>
         <w:rPr>
           <w:b/>
           <w:bCs/>
         </w:rPr>
-        <w:t>sensor.wand_battery</w:t>
-      </w:r>
+        <w:t>_last_gesture</w:t>
+      </w:r>
+      <w:proofErr w:type="spellEnd"/>
     </w:p>
     <w:p>
       <w:pPr>
@@ -2738,48 +3387,86 @@
           <w:numId w:val="30"/>
         </w:numPr>
       </w:pPr>
+      <w:proofErr w:type="spellStart"/>
+      <w:proofErr w:type="gramStart"/>
       <w:r>
         <w:rPr>
           <w:b/>
           <w:bCs/>
         </w:rPr>
-        <w:t>sensor.wand_rssi</w:t>
-      </w:r>
-    </w:p>
-    <w:p>
-      <w:pPr>
-        <w:pStyle w:val="Heading3"/>
+        <w:t>sensor.wand</w:t>
+      </w:r>
+      <w:proofErr w:type="gramEnd"/>
+      <w:r>
         <w:rPr>
           <w:b/>
           <w:bCs/>
         </w:rPr>
-      </w:pPr>
+        <w:t>_battery</w:t>
+      </w:r>
+      <w:proofErr w:type="spellEnd"/>
+    </w:p>
+    <w:p>
+      <w:pPr>
+        <w:numPr>
+          <w:ilvl w:val="0"/>
+          <w:numId w:val="30"/>
+        </w:numPr>
+      </w:pPr>
+      <w:proofErr w:type="spellStart"/>
+      <w:proofErr w:type="gramStart"/>
       <w:r>
         <w:rPr>
           <w:b/>
           <w:bCs/>
         </w:rPr>
-        <w:t>Zero YAML required</w:t>
-      </w:r>
-    </w:p>
-    <w:p>
-      <w:r>
-        <w:t>Everything is created dynamically via MQTT discovery.</w:t>
-      </w:r>
-    </w:p>
-    <w:p>
-      <w:pPr>
-        <w:pStyle w:val="Heading3"/>
+        <w:t>sensor.wand</w:t>
+      </w:r>
+      <w:proofErr w:type="gramEnd"/>
+      <w:r>
         <w:rPr>
           <w:b/>
           <w:bCs/>
         </w:rPr>
-      </w:pPr>
-      <w:r>
+        <w:t>_rssi</w:t>
+      </w:r>
+      <w:proofErr w:type="spellEnd"/>
+    </w:p>
+    <w:p>
+      <w:pPr>
+        <w:pStyle w:val="Heading3"/>
         <w:rPr>
           <w:b/>
           <w:bCs/>
         </w:rPr>
+      </w:pPr>
+      <w:r>
+        <w:rPr>
+          <w:b/>
+          <w:bCs/>
+        </w:rPr>
+        <w:t>Zero YAML required</w:t>
+      </w:r>
+    </w:p>
+    <w:p>
+      <w:r>
+        <w:t>Everything is created dynamically via MQTT discovery.</w:t>
+      </w:r>
+    </w:p>
+    <w:p>
+      <w:pPr>
+        <w:pStyle w:val="Heading3"/>
+        <w:rPr>
+          <w:b/>
+          <w:bCs/>
+        </w:rPr>
+      </w:pPr>
+      <w:r>
+        <w:rPr>
+          <w:b/>
+          <w:bCs/>
+        </w:rPr>
+        <w:lastRenderedPageBreak/>
         <w:t>Works with the HA UI</w:t>
       </w:r>
     </w:p>
@@ -2806,7 +3493,15 @@
         <w:t>Magic Wand → Last Gesture</w:t>
       </w:r>
       <w:r>
-        <w:t xml:space="preserve"> becomes swipe_left, turn on lights”</w:t>
+        <w:t xml:space="preserve"> becomes </w:t>
+      </w:r>
+      <w:proofErr w:type="spellStart"/>
+      <w:r>
+        <w:t>swipe_left</w:t>
+      </w:r>
+      <w:proofErr w:type="spellEnd"/>
+      <w:r>
+        <w:t>, turn on lights”</w:t>
       </w:r>
     </w:p>
     <w:p>
@@ -2854,7 +3549,6 @@
           <w:b/>
           <w:bCs/>
         </w:rPr>
-        <w:lastRenderedPageBreak/>
         <w:t xml:space="preserve">The Home Assistant dashboard card </w:t>
       </w:r>
       <w:r>
@@ -2936,54 +3630,71 @@
           <w:bCs/>
         </w:rPr>
         <w:noBreakHyphen/>
-        <w:t>Fi health at a glance</w:t>
-      </w:r>
-    </w:p>
-    <w:p>
-      <w:r>
-        <w:t>Useful for debugging range or power issues.</w:t>
-      </w:r>
-    </w:p>
-    <w:p>
-      <w:pPr>
-        <w:pStyle w:val="Heading3"/>
+        <w:t xml:space="preserve">Fi health </w:t>
+      </w:r>
+      <w:proofErr w:type="gramStart"/>
+      <w:r>
         <w:rPr>
           <w:b/>
           <w:bCs/>
         </w:rPr>
-      </w:pPr>
-      <w:r>
+        <w:t>at a glance</w:t>
+      </w:r>
+      <w:proofErr w:type="gramEnd"/>
+    </w:p>
+    <w:p>
+      <w:r>
+        <w:t>Useful for debugging range or power issues.</w:t>
+      </w:r>
+    </w:p>
+    <w:p>
+      <w:pPr>
+        <w:pStyle w:val="Heading3"/>
         <w:rPr>
           <w:b/>
           <w:bCs/>
         </w:rPr>
-        <w:t>Gesture history graph</w:t>
-      </w:r>
-    </w:p>
-    <w:p>
-      <w:r>
-        <w:t>Great for validating your ML model and seeing how often gestures fire.</w:t>
-      </w:r>
-    </w:p>
-    <w:p>
-      <w:pPr>
-        <w:pStyle w:val="Heading3"/>
+      </w:pPr>
+      <w:r>
         <w:rPr>
           <w:b/>
           <w:bCs/>
         </w:rPr>
-      </w:pPr>
-      <w:r>
+        <w:t>Gesture history graph</w:t>
+      </w:r>
+    </w:p>
+    <w:p>
+      <w:r>
+        <w:t>Great for validating your ML model and seeing how often gestures fire.</w:t>
+      </w:r>
+    </w:p>
+    <w:p>
+      <w:pPr>
+        <w:pStyle w:val="Heading3"/>
         <w:rPr>
           <w:b/>
           <w:bCs/>
         </w:rPr>
+      </w:pPr>
+      <w:r>
+        <w:rPr>
+          <w:b/>
+          <w:bCs/>
+        </w:rPr>
         <w:t>Fully compatible with your MQTT Discovery setup</w:t>
       </w:r>
     </w:p>
     <w:p>
       <w:r>
-        <w:t>No manual entity creation needed — HA already knows about the wand.</w:t>
+        <w:t xml:space="preserve">No manual entity creation </w:t>
+      </w:r>
+      <w:proofErr w:type="gramStart"/>
+      <w:r>
+        <w:t>needed —</w:t>
+      </w:r>
+      <w:proofErr w:type="gramEnd"/>
+      <w:r>
+        <w:t xml:space="preserve"> HA already knows about the wand.</w:t>
       </w:r>
     </w:p>
     <w:p>
@@ -2997,7 +3708,15 @@
       </w:pPr>
       <w:r>
         <w:lastRenderedPageBreak/>
-        <w:t>Use the Espressif IDF</w:t>
+        <w:t xml:space="preserve">Use the </w:t>
+      </w:r>
+      <w:proofErr w:type="spellStart"/>
+      <w:r>
+        <w:t>Espressif</w:t>
+      </w:r>
+      <w:proofErr w:type="spellEnd"/>
+      <w:r>
+        <w:t xml:space="preserve"> IDF</w:t>
       </w:r>
     </w:p>
     <w:p>
@@ -3012,7 +3731,15 @@
     </w:p>
     <w:p>
       <w:r>
-        <w:t>Allows complete control of power management that should give months of standby life by using low-power accelerometer mode with ESP32 in deep sleep with wake on interrupt.</w:t>
+        <w:t xml:space="preserve">Allows complete control of power management that should give months of standby life by using low-power accelerometer mode with ESP32 in deep sleep with wake on </w:t>
+      </w:r>
+      <w:proofErr w:type="gramStart"/>
+      <w:r>
+        <w:t>interrupt</w:t>
+      </w:r>
+      <w:proofErr w:type="gramEnd"/>
+      <w:r>
+        <w:t>.</w:t>
       </w:r>
     </w:p>
     <w:p>
@@ -3132,7 +3859,15 @@
     </w:p>
     <w:p>
       <w:r>
-        <w:t>How do you “enchant” your wand with new spells (ie gestures and assigned actions). Web UI? Can the ML be trained on device</w:t>
+        <w:t>How do you “enchant” your wand with new spells (</w:t>
+      </w:r>
+      <w:proofErr w:type="spellStart"/>
+      <w:r>
+        <w:t>ie</w:t>
+      </w:r>
+      <w:proofErr w:type="spellEnd"/>
+      <w:r>
+        <w:t xml:space="preserve"> gestures and assigned actions). Web UI? Can the ML be trained on device</w:t>
       </w:r>
       <w:r>
         <w:t xml:space="preserve"> (probably not)</w:t>
@@ -3146,7 +3881,15 @@
         <w:pStyle w:val="Heading2"/>
       </w:pPr>
       <w:r>
-        <w:t>TensorFlow on the Waveshare ESP32</w:t>
+        <w:t xml:space="preserve">TensorFlow on the </w:t>
+      </w:r>
+      <w:proofErr w:type="spellStart"/>
+      <w:r>
+        <w:t>Waveshare</w:t>
+      </w:r>
+      <w:proofErr w:type="spellEnd"/>
+      <w:r>
+        <w:t xml:space="preserve"> ESP32</w:t>
       </w:r>
       <w:r>
         <w:noBreakHyphen/>
@@ -3169,7 +3912,15 @@
       </w:r>
       <w:r>
         <w:noBreakHyphen/>
-        <w:t>S3, including the Waveshare ESP32</w:t>
+        <w:t xml:space="preserve">S3, including the </w:t>
+      </w:r>
+      <w:proofErr w:type="spellStart"/>
+      <w:r>
+        <w:t>Waveshare</w:t>
+      </w:r>
+      <w:proofErr w:type="spellEnd"/>
+      <w:r>
+        <w:t xml:space="preserve"> ESP32</w:t>
       </w:r>
       <w:r>
         <w:noBreakHyphen/>
@@ -3182,8 +3933,13 @@
       </w:r>
       <w:r>
         <w:noBreakHyphen/>
-        <w:t>S3 is one of the microcontrollers explicitly supported by the TFLM port maintained by Espressif</w:t>
-      </w:r>
+        <w:t xml:space="preserve">S3 is one of the microcontrollers explicitly supported by the TFLM port maintained by </w:t>
+      </w:r>
+      <w:proofErr w:type="spellStart"/>
+      <w:r>
+        <w:t>Espressif</w:t>
+      </w:r>
+      <w:proofErr w:type="spellEnd"/>
       <w:r>
         <w:t xml:space="preserve"> which </w:t>
       </w:r>
@@ -3305,7 +4061,15 @@
     </w:p>
     <w:p>
       <w:r>
-        <w:t>All in real time on the Waveshare ESP32</w:t>
+        <w:t xml:space="preserve">All in real time on the </w:t>
+      </w:r>
+      <w:proofErr w:type="spellStart"/>
+      <w:r>
+        <w:t>Waveshare</w:t>
+      </w:r>
+      <w:proofErr w:type="spellEnd"/>
+      <w:r>
+        <w:t xml:space="preserve"> ESP32</w:t>
       </w:r>
       <w:r>
         <w:noBreakHyphen/>
@@ -3327,7 +4091,23 @@
           <w:b/>
           <w:bCs/>
         </w:rPr>
-        <w:t>&lt;10 ms inference time</w:t>
+        <w:t xml:space="preserve">&lt;10 </w:t>
+      </w:r>
+      <w:proofErr w:type="spellStart"/>
+      <w:r>
+        <w:rPr>
+          <w:b/>
+          <w:bCs/>
+        </w:rPr>
+        <w:t>ms</w:t>
+      </w:r>
+      <w:proofErr w:type="spellEnd"/>
+      <w:r>
+        <w:rPr>
+          <w:b/>
+          <w:bCs/>
+        </w:rPr>
+        <w:t xml:space="preserve"> inference time</w:t>
       </w:r>
       <w:r>
         <w:t xml:space="preserve"> on ESP32</w:t>
@@ -3349,8 +4129,17 @@
           <w:b/>
           <w:bCs/>
         </w:rPr>
-        <w:t>&lt;5 ms</w:t>
-      </w:r>
+        <w:t xml:space="preserve">&lt;5 </w:t>
+      </w:r>
+      <w:proofErr w:type="spellStart"/>
+      <w:r>
+        <w:rPr>
+          <w:b/>
+          <w:bCs/>
+        </w:rPr>
+        <w:t>ms</w:t>
+      </w:r>
+      <w:proofErr w:type="spellEnd"/>
       <w:r>
         <w:t xml:space="preserve"> if using pure 1D</w:t>
       </w:r>
@@ -3482,7 +4271,23 @@
           <w:b/>
           <w:bCs/>
         </w:rPr>
-        <w:t>1D CNN → DepthwiseConv → GRU → Dense</w:t>
+        <w:t xml:space="preserve">1D CNN → </w:t>
+      </w:r>
+      <w:proofErr w:type="spellStart"/>
+      <w:r>
+        <w:rPr>
+          <w:b/>
+          <w:bCs/>
+        </w:rPr>
+        <w:t>DepthwiseConv</w:t>
+      </w:r>
+      <w:proofErr w:type="spellEnd"/>
+      <w:r>
+        <w:rPr>
+          <w:b/>
+          <w:bCs/>
+        </w:rPr>
+        <w:t xml:space="preserve"> → GRU → Dense</w:t>
       </w:r>
       <w:r>
         <w:t xml:space="preserve"> hybrid.</w:t>
@@ -3512,7 +4317,15 @@
         </w:numPr>
       </w:pPr>
       <w:r>
-        <w:t>A depthwise conv to reduce parameters</w:t>
+        <w:t xml:space="preserve">A </w:t>
+      </w:r>
+      <w:proofErr w:type="spellStart"/>
+      <w:r>
+        <w:t>depthwise</w:t>
+      </w:r>
+      <w:proofErr w:type="spellEnd"/>
+      <w:r>
+        <w:t xml:space="preserve"> conv to reduce parameters</w:t>
       </w:r>
     </w:p>
     <w:p>
@@ -3592,27 +4405,21 @@
           <w:numId w:val="33"/>
         </w:numPr>
       </w:pPr>
+      <w:proofErr w:type="gramStart"/>
       <w:r>
         <w:rPr>
           <w:b/>
           <w:bCs/>
         </w:rPr>
-        <w:t>256 time steps</w:t>
-      </w:r>
-    </w:p>
-    <w:p>
-      <w:pPr>
-        <w:numPr>
-          <w:ilvl w:val="0"/>
-          <w:numId w:val="33"/>
-        </w:numPr>
-      </w:pPr>
+        <w:t>256 time</w:t>
+      </w:r>
+      <w:proofErr w:type="gramEnd"/>
       <w:r>
         <w:rPr>
           <w:b/>
           <w:bCs/>
         </w:rPr>
-        <w:t>10 features per step</w:t>
+        <w:t xml:space="preserve"> steps</w:t>
       </w:r>
     </w:p>
     <w:p>
@@ -3622,15 +4429,12 @@
           <w:numId w:val="33"/>
         </w:numPr>
       </w:pPr>
-      <w:r>
-        <w:t xml:space="preserve">Already in </w:t>
-      </w:r>
       <w:r>
         <w:rPr>
           <w:b/>
           <w:bCs/>
         </w:rPr>
-        <w:t>world frame</w:t>
+        <w:t>10 features per step</w:t>
       </w:r>
     </w:p>
     <w:p>
@@ -3641,29 +4445,55 @@
         </w:numPr>
       </w:pPr>
       <w:r>
-        <w:t>Already filtered by Madgwick</w:t>
-      </w:r>
-    </w:p>
-    <w:p>
-      <w:pPr>
-        <w:numPr>
-          <w:ilvl w:val="0"/>
-          <w:numId w:val="33"/>
-        </w:numPr>
-      </w:pPr>
-      <w:r>
-        <w:t>Already stable regardless of wand orientation</w:t>
-      </w:r>
-    </w:p>
-    <w:p>
-      <w:r>
-        <w:t xml:space="preserve">This means the model doesn’t need to learn orientation invariance — you’ve already solved that in the fusion task. So the model can focus purely on </w:t>
+        <w:t xml:space="preserve">Already in </w:t>
       </w:r>
       <w:r>
         <w:rPr>
           <w:b/>
           <w:bCs/>
         </w:rPr>
+        <w:t>world frame</w:t>
+      </w:r>
+    </w:p>
+    <w:p>
+      <w:pPr>
+        <w:numPr>
+          <w:ilvl w:val="0"/>
+          <w:numId w:val="33"/>
+        </w:numPr>
+      </w:pPr>
+      <w:r>
+        <w:t>Already filtered by Madgwick</w:t>
+      </w:r>
+    </w:p>
+    <w:p>
+      <w:pPr>
+        <w:numPr>
+          <w:ilvl w:val="0"/>
+          <w:numId w:val="33"/>
+        </w:numPr>
+      </w:pPr>
+      <w:r>
+        <w:t>Already stable regardless of wand orientation</w:t>
+      </w:r>
+    </w:p>
+    <w:p>
+      <w:r>
+        <w:t xml:space="preserve">This means the model doesn’t need to learn orientation invariance — you’ve already solved that in the fusion task. </w:t>
+      </w:r>
+      <w:proofErr w:type="gramStart"/>
+      <w:r>
+        <w:t>So</w:t>
+      </w:r>
+      <w:proofErr w:type="gramEnd"/>
+      <w:r>
+        <w:t xml:space="preserve"> the model can focus purely on </w:t>
+      </w:r>
+      <w:r>
+        <w:rPr>
+          <w:b/>
+          <w:bCs/>
+        </w:rPr>
         <w:t>temporal motion signatures</w:t>
       </w:r>
       <w:r>
@@ -3688,7 +4518,14 @@
       </w:r>
       <w:r>
         <w:br/>
-        <w:t>Depthwise conv keeps the model tiny.</w:t>
+      </w:r>
+      <w:proofErr w:type="spellStart"/>
+      <w:r>
+        <w:t>Depthwise</w:t>
+      </w:r>
+      <w:proofErr w:type="spellEnd"/>
+      <w:r>
+        <w:t xml:space="preserve"> conv keeps the model tiny.</w:t>
       </w:r>
     </w:p>
     <w:p>
@@ -3718,7 +4555,23 @@
           <w:b/>
           <w:bCs/>
         </w:rPr>
-        <w:t xml:space="preserve"> Concrete Model Recommendation (Keras)</w:t>
+        <w:t xml:space="preserve"> Concrete Model Recommendation (</w:t>
+      </w:r>
+      <w:proofErr w:type="spellStart"/>
+      <w:r>
+        <w:rPr>
+          <w:b/>
+          <w:bCs/>
+        </w:rPr>
+        <w:t>Keras</w:t>
+      </w:r>
+      <w:proofErr w:type="spellEnd"/>
+      <w:r>
+        <w:rPr>
+          <w:b/>
+          <w:bCs/>
+        </w:rPr>
+        <w:t>)</w:t>
       </w:r>
     </w:p>
     <w:p>
@@ -3732,8 +4585,30 @@
         <w:rPr>
           <w:rFonts w:ascii="Courier New" w:hAnsi="Courier New" w:cs="Courier New"/>
         </w:rPr>
-        <w:t>import tensorflow as tf</w:t>
-      </w:r>
+        <w:t xml:space="preserve">import </w:t>
+      </w:r>
+      <w:proofErr w:type="spellStart"/>
+      <w:r>
+        <w:rPr>
+          <w:rFonts w:ascii="Courier New" w:hAnsi="Courier New" w:cs="Courier New"/>
+        </w:rPr>
+        <w:t>tensorflow</w:t>
+      </w:r>
+      <w:proofErr w:type="spellEnd"/>
+      <w:r>
+        <w:rPr>
+          <w:rFonts w:ascii="Courier New" w:hAnsi="Courier New" w:cs="Courier New"/>
+        </w:rPr>
+        <w:t xml:space="preserve"> as </w:t>
+      </w:r>
+      <w:proofErr w:type="spellStart"/>
+      <w:r>
+        <w:rPr>
+          <w:rFonts w:ascii="Courier New" w:hAnsi="Courier New" w:cs="Courier New"/>
+        </w:rPr>
+        <w:t>tf</w:t>
+      </w:r>
+      <w:proofErr w:type="spellEnd"/>
     </w:p>
     <w:p>
       <w:pPr>
@@ -3746,7 +4621,23 @@
         <w:rPr>
           <w:rFonts w:ascii="Courier New" w:hAnsi="Courier New" w:cs="Courier New"/>
         </w:rPr>
-        <w:t>from tensorflow.keras import layers, models</w:t>
+        <w:t xml:space="preserve">from </w:t>
+      </w:r>
+      <w:proofErr w:type="spellStart"/>
+      <w:proofErr w:type="gramStart"/>
+      <w:r>
+        <w:rPr>
+          <w:rFonts w:ascii="Courier New" w:hAnsi="Courier New" w:cs="Courier New"/>
+        </w:rPr>
+        <w:t>tensorflow.keras</w:t>
+      </w:r>
+      <w:proofErr w:type="spellEnd"/>
+      <w:proofErr w:type="gramEnd"/>
+      <w:r>
+        <w:rPr>
+          <w:rFonts w:ascii="Courier New" w:hAnsi="Courier New" w:cs="Courier New"/>
+        </w:rPr>
+        <w:t xml:space="preserve"> import layers, models</w:t>
       </w:r>
     </w:p>
     <w:p>
@@ -3818,7 +4709,37 @@
         <w:rPr>
           <w:rFonts w:ascii="Courier New" w:hAnsi="Courier New" w:cs="Courier New"/>
         </w:rPr>
-        <w:t>inputs = layers.Input(shape=(TIME_STEPS, FEATURES))</w:t>
+        <w:t xml:space="preserve">inputs = </w:t>
+      </w:r>
+      <w:proofErr w:type="spellStart"/>
+      <w:proofErr w:type="gramStart"/>
+      <w:r>
+        <w:rPr>
+          <w:rFonts w:ascii="Courier New" w:hAnsi="Courier New" w:cs="Courier New"/>
+        </w:rPr>
+        <w:t>layers.Input</w:t>
+      </w:r>
+      <w:proofErr w:type="spellEnd"/>
+      <w:proofErr w:type="gramEnd"/>
+      <w:r>
+        <w:rPr>
+          <w:rFonts w:ascii="Courier New" w:hAnsi="Courier New" w:cs="Courier New"/>
+        </w:rPr>
+        <w:t>(shape</w:t>
+      </w:r>
+      <w:proofErr w:type="gramStart"/>
+      <w:r>
+        <w:rPr>
+          <w:rFonts w:ascii="Courier New" w:hAnsi="Courier New" w:cs="Courier New"/>
+        </w:rPr>
+        <w:t>=(</w:t>
+      </w:r>
+      <w:proofErr w:type="gramEnd"/>
+      <w:r>
+        <w:rPr>
+          <w:rFonts w:ascii="Courier New" w:hAnsi="Courier New" w:cs="Courier New"/>
+        </w:rPr>
+        <w:t>TIME_STEPS, FEATURES))</w:t>
       </w:r>
     </w:p>
     <w:p>
@@ -3854,7 +4775,63 @@
         <w:rPr>
           <w:rFonts w:ascii="Courier New" w:hAnsi="Courier New" w:cs="Courier New"/>
         </w:rPr>
-        <w:t>x = layers.Conv1D(32, 5, activation='relu', padding='same')(inputs)</w:t>
+        <w:t xml:space="preserve">x = </w:t>
+      </w:r>
+      <w:proofErr w:type="gramStart"/>
+      <w:r>
+        <w:rPr>
+          <w:rFonts w:ascii="Courier New" w:hAnsi="Courier New" w:cs="Courier New"/>
+        </w:rPr>
+        <w:t>layers.Conv</w:t>
+      </w:r>
+      <w:proofErr w:type="gramEnd"/>
+      <w:r>
+        <w:rPr>
+          <w:rFonts w:ascii="Courier New" w:hAnsi="Courier New" w:cs="Courier New"/>
+        </w:rPr>
+        <w:t>1</w:t>
+      </w:r>
+      <w:proofErr w:type="gramStart"/>
+      <w:r>
+        <w:rPr>
+          <w:rFonts w:ascii="Courier New" w:hAnsi="Courier New" w:cs="Courier New"/>
+        </w:rPr>
+        <w:t>D(</w:t>
+      </w:r>
+      <w:proofErr w:type="gramEnd"/>
+      <w:r>
+        <w:rPr>
+          <w:rFonts w:ascii="Courier New" w:hAnsi="Courier New" w:cs="Courier New"/>
+        </w:rPr>
+        <w:t>32, 5, activation='</w:t>
+      </w:r>
+      <w:proofErr w:type="spellStart"/>
+      <w:r>
+        <w:rPr>
+          <w:rFonts w:ascii="Courier New" w:hAnsi="Courier New" w:cs="Courier New"/>
+        </w:rPr>
+        <w:t>relu</w:t>
+      </w:r>
+      <w:proofErr w:type="spellEnd"/>
+      <w:r>
+        <w:rPr>
+          <w:rFonts w:ascii="Courier New" w:hAnsi="Courier New" w:cs="Courier New"/>
+        </w:rPr>
+        <w:t>', padding='same</w:t>
+      </w:r>
+      <w:proofErr w:type="gramStart"/>
+      <w:r>
+        <w:rPr>
+          <w:rFonts w:ascii="Courier New" w:hAnsi="Courier New" w:cs="Courier New"/>
+        </w:rPr>
+        <w:t>')(</w:t>
+      </w:r>
+      <w:proofErr w:type="gramEnd"/>
+      <w:r>
+        <w:rPr>
+          <w:rFonts w:ascii="Courier New" w:hAnsi="Courier New" w:cs="Courier New"/>
+        </w:rPr>
+        <w:t>inputs)</w:t>
       </w:r>
     </w:p>
     <w:p>
@@ -3868,7 +4845,63 @@
         <w:rPr>
           <w:rFonts w:ascii="Courier New" w:hAnsi="Courier New" w:cs="Courier New"/>
         </w:rPr>
-        <w:t>x = layers.Conv1D(32, 5, activation='relu', padding='same')(x)</w:t>
+        <w:t xml:space="preserve">x = </w:t>
+      </w:r>
+      <w:proofErr w:type="gramStart"/>
+      <w:r>
+        <w:rPr>
+          <w:rFonts w:ascii="Courier New" w:hAnsi="Courier New" w:cs="Courier New"/>
+        </w:rPr>
+        <w:t>layers.Conv</w:t>
+      </w:r>
+      <w:proofErr w:type="gramEnd"/>
+      <w:r>
+        <w:rPr>
+          <w:rFonts w:ascii="Courier New" w:hAnsi="Courier New" w:cs="Courier New"/>
+        </w:rPr>
+        <w:t>1</w:t>
+      </w:r>
+      <w:proofErr w:type="gramStart"/>
+      <w:r>
+        <w:rPr>
+          <w:rFonts w:ascii="Courier New" w:hAnsi="Courier New" w:cs="Courier New"/>
+        </w:rPr>
+        <w:t>D(</w:t>
+      </w:r>
+      <w:proofErr w:type="gramEnd"/>
+      <w:r>
+        <w:rPr>
+          <w:rFonts w:ascii="Courier New" w:hAnsi="Courier New" w:cs="Courier New"/>
+        </w:rPr>
+        <w:t>32, 5, activation='</w:t>
+      </w:r>
+      <w:proofErr w:type="spellStart"/>
+      <w:r>
+        <w:rPr>
+          <w:rFonts w:ascii="Courier New" w:hAnsi="Courier New" w:cs="Courier New"/>
+        </w:rPr>
+        <w:t>relu</w:t>
+      </w:r>
+      <w:proofErr w:type="spellEnd"/>
+      <w:r>
+        <w:rPr>
+          <w:rFonts w:ascii="Courier New" w:hAnsi="Courier New" w:cs="Courier New"/>
+        </w:rPr>
+        <w:t>', padding='same</w:t>
+      </w:r>
+      <w:proofErr w:type="gramStart"/>
+      <w:r>
+        <w:rPr>
+          <w:rFonts w:ascii="Courier New" w:hAnsi="Courier New" w:cs="Courier New"/>
+        </w:rPr>
+        <w:t>')(</w:t>
+      </w:r>
+      <w:proofErr w:type="gramEnd"/>
+      <w:r>
+        <w:rPr>
+          <w:rFonts w:ascii="Courier New" w:hAnsi="Courier New" w:cs="Courier New"/>
+        </w:rPr>
+        <w:t>x)</w:t>
       </w:r>
     </w:p>
     <w:p>
@@ -3883,7 +4916,21 @@
           <w:rFonts w:ascii="Courier New" w:hAnsi="Courier New" w:cs="Courier New"/>
         </w:rPr>
         <w:lastRenderedPageBreak/>
-        <w:t>x = layers.MaxPooling1D(2)(x)</w:t>
+        <w:t xml:space="preserve">x = </w:t>
+      </w:r>
+      <w:proofErr w:type="gramStart"/>
+      <w:r>
+        <w:rPr>
+          <w:rFonts w:ascii="Courier New" w:hAnsi="Courier New" w:cs="Courier New"/>
+        </w:rPr>
+        <w:t>layers.MaxPooling</w:t>
+      </w:r>
+      <w:proofErr w:type="gramEnd"/>
+      <w:r>
+        <w:rPr>
+          <w:rFonts w:ascii="Courier New" w:hAnsi="Courier New" w:cs="Courier New"/>
+        </w:rPr>
+        <w:t>1D(2)(x)</w:t>
       </w:r>
     </w:p>
     <w:p>
@@ -3905,7 +4952,21 @@
         <w:rPr>
           <w:rFonts w:ascii="Courier New" w:hAnsi="Courier New" w:cs="Courier New"/>
         </w:rPr>
-        <w:t># Depthwise conv for efficiency</w:t>
+        <w:t xml:space="preserve"># </w:t>
+      </w:r>
+      <w:proofErr w:type="spellStart"/>
+      <w:r>
+        <w:rPr>
+          <w:rFonts w:ascii="Courier New" w:hAnsi="Courier New" w:cs="Courier New"/>
+        </w:rPr>
+        <w:t>Depthwise</w:t>
+      </w:r>
+      <w:proofErr w:type="spellEnd"/>
+      <w:r>
+        <w:rPr>
+          <w:rFonts w:ascii="Courier New" w:hAnsi="Courier New" w:cs="Courier New"/>
+        </w:rPr>
+        <w:t xml:space="preserve"> conv for efficiency</w:t>
       </w:r>
     </w:p>
     <w:p>
@@ -3919,7 +4980,63 @@
         <w:rPr>
           <w:rFonts w:ascii="Courier New" w:hAnsi="Courier New" w:cs="Courier New"/>
         </w:rPr>
-        <w:t>x = layers.DepthwiseConv1D(3, activation='relu', padding='same')(x)</w:t>
+        <w:t xml:space="preserve">x = </w:t>
+      </w:r>
+      <w:proofErr w:type="gramStart"/>
+      <w:r>
+        <w:rPr>
+          <w:rFonts w:ascii="Courier New" w:hAnsi="Courier New" w:cs="Courier New"/>
+        </w:rPr>
+        <w:t>layers.DepthwiseConv</w:t>
+      </w:r>
+      <w:proofErr w:type="gramEnd"/>
+      <w:r>
+        <w:rPr>
+          <w:rFonts w:ascii="Courier New" w:hAnsi="Courier New" w:cs="Courier New"/>
+        </w:rPr>
+        <w:t>1</w:t>
+      </w:r>
+      <w:proofErr w:type="gramStart"/>
+      <w:r>
+        <w:rPr>
+          <w:rFonts w:ascii="Courier New" w:hAnsi="Courier New" w:cs="Courier New"/>
+        </w:rPr>
+        <w:t>D(</w:t>
+      </w:r>
+      <w:proofErr w:type="gramEnd"/>
+      <w:r>
+        <w:rPr>
+          <w:rFonts w:ascii="Courier New" w:hAnsi="Courier New" w:cs="Courier New"/>
+        </w:rPr>
+        <w:t>3, activation='</w:t>
+      </w:r>
+      <w:proofErr w:type="spellStart"/>
+      <w:r>
+        <w:rPr>
+          <w:rFonts w:ascii="Courier New" w:hAnsi="Courier New" w:cs="Courier New"/>
+        </w:rPr>
+        <w:t>relu</w:t>
+      </w:r>
+      <w:proofErr w:type="spellEnd"/>
+      <w:r>
+        <w:rPr>
+          <w:rFonts w:ascii="Courier New" w:hAnsi="Courier New" w:cs="Courier New"/>
+        </w:rPr>
+        <w:t>', padding='same</w:t>
+      </w:r>
+      <w:proofErr w:type="gramStart"/>
+      <w:r>
+        <w:rPr>
+          <w:rFonts w:ascii="Courier New" w:hAnsi="Courier New" w:cs="Courier New"/>
+        </w:rPr>
+        <w:t>')(</w:t>
+      </w:r>
+      <w:proofErr w:type="gramEnd"/>
+      <w:r>
+        <w:rPr>
+          <w:rFonts w:ascii="Courier New" w:hAnsi="Courier New" w:cs="Courier New"/>
+        </w:rPr>
+        <w:t>x)</w:t>
       </w:r>
     </w:p>
     <w:p>
@@ -3955,7 +5072,57 @@
         <w:rPr>
           <w:rFonts w:ascii="Courier New" w:hAnsi="Courier New" w:cs="Courier New"/>
         </w:rPr>
-        <w:t>x = layers.GRU(32, return_sequences=False)(x)</w:t>
+        <w:t xml:space="preserve">x = </w:t>
+      </w:r>
+      <w:proofErr w:type="spellStart"/>
+      <w:proofErr w:type="gramStart"/>
+      <w:r>
+        <w:rPr>
+          <w:rFonts w:ascii="Courier New" w:hAnsi="Courier New" w:cs="Courier New"/>
+        </w:rPr>
+        <w:t>layers.GRU</w:t>
+      </w:r>
+      <w:proofErr w:type="spellEnd"/>
+      <w:r>
+        <w:rPr>
+          <w:rFonts w:ascii="Courier New" w:hAnsi="Courier New" w:cs="Courier New"/>
+        </w:rPr>
+        <w:t>(</w:t>
+      </w:r>
+      <w:proofErr w:type="gramEnd"/>
+      <w:r>
+        <w:rPr>
+          <w:rFonts w:ascii="Courier New" w:hAnsi="Courier New" w:cs="Courier New"/>
+        </w:rPr>
+        <w:t xml:space="preserve">32, </w:t>
+      </w:r>
+      <w:proofErr w:type="spellStart"/>
+      <w:r>
+        <w:rPr>
+          <w:rFonts w:ascii="Courier New" w:hAnsi="Courier New" w:cs="Courier New"/>
+        </w:rPr>
+        <w:t>return_sequences</w:t>
+      </w:r>
+      <w:proofErr w:type="spellEnd"/>
+      <w:r>
+        <w:rPr>
+          <w:rFonts w:ascii="Courier New" w:hAnsi="Courier New" w:cs="Courier New"/>
+        </w:rPr>
+        <w:t>=</w:t>
+      </w:r>
+      <w:proofErr w:type="gramStart"/>
+      <w:r>
+        <w:rPr>
+          <w:rFonts w:ascii="Courier New" w:hAnsi="Courier New" w:cs="Courier New"/>
+        </w:rPr>
+        <w:t>False)(</w:t>
+      </w:r>
+      <w:proofErr w:type="gramEnd"/>
+      <w:r>
+        <w:rPr>
+          <w:rFonts w:ascii="Courier New" w:hAnsi="Courier New" w:cs="Courier New"/>
+        </w:rPr>
+        <w:t>x)</w:t>
       </w:r>
     </w:p>
     <w:p>
@@ -3991,7 +5158,45 @@
         <w:rPr>
           <w:rFonts w:ascii="Courier New" w:hAnsi="Courier New" w:cs="Courier New"/>
         </w:rPr>
-        <w:t>x = layers.Dense(32, activation='relu')(x)</w:t>
+        <w:t xml:space="preserve">x = </w:t>
+      </w:r>
+      <w:proofErr w:type="spellStart"/>
+      <w:proofErr w:type="gramStart"/>
+      <w:r>
+        <w:rPr>
+          <w:rFonts w:ascii="Courier New" w:hAnsi="Courier New" w:cs="Courier New"/>
+        </w:rPr>
+        <w:t>layers.Dense</w:t>
+      </w:r>
+      <w:proofErr w:type="spellEnd"/>
+      <w:proofErr w:type="gramEnd"/>
+      <w:r>
+        <w:rPr>
+          <w:rFonts w:ascii="Courier New" w:hAnsi="Courier New" w:cs="Courier New"/>
+        </w:rPr>
+        <w:t>(32, activation='</w:t>
+      </w:r>
+      <w:proofErr w:type="spellStart"/>
+      <w:r>
+        <w:rPr>
+          <w:rFonts w:ascii="Courier New" w:hAnsi="Courier New" w:cs="Courier New"/>
+        </w:rPr>
+        <w:t>relu</w:t>
+      </w:r>
+      <w:proofErr w:type="spellEnd"/>
+      <w:proofErr w:type="gramStart"/>
+      <w:r>
+        <w:rPr>
+          <w:rFonts w:ascii="Courier New" w:hAnsi="Courier New" w:cs="Courier New"/>
+        </w:rPr>
+        <w:t>')(</w:t>
+      </w:r>
+      <w:proofErr w:type="gramEnd"/>
+      <w:r>
+        <w:rPr>
+          <w:rFonts w:ascii="Courier New" w:hAnsi="Courier New" w:cs="Courier New"/>
+        </w:rPr>
+        <w:t>x)</w:t>
       </w:r>
     </w:p>
     <w:p>
@@ -4005,7 +5210,45 @@
         <w:rPr>
           <w:rFonts w:ascii="Courier New" w:hAnsi="Courier New" w:cs="Courier New"/>
         </w:rPr>
-        <w:t>outputs = layers.Dense(NUM_CLASSES, activation='softmax')(x)</w:t>
+        <w:t xml:space="preserve">outputs = </w:t>
+      </w:r>
+      <w:proofErr w:type="spellStart"/>
+      <w:proofErr w:type="gramStart"/>
+      <w:r>
+        <w:rPr>
+          <w:rFonts w:ascii="Courier New" w:hAnsi="Courier New" w:cs="Courier New"/>
+        </w:rPr>
+        <w:t>layers.Dense</w:t>
+      </w:r>
+      <w:proofErr w:type="spellEnd"/>
+      <w:proofErr w:type="gramEnd"/>
+      <w:r>
+        <w:rPr>
+          <w:rFonts w:ascii="Courier New" w:hAnsi="Courier New" w:cs="Courier New"/>
+        </w:rPr>
+        <w:t>(NUM_CLASSES, activation='</w:t>
+      </w:r>
+      <w:proofErr w:type="spellStart"/>
+      <w:r>
+        <w:rPr>
+          <w:rFonts w:ascii="Courier New" w:hAnsi="Courier New" w:cs="Courier New"/>
+        </w:rPr>
+        <w:t>softmax</w:t>
+      </w:r>
+      <w:proofErr w:type="spellEnd"/>
+      <w:proofErr w:type="gramStart"/>
+      <w:r>
+        <w:rPr>
+          <w:rFonts w:ascii="Courier New" w:hAnsi="Courier New" w:cs="Courier New"/>
+        </w:rPr>
+        <w:t>')(</w:t>
+      </w:r>
+      <w:proofErr w:type="gramEnd"/>
+      <w:r>
+        <w:rPr>
+          <w:rFonts w:ascii="Courier New" w:hAnsi="Courier New" w:cs="Courier New"/>
+        </w:rPr>
+        <w:t>x)</w:t>
       </w:r>
     </w:p>
     <w:p>
@@ -4027,7 +5270,23 @@
         <w:rPr>
           <w:rFonts w:ascii="Courier New" w:hAnsi="Courier New" w:cs="Courier New"/>
         </w:rPr>
-        <w:t>model = models.Model(inputs, outputs)</w:t>
+        <w:t xml:space="preserve">model = </w:t>
+      </w:r>
+      <w:proofErr w:type="spellStart"/>
+      <w:proofErr w:type="gramStart"/>
+      <w:r>
+        <w:rPr>
+          <w:rFonts w:ascii="Courier New" w:hAnsi="Courier New" w:cs="Courier New"/>
+        </w:rPr>
+        <w:t>models.Model</w:t>
+      </w:r>
+      <w:proofErr w:type="spellEnd"/>
+      <w:proofErr w:type="gramEnd"/>
+      <w:r>
+        <w:rPr>
+          <w:rFonts w:ascii="Courier New" w:hAnsi="Courier New" w:cs="Courier New"/>
+        </w:rPr>
+        <w:t>(inputs, outputs)</w:t>
       </w:r>
     </w:p>
     <w:p>
@@ -4037,11 +5296,21 @@
           <w:rFonts w:ascii="Courier New" w:hAnsi="Courier New" w:cs="Courier New"/>
         </w:rPr>
       </w:pPr>
-      <w:r>
-        <w:rPr>
-          <w:rFonts w:ascii="Courier New" w:hAnsi="Courier New" w:cs="Courier New"/>
-        </w:rPr>
-        <w:t>model.summary()</w:t>
+      <w:proofErr w:type="spellStart"/>
+      <w:proofErr w:type="gramStart"/>
+      <w:r>
+        <w:rPr>
+          <w:rFonts w:ascii="Courier New" w:hAnsi="Courier New" w:cs="Courier New"/>
+        </w:rPr>
+        <w:t>model.summary</w:t>
+      </w:r>
+      <w:proofErr w:type="spellEnd"/>
+      <w:proofErr w:type="gramEnd"/>
+      <w:r>
+        <w:rPr>
+          <w:rFonts w:ascii="Courier New" w:hAnsi="Courier New" w:cs="Courier New"/>
+        </w:rPr>
+        <w:t>()</w:t>
       </w:r>
     </w:p>
     <w:p>
@@ -4083,8 +5352,13 @@
         </w:numPr>
       </w:pPr>
       <w:r>
-        <w:t>Classifies gestures in ~2–5 ms</w:t>
-      </w:r>
+        <w:t xml:space="preserve">Classifies gestures in ~2–5 </w:t>
+      </w:r>
+      <w:proofErr w:type="spellStart"/>
+      <w:r>
+        <w:t>ms</w:t>
+      </w:r>
+      <w:proofErr w:type="spellEnd"/>
     </w:p>
     <w:p>
       <w:pPr>
@@ -4353,17 +5627,65 @@
     </w:p>
     <w:p>
       <w:r>
-        <w:t>converter = tf.lite.TFLiteConverter.from_keras_model(model)</w:t>
-      </w:r>
-    </w:p>
-    <w:p>
-      <w:r>
-        <w:t>converter.optimizations = [tf.lite.Optimize.DEFAULT]</w:t>
-      </w:r>
-    </w:p>
-    <w:p>
-      <w:r>
-        <w:t>tflite_model = converter.convert()</w:t>
+        <w:t xml:space="preserve">converter = </w:t>
+      </w:r>
+      <w:proofErr w:type="spellStart"/>
+      <w:proofErr w:type="gramStart"/>
+      <w:r>
+        <w:t>tf.lite</w:t>
+      </w:r>
+      <w:proofErr w:type="gramEnd"/>
+      <w:r>
+        <w:t>.TFLiteConverter.from_keras_model</w:t>
+      </w:r>
+      <w:proofErr w:type="spellEnd"/>
+      <w:r>
+        <w:t>(model)</w:t>
+      </w:r>
+    </w:p>
+    <w:p>
+      <w:proofErr w:type="spellStart"/>
+      <w:proofErr w:type="gramStart"/>
+      <w:r>
+        <w:t>converter.optimizations</w:t>
+      </w:r>
+      <w:proofErr w:type="spellEnd"/>
+      <w:proofErr w:type="gramEnd"/>
+      <w:r>
+        <w:t xml:space="preserve"> = [</w:t>
+      </w:r>
+      <w:proofErr w:type="spellStart"/>
+      <w:proofErr w:type="gramStart"/>
+      <w:r>
+        <w:t>tf.lite</w:t>
+      </w:r>
+      <w:proofErr w:type="gramEnd"/>
+      <w:r>
+        <w:t>.Optimize.DEFAULT</w:t>
+      </w:r>
+      <w:proofErr w:type="spellEnd"/>
+      <w:r>
+        <w:t>]</w:t>
+      </w:r>
+    </w:p>
+    <w:p>
+      <w:proofErr w:type="spellStart"/>
+      <w:r>
+        <w:t>tflite_model</w:t>
+      </w:r>
+      <w:proofErr w:type="spellEnd"/>
+      <w:r>
+        <w:t xml:space="preserve"> = </w:t>
+      </w:r>
+      <w:proofErr w:type="spellStart"/>
+      <w:proofErr w:type="gramStart"/>
+      <w:r>
+        <w:t>converter.convert</w:t>
+      </w:r>
+      <w:proofErr w:type="spellEnd"/>
+      <w:proofErr w:type="gramEnd"/>
+      <w:r>
+        <w:t>()</w:t>
       </w:r>
     </w:p>
     <w:p>
@@ -4535,7 +5857,15 @@
         </w:numPr>
       </w:pPr>
       <w:r>
-        <w:t>A full training notebook (Jupyter)</w:t>
+        <w:t>A full training notebook (</w:t>
+      </w:r>
+      <w:proofErr w:type="spellStart"/>
+      <w:r>
+        <w:t>Jupyter</w:t>
+      </w:r>
+      <w:proofErr w:type="spellEnd"/>
+      <w:r>
+        <w:t>)</w:t>
       </w:r>
     </w:p>
     <w:p>
@@ -4710,7 +6040,15 @@
         </w:numPr>
       </w:pPr>
       <w:r>
-        <w:t>Online spell library</w:t>
+        <w:t xml:space="preserve">Online </w:t>
+      </w:r>
+      <w:proofErr w:type="gramStart"/>
+      <w:r>
+        <w:t>spell</w:t>
+      </w:r>
+      <w:proofErr w:type="gramEnd"/>
+      <w:r>
+        <w:t xml:space="preserve"> library</w:t>
       </w:r>
     </w:p>
     <w:p>
@@ -5257,11 +6595,19 @@
       </w:r>
       <w:r>
         <w:br/>
-        <w:t>This gives you universal compatibility without cloud lock</w:t>
+        <w:t xml:space="preserve">This gives you universal compatibility without cloud </w:t>
+      </w:r>
+      <w:proofErr w:type="gramStart"/>
+      <w:r>
+        <w:t>lock</w:t>
       </w:r>
       <w:r>
         <w:noBreakHyphen/>
-        <w:t>in.</w:t>
+        <w:t>in</w:t>
+      </w:r>
+      <w:proofErr w:type="gramEnd"/>
+      <w:r>
+        <w:t>.</w:t>
       </w:r>
     </w:p>
     <w:p>
@@ -5578,9 +6924,11 @@
           <w:numId w:val="13"/>
         </w:numPr>
       </w:pPr>
+      <w:proofErr w:type="spellStart"/>
       <w:r>
         <w:t>ESPHome</w:t>
       </w:r>
+      <w:proofErr w:type="spellEnd"/>
     </w:p>
     <w:p>
       <w:pPr>
@@ -5652,8 +7000,13 @@
           <w:numId w:val="14"/>
         </w:numPr>
       </w:pPr>
-      <w:r>
-        <w:t>Personalizable gestures</w:t>
+      <w:proofErr w:type="spellStart"/>
+      <w:r>
+        <w:t>Personalizable</w:t>
+      </w:r>
+      <w:proofErr w:type="spellEnd"/>
+      <w:r>
+        <w:t xml:space="preserve"> gestures</w:t>
       </w:r>
     </w:p>
     <w:p>
@@ -5886,8 +7239,13 @@
         </w:numPr>
       </w:pPr>
       <w:r>
-        <w:t>Works without cloud</w:t>
-      </w:r>
+        <w:t xml:space="preserve">Works without </w:t>
+      </w:r>
+      <w:proofErr w:type="gramStart"/>
+      <w:r>
+        <w:t>cloud</w:t>
+      </w:r>
+      <w:proofErr w:type="gramEnd"/>
     </w:p>
     <w:p>
       <w:r>
@@ -6344,13 +7702,23 @@
               </w:rPr>
             </w:pPr>
             <w:hyperlink r:id="rId22" w:history="1">
+              <w:proofErr w:type="spellStart"/>
               <w:r>
                 <w:rPr>
                   <w:rStyle w:val="Hyperlink"/>
                   <w:b/>
                   <w:bCs/>
                 </w:rPr>
-                <w:t>Seeed XIAO ESP32</w:t>
+                <w:t>Seeed</w:t>
+              </w:r>
+              <w:proofErr w:type="spellEnd"/>
+              <w:r>
+                <w:rPr>
+                  <w:rStyle w:val="Hyperlink"/>
+                  <w:b/>
+                  <w:bCs/>
+                </w:rPr>
+                <w:t xml:space="preserve"> XIAO ESP32</w:t>
               </w:r>
               <w:r>
                 <w:rPr>
@@ -6776,6 +8144,7 @@
             <w:hideMark/>
           </w:tcPr>
           <w:p>
+            <w:proofErr w:type="gramStart"/>
             <w:r>
               <w:rPr>
                 <w:b/>
@@ -6789,7 +8158,15 @@
                 <w:bCs/>
               </w:rPr>
               <w:noBreakHyphen/>
-              <w:t>in LiPo charger</w:t>
+              <w:t>in</w:t>
+            </w:r>
+            <w:proofErr w:type="gramEnd"/>
+            <w:r>
+              <w:rPr>
+                <w:b/>
+                <w:bCs/>
+              </w:rPr>
+              <w:t xml:space="preserve"> LiPo charger</w:t>
             </w:r>
             <w:r>
               <w:t xml:space="preserve">, 50 mA fast charge / 3.8 mA trickle </w:t>
@@ -7069,8 +8446,19 @@
                 <w:bCs/>
               </w:rPr>
               <w:noBreakHyphen/>
-              <w:t>gain antenna OR u.FL</w:t>
+              <w:t xml:space="preserve">gain antenna OR </w:t>
             </w:r>
+            <w:proofErr w:type="spellStart"/>
+            <w:proofErr w:type="gramStart"/>
+            <w:r>
+              <w:rPr>
+                <w:b/>
+                <w:bCs/>
+              </w:rPr>
+              <w:t>u.FL</w:t>
+            </w:r>
+            <w:proofErr w:type="spellEnd"/>
+            <w:proofErr w:type="gramEnd"/>
             <w:r>
               <w:t xml:space="preserve"> </w:t>
             </w:r>
@@ -7099,7 +8487,15 @@
               <w:t>2.4 GHz rod antenna</w:t>
             </w:r>
             <w:r>
-              <w:t xml:space="preserve">, U.FL included </w:t>
+              <w:t xml:space="preserve">, </w:t>
+            </w:r>
+            <w:proofErr w:type="gramStart"/>
+            <w:r>
+              <w:t>U.FL</w:t>
+            </w:r>
+            <w:proofErr w:type="gramEnd"/>
+            <w:r>
+              <w:t xml:space="preserve"> included </w:t>
             </w:r>
             <w:hyperlink r:id="rId40" w:history="1">
               <w:r>
@@ -7119,7 +8515,17 @@
           </w:tcPr>
           <w:p>
             <w:r>
-              <w:t xml:space="preserve">PCB antenna (w.FL variant available separately) </w:t>
+              <w:t>PCB antenna (</w:t>
+            </w:r>
+            <w:proofErr w:type="spellStart"/>
+            <w:proofErr w:type="gramStart"/>
+            <w:r>
+              <w:t>w.FL</w:t>
+            </w:r>
+            <w:proofErr w:type="spellEnd"/>
+            <w:proofErr w:type="gramEnd"/>
+            <w:r>
+              <w:t xml:space="preserve"> variant available separately) </w:t>
             </w:r>
             <w:hyperlink r:id="rId41" w:history="1">
               <w:r>
@@ -7406,8 +8812,21 @@
     </w:tbl>
     <w:p/>
     <w:p>
-      <w:r>
-        <w:t>Hosyond has a RGB LED on GPIO48 (or GPIO38)</w:t>
+      <w:proofErr w:type="spellStart"/>
+      <w:r>
+        <w:t>Hosyond</w:t>
+      </w:r>
+      <w:proofErr w:type="spellEnd"/>
+      <w:r>
+        <w:t xml:space="preserve"> has </w:t>
+      </w:r>
+      <w:proofErr w:type="gramStart"/>
+      <w:r>
+        <w:t>a RGB</w:t>
+      </w:r>
+      <w:proofErr w:type="gramEnd"/>
+      <w:r>
+        <w:t xml:space="preserve"> LED on GPIO48 (or GPIO38)</w:t>
       </w:r>
     </w:p>
     <w:p>
@@ -7425,11 +8844,19 @@
     </w:p>
     <w:p>
       <w:hyperlink r:id="rId51" w:history="1">
+        <w:proofErr w:type="spellStart"/>
         <w:r>
           <w:rPr>
             <w:rStyle w:val="Hyperlink"/>
           </w:rPr>
-          <w:t>Seeed Studio</w:t>
+          <w:t>Seeed</w:t>
+        </w:r>
+        <w:proofErr w:type="spellEnd"/>
+        <w:r>
+          <w:rPr>
+            <w:rStyle w:val="Hyperlink"/>
+          </w:rPr>
+          <w:t xml:space="preserve"> Studio</w:t>
         </w:r>
         <w:r>
           <w:rPr>
@@ -7532,11 +8959,19 @@
         </w:drawing>
       </w:r>
       <w:hyperlink r:id="rId53" w:history="1">
+        <w:proofErr w:type="spellStart"/>
         <w:r>
           <w:rPr>
             <w:rStyle w:val="Hyperlink"/>
           </w:rPr>
-          <w:t>Seeed Studio ESP32-S3 Plus</w:t>
+          <w:t>Seeed</w:t>
+        </w:r>
+        <w:proofErr w:type="spellEnd"/>
+        <w:r>
+          <w:rPr>
+            <w:rStyle w:val="Hyperlink"/>
+          </w:rPr>
+          <w:t xml:space="preserve"> Studio ESP32-S3 Plus</w:t>
         </w:r>
       </w:hyperlink>
       <w:r>
@@ -7567,11 +9002,19 @@
     </w:p>
     <w:p>
       <w:hyperlink r:id="rId55" w:history="1">
+        <w:proofErr w:type="spellStart"/>
         <w:r>
           <w:rPr>
             <w:rStyle w:val="Hyperlink"/>
           </w:rPr>
-          <w:t>SparkFun ISM330DHCX</w:t>
+          <w:t>SparkFun</w:t>
+        </w:r>
+        <w:proofErr w:type="spellEnd"/>
+        <w:r>
+          <w:rPr>
+            <w:rStyle w:val="Hyperlink"/>
+          </w:rPr>
+          <w:t xml:space="preserve"> ISM330DHCX</w:t>
         </w:r>
       </w:hyperlink>
       <w:r>
@@ -7822,7 +9265,21 @@
           <w:rPr>
             <w:rStyle w:val="Hyperlink"/>
           </w:rPr>
-          <w:t>ESP32-S3-Tiny - Waveshare Wiki</w:t>
+          <w:t xml:space="preserve">ESP32-S3-Tiny - </w:t>
+        </w:r>
+        <w:proofErr w:type="spellStart"/>
+        <w:r>
+          <w:rPr>
+            <w:rStyle w:val="Hyperlink"/>
+          </w:rPr>
+          <w:t>Waveshare</w:t>
+        </w:r>
+        <w:proofErr w:type="spellEnd"/>
+        <w:r>
+          <w:rPr>
+            <w:rStyle w:val="Hyperlink"/>
+          </w:rPr>
+          <w:t xml:space="preserve"> Wiki</w:t>
         </w:r>
       </w:hyperlink>
     </w:p>
@@ -7915,7 +9372,21 @@
           <w:rPr>
             <w:rStyle w:val="Hyperlink"/>
           </w:rPr>
-          <w:t>ESP32-S3-Zero - Waveshare Wiki</w:t>
+          <w:t xml:space="preserve">ESP32-S3-Zero - </w:t>
+        </w:r>
+        <w:proofErr w:type="spellStart"/>
+        <w:r>
+          <w:rPr>
+            <w:rStyle w:val="Hyperlink"/>
+          </w:rPr>
+          <w:t>Waveshare</w:t>
+        </w:r>
+        <w:proofErr w:type="spellEnd"/>
+        <w:r>
+          <w:rPr>
+            <w:rStyle w:val="Hyperlink"/>
+          </w:rPr>
+          <w:t xml:space="preserve"> Wiki</w:t>
         </w:r>
       </w:hyperlink>
     </w:p>
@@ -9999,7 +11470,7 @@
         <w:rFonts w:ascii="Symbol" w:hAnsi="Symbol" w:hint="default"/>
       </w:rPr>
     </w:lvl>
-    <w:lvl w:ilvl="1" w:tplc="04090003" w:tentative="1">
+    <w:lvl w:ilvl="1" w:tplc="04090003">
       <w:start w:val="1"/>
       <w:numFmt w:val="bullet"/>
       <w:lvlText w:val="o"/>

</xml_diff>